<commit_message>
Voeg praktijkcases sectie toe: zelf gebouwde AI-tools
Nieuwe pagina met drie concrete voorbeelden:
- AI rasterplanning polikliniek (MP01)
- AI rasterplanning radiologie (MP01)
- Capaciteitsdashboard SEH met scenario-analyse (MP01)

Inclusief MAG WEL/MAG NIET overzicht voor intern gebouwde tools
en 5-staps plan om een eigen tool te laten kwalificeren voor
de doorbraakmiddelen financiering.

Co-Authored-By: Claude Sonnet 4.6 <noreply@anthropic.com>
Claude-Session: https://claude.ai/code/session_012znAQmFZmmdfa2M9oCwLrZ
</commit_message>
<xml_diff>
--- a/Samenvatting_Modelplannen_Doorbraakmiddelen_2026_uitgebreid.docx
+++ b/Samenvatting_Modelplannen_Doorbraakmiddelen_2026_uitgebreid.docx
@@ -13485,6 +13485,3586 @@
                 <w:sz w:val="20"/>
               </w:rPr>
               <w:t>Houdt zorgakkoorden.nl in de gaten voor updates over dit modelplan.</w:t>
+            </w:r>
+          </w:p>
+          <w:p>
+            <w:pPr>
+              <w:spacing w:after="80"/>
+            </w:pPr>
+          </w:p>
+        </w:tc>
+      </w:tr>
+    </w:tbl>
+    <w:p>
+      <w:pPr>
+        <w:spacing w:after="80"/>
+      </w:pPr>
+    </w:p>
+    <w:p>
+      <w:r>
+        <w:br w:type="page"/>
+      </w:r>
+    </w:p>
+    <w:p>
+      <w:pPr>
+        <w:spacing w:before="80" w:after="120"/>
+      </w:pPr>
+      <w:r>
+        <w:rPr>
+          <w:b/>
+          <w:color w:val="004787"/>
+          <w:sz w:val="30"/>
+        </w:rPr>
+        <w:t>◆  Praktijkcase: Zelf AI-tools Bouwen voor de Zorgorganisatie</w:t>
+      </w:r>
+    </w:p>
+    <w:p>
+      <w:pPr>
+        <w:spacing w:before="0" w:after="160"/>
+        <w:jc w:val="left"/>
+      </w:pPr>
+      <w:r>
+        <w:rPr>
+          <w:b w:val="0"/>
+          <w:i w:val="0"/>
+          <w:color w:val="3A3A3A"/>
+          <w:sz w:val="20"/>
+        </w:rPr>
+        <w:t>Steeds meer ziekenhuizen en zorginstellingen bouwen zelf AI-toepassingen — met tools als Claude, Python of Power BI — om interne processen te verbeteren. Dit roept een praktische vraag op: valt een zelf gebouwde tool ook onder de doorbraakmiddelen modelplannen? En zo ja: hoe zorg je dan dat je wél in aanmerking komt? Hieronder drie concrete voorbeelden uit de ziekenhuispraktijk.</w:t>
+      </w:r>
+    </w:p>
+    <w:p>
+      <w:pPr>
+        <w:spacing w:before="80" w:after="60"/>
+      </w:pPr>
+      <w:r>
+        <w:rPr>
+          <w:b/>
+          <w:color w:val="004787"/>
+          <w:sz w:val="24"/>
+        </w:rPr>
+        <w:t>Case 1 — AI Rasterplanning voor de Polikliniek</w:t>
+      </w:r>
+    </w:p>
+    <w:p>
+      <w:pPr>
+        <w:spacing w:before="0" w:after="120"/>
+      </w:pPr>
+      <w:r>
+        <w:rPr>
+          <w:b w:val="0"/>
+          <w:i w:val="0"/>
+          <w:color w:val="3A3A3A"/>
+          <w:sz w:val="20"/>
+        </w:rPr>
+        <w:t>Een internist bouwt samen met de ICT-afdeling een rasterplanning-tool met AI voor de eigen polikliniek. De tool analyseert historische afspraakendata, beschikbaarheid van specialisten en behandelkamers, en genereert vervolgens automatisch een geoptimaliseerd weekrooster. Planners kunnen dit rooster handmatig aanpassen en de tool leert mee. De poli gaat de tool structureel gebruiken om het wekelijks raster efficiënter en sneller op te stellen.</w:t>
+      </w:r>
+    </w:p>
+    <w:tbl>
+      <w:tblPr>
+        <w:tblW w:type="auto" w:w="0"/>
+        <w:jc w:val="left"/>
+        <w:tblLook w:firstColumn="1" w:firstRow="1" w:lastColumn="0" w:lastRow="0" w:noHBand="0" w:noVBand="1" w:val="04A0"/>
+      </w:tblPr>
+      <w:tblGrid>
+        <w:gridCol w:w="4819"/>
+        <w:gridCol w:w="4819"/>
+      </w:tblGrid>
+      <w:tr>
+        <w:tc>
+          <w:tcPr>
+            <w:tcW w:type="dxa" w:w="4819"/>
+            <w:shd w:val="clear" w:color="auto" w:fill="004787"/>
+            <w:tcBorders>
+              <w:top w:val="nil"/>
+              <w:left w:val="nil"/>
+              <w:bottom w:val="nil"/>
+              <w:right w:val="nil"/>
+              <w:insideH w:val="nil"/>
+              <w:insideV w:val="nil"/>
+            </w:tcBorders>
+          </w:tcPr>
+          <w:p>
+            <w:pPr>
+              <w:spacing w:before="60" w:after="60"/>
+              <w:ind w:left="113"/>
+            </w:pPr>
+            <w:r>
+              <w:rPr>
+                <w:b/>
+                <w:color w:val="FFFFFF"/>
+                <w:sz w:val="18"/>
+              </w:rPr>
+              <w:t>Aspect</w:t>
+            </w:r>
+          </w:p>
+        </w:tc>
+        <w:tc>
+          <w:tcPr>
+            <w:tcW w:type="dxa" w:w="4819"/>
+            <w:shd w:val="clear" w:color="auto" w:fill="004787"/>
+            <w:tcBorders>
+              <w:top w:val="nil"/>
+              <w:left w:val="nil"/>
+              <w:bottom w:val="nil"/>
+              <w:right w:val="nil"/>
+              <w:insideH w:val="nil"/>
+              <w:insideV w:val="nil"/>
+            </w:tcBorders>
+          </w:tcPr>
+          <w:p>
+            <w:pPr>
+              <w:spacing w:before="60" w:after="60"/>
+              <w:ind w:left="113"/>
+            </w:pPr>
+            <w:r>
+              <w:rPr>
+                <w:b/>
+                <w:color w:val="FFFFFF"/>
+                <w:sz w:val="18"/>
+              </w:rPr>
+              <w:t>Uitwerking</w:t>
+            </w:r>
+          </w:p>
+        </w:tc>
+      </w:tr>
+      <w:tr>
+        <w:tc>
+          <w:tcPr>
+            <w:tcW w:type="dxa" w:w="4819"/>
+            <w:shd w:val="clear" w:color="auto" w:fill="F2F2F2"/>
+            <w:tcBorders>
+              <w:top w:val="nil"/>
+              <w:left w:val="nil"/>
+              <w:bottom w:val="nil"/>
+              <w:right w:val="nil"/>
+              <w:insideH w:val="nil"/>
+              <w:insideV w:val="nil"/>
+            </w:tcBorders>
+          </w:tcPr>
+          <w:p>
+            <w:pPr>
+              <w:spacing w:before="60" w:after="60"/>
+              <w:ind w:left="113"/>
+            </w:pPr>
+            <w:r>
+              <w:rPr>
+                <w:b w:val="0"/>
+                <w:color w:val="3A3A3A"/>
+                <w:sz w:val="19"/>
+              </w:rPr>
+              <w:t>Modelplan</w:t>
+            </w:r>
+          </w:p>
+        </w:tc>
+        <w:tc>
+          <w:tcPr>
+            <w:tcW w:type="dxa" w:w="4819"/>
+            <w:shd w:val="clear" w:color="auto" w:fill="F2F2F2"/>
+            <w:tcBorders>
+              <w:top w:val="nil"/>
+              <w:left w:val="nil"/>
+              <w:bottom w:val="nil"/>
+              <w:right w:val="nil"/>
+              <w:insideH w:val="nil"/>
+              <w:insideV w:val="nil"/>
+            </w:tcBorders>
+          </w:tcPr>
+          <w:p>
+            <w:pPr>
+              <w:spacing w:before="60" w:after="60"/>
+              <w:ind w:left="113"/>
+            </w:pPr>
+            <w:r>
+              <w:rPr>
+                <w:b w:val="0"/>
+                <w:color w:val="3A3A3A"/>
+                <w:sz w:val="19"/>
+              </w:rPr>
+              <w:t>MP01 – Capaciteitsplanning met AI (MSZ)</w:t>
+            </w:r>
+          </w:p>
+        </w:tc>
+      </w:tr>
+      <w:tr>
+        <w:tc>
+          <w:tcPr>
+            <w:tcW w:type="dxa" w:w="4819"/>
+            <w:shd w:val="clear" w:color="auto" w:fill="FFFFFF"/>
+            <w:tcBorders>
+              <w:top w:val="nil"/>
+              <w:left w:val="nil"/>
+              <w:bottom w:val="nil"/>
+              <w:right w:val="nil"/>
+              <w:insideH w:val="nil"/>
+              <w:insideV w:val="nil"/>
+            </w:tcBorders>
+          </w:tcPr>
+          <w:p>
+            <w:pPr>
+              <w:spacing w:before="60" w:after="60"/>
+              <w:ind w:left="113"/>
+            </w:pPr>
+            <w:r>
+              <w:rPr>
+                <w:b w:val="0"/>
+                <w:color w:val="3A3A3A"/>
+                <w:sz w:val="19"/>
+              </w:rPr>
+              <w:t>Sector</w:t>
+            </w:r>
+          </w:p>
+        </w:tc>
+        <w:tc>
+          <w:tcPr>
+            <w:tcW w:type="dxa" w:w="4819"/>
+            <w:shd w:val="clear" w:color="auto" w:fill="FFFFFF"/>
+            <w:tcBorders>
+              <w:top w:val="nil"/>
+              <w:left w:val="nil"/>
+              <w:bottom w:val="nil"/>
+              <w:right w:val="nil"/>
+              <w:insideH w:val="nil"/>
+              <w:insideV w:val="nil"/>
+            </w:tcBorders>
+          </w:tcPr>
+          <w:p>
+            <w:pPr>
+              <w:spacing w:before="60" w:after="60"/>
+              <w:ind w:left="113"/>
+            </w:pPr>
+            <w:r>
+              <w:rPr>
+                <w:b w:val="0"/>
+                <w:color w:val="3A3A3A"/>
+                <w:sz w:val="19"/>
+              </w:rPr>
+              <w:t>Medisch Specialistische Zorg (polikliniek valt onder MSZ/Zvw)</w:t>
+            </w:r>
+          </w:p>
+        </w:tc>
+      </w:tr>
+      <w:tr>
+        <w:tc>
+          <w:tcPr>
+            <w:tcW w:type="dxa" w:w="4819"/>
+            <w:shd w:val="clear" w:color="auto" w:fill="F2F2F2"/>
+            <w:tcBorders>
+              <w:top w:val="nil"/>
+              <w:left w:val="nil"/>
+              <w:bottom w:val="nil"/>
+              <w:right w:val="nil"/>
+              <w:insideH w:val="nil"/>
+              <w:insideV w:val="nil"/>
+            </w:tcBorders>
+          </w:tcPr>
+          <w:p>
+            <w:pPr>
+              <w:spacing w:before="60" w:after="60"/>
+              <w:ind w:left="113"/>
+            </w:pPr>
+            <w:r>
+              <w:rPr>
+                <w:b w:val="0"/>
+                <w:color w:val="3A3A3A"/>
+                <w:sz w:val="19"/>
+              </w:rPr>
+              <w:t>Arbeidsbesparing</w:t>
+            </w:r>
+          </w:p>
+        </w:tc>
+        <w:tc>
+          <w:tcPr>
+            <w:tcW w:type="dxa" w:w="4819"/>
+            <w:shd w:val="clear" w:color="auto" w:fill="F2F2F2"/>
+            <w:tcBorders>
+              <w:top w:val="nil"/>
+              <w:left w:val="nil"/>
+              <w:bottom w:val="nil"/>
+              <w:right w:val="nil"/>
+              <w:insideH w:val="nil"/>
+              <w:insideV w:val="nil"/>
+            </w:tcBorders>
+          </w:tcPr>
+          <w:p>
+            <w:pPr>
+              <w:spacing w:before="60" w:after="60"/>
+              <w:ind w:left="113"/>
+            </w:pPr>
+            <w:r>
+              <w:rPr>
+                <w:b w:val="0"/>
+                <w:color w:val="3A3A3A"/>
+                <w:sz w:val="19"/>
+              </w:rPr>
+              <w:t>Planners besteden nu 4-8 uur/week aan roostering → tool reduceert dit naar &lt; 1 uur</w:t>
+            </w:r>
+          </w:p>
+        </w:tc>
+      </w:tr>
+      <w:tr>
+        <w:tc>
+          <w:tcPr>
+            <w:tcW w:type="dxa" w:w="4819"/>
+            <w:shd w:val="clear" w:color="auto" w:fill="FFFFFF"/>
+            <w:tcBorders>
+              <w:top w:val="nil"/>
+              <w:left w:val="nil"/>
+              <w:bottom w:val="nil"/>
+              <w:right w:val="nil"/>
+              <w:insideH w:val="nil"/>
+              <w:insideV w:val="nil"/>
+            </w:tcBorders>
+          </w:tcPr>
+          <w:p>
+            <w:pPr>
+              <w:spacing w:before="60" w:after="60"/>
+              <w:ind w:left="113"/>
+            </w:pPr>
+            <w:r>
+              <w:rPr>
+                <w:b w:val="0"/>
+                <w:color w:val="3A3A3A"/>
+                <w:sz w:val="19"/>
+              </w:rPr>
+              <w:t>Tool type</w:t>
+            </w:r>
+          </w:p>
+        </w:tc>
+        <w:tc>
+          <w:tcPr>
+            <w:tcW w:type="dxa" w:w="4819"/>
+            <w:shd w:val="clear" w:color="auto" w:fill="FFFFFF"/>
+            <w:tcBorders>
+              <w:top w:val="nil"/>
+              <w:left w:val="nil"/>
+              <w:bottom w:val="nil"/>
+              <w:right w:val="nil"/>
+              <w:insideH w:val="nil"/>
+              <w:insideV w:val="nil"/>
+            </w:tcBorders>
+          </w:tcPr>
+          <w:p>
+            <w:pPr>
+              <w:spacing w:before="60" w:after="60"/>
+              <w:ind w:left="113"/>
+            </w:pPr>
+            <w:r>
+              <w:rPr>
+                <w:b w:val="0"/>
+                <w:color w:val="3A3A3A"/>
+                <w:sz w:val="19"/>
+              </w:rPr>
+              <w:t>Intern gebouwd (bijv. met Python/Claude/Power BI + koppeling aan HIS/EPD)</w:t>
+            </w:r>
+          </w:p>
+        </w:tc>
+      </w:tr>
+      <w:tr>
+        <w:tc>
+          <w:tcPr>
+            <w:tcW w:type="dxa" w:w="4819"/>
+            <w:shd w:val="clear" w:color="auto" w:fill="F2F2F2"/>
+            <w:tcBorders>
+              <w:top w:val="nil"/>
+              <w:left w:val="nil"/>
+              <w:bottom w:val="nil"/>
+              <w:right w:val="nil"/>
+              <w:insideH w:val="nil"/>
+              <w:insideV w:val="nil"/>
+            </w:tcBorders>
+          </w:tcPr>
+          <w:p>
+            <w:pPr>
+              <w:spacing w:before="60" w:after="60"/>
+              <w:ind w:left="113"/>
+            </w:pPr>
+            <w:r>
+              <w:rPr>
+                <w:b w:val="0"/>
+                <w:color w:val="3A3A3A"/>
+                <w:sz w:val="19"/>
+              </w:rPr>
+              <w:t>Voordeel</w:t>
+            </w:r>
+          </w:p>
+        </w:tc>
+        <w:tc>
+          <w:tcPr>
+            <w:tcW w:type="dxa" w:w="4819"/>
+            <w:shd w:val="clear" w:color="auto" w:fill="F2F2F2"/>
+            <w:tcBorders>
+              <w:top w:val="nil"/>
+              <w:left w:val="nil"/>
+              <w:bottom w:val="nil"/>
+              <w:right w:val="nil"/>
+              <w:insideH w:val="nil"/>
+              <w:insideV w:val="nil"/>
+            </w:tcBorders>
+          </w:tcPr>
+          <w:p>
+            <w:pPr>
+              <w:spacing w:before="60" w:after="60"/>
+              <w:ind w:left="113"/>
+            </w:pPr>
+            <w:r>
+              <w:rPr>
+                <w:b w:val="0"/>
+                <w:color w:val="3A3A3A"/>
+                <w:sz w:val="19"/>
+              </w:rPr>
+              <w:t>Sneller rooster, minder fouten, betere spreiding patiëntenstromen</w:t>
+            </w:r>
+          </w:p>
+        </w:tc>
+      </w:tr>
+      <w:tr>
+        <w:tc>
+          <w:tcPr>
+            <w:tcW w:type="dxa" w:w="4819"/>
+            <w:shd w:val="clear" w:color="auto" w:fill="FFFFFF"/>
+            <w:tcBorders>
+              <w:top w:val="nil"/>
+              <w:left w:val="nil"/>
+              <w:bottom w:val="nil"/>
+              <w:right w:val="nil"/>
+              <w:insideH w:val="nil"/>
+              <w:insideV w:val="nil"/>
+            </w:tcBorders>
+          </w:tcPr>
+          <w:p>
+            <w:pPr>
+              <w:spacing w:before="60" w:after="60"/>
+              <w:ind w:left="113"/>
+            </w:pPr>
+            <w:r>
+              <w:rPr>
+                <w:b w:val="0"/>
+                <w:color w:val="3A3A3A"/>
+                <w:sz w:val="19"/>
+              </w:rPr>
+              <w:t>Risico voor financiering</w:t>
+            </w:r>
+          </w:p>
+        </w:tc>
+        <w:tc>
+          <w:tcPr>
+            <w:tcW w:type="dxa" w:w="4819"/>
+            <w:shd w:val="clear" w:color="auto" w:fill="FFFFFF"/>
+            <w:tcBorders>
+              <w:top w:val="nil"/>
+              <w:left w:val="nil"/>
+              <w:bottom w:val="nil"/>
+              <w:right w:val="nil"/>
+              <w:insideH w:val="nil"/>
+              <w:insideV w:val="nil"/>
+            </w:tcBorders>
+          </w:tcPr>
+          <w:p>
+            <w:pPr>
+              <w:spacing w:before="60" w:after="60"/>
+              <w:ind w:left="113"/>
+            </w:pPr>
+            <w:r>
+              <w:rPr>
+                <w:b w:val="0"/>
+                <w:color w:val="3A3A3A"/>
+                <w:sz w:val="19"/>
+              </w:rPr>
+              <w:t>Intern gebouwde tool heeft GEEN automatische Digizo.nu-goedkeuring</w:t>
+            </w:r>
+          </w:p>
+        </w:tc>
+      </w:tr>
+    </w:tbl>
+    <w:p>
+      <w:pPr>
+        <w:spacing w:after="80"/>
+      </w:pPr>
+    </w:p>
+    <w:tbl>
+      <w:tblPr>
+        <w:tblW w:type="auto" w:w="0"/>
+        <w:jc w:val="left"/>
+        <w:tblLook w:firstColumn="1" w:firstRow="1" w:lastColumn="0" w:lastRow="0" w:noHBand="0" w:noVBand="1" w:val="04A0"/>
+      </w:tblPr>
+      <w:tblGrid>
+        <w:gridCol w:w="9638"/>
+      </w:tblGrid>
+      <w:tr>
+        <w:tc>
+          <w:tcPr>
+            <w:tcW w:type="dxa" w:w="9638"/>
+            <w:shd w:val="clear" w:color="auto" w:fill="004787"/>
+            <w:tcBorders>
+              <w:top w:val="nil"/>
+              <w:left w:val="nil"/>
+              <w:bottom w:val="nil"/>
+              <w:right w:val="nil"/>
+              <w:insideH w:val="nil"/>
+              <w:insideV w:val="nil"/>
+            </w:tcBorders>
+          </w:tcPr>
+          <w:p>
+            <w:pPr>
+              <w:spacing w:before="100" w:after="100"/>
+              <w:ind w:left="227"/>
+            </w:pPr>
+            <w:r>
+              <w:rPr>
+                <w:b/>
+                <w:color w:val="FFFFFF"/>
+                <w:sz w:val="22"/>
+              </w:rPr>
+              <w:t>💡  Wat moet je doen om deze rasterplanning tool te laten kwalificeren?</w:t>
+            </w:r>
+          </w:p>
+        </w:tc>
+      </w:tr>
+      <w:tr>
+        <w:tc>
+          <w:tcPr>
+            <w:tcW w:type="dxa" w:w="9638"/>
+            <w:shd w:val="clear" w:color="auto" w:fill="ECF5FD"/>
+            <w:tcBorders>
+              <w:top w:val="nil"/>
+              <w:left w:val="nil"/>
+              <w:bottom w:val="nil"/>
+              <w:right w:val="nil"/>
+              <w:insideH w:val="nil"/>
+              <w:insideV w:val="nil"/>
+            </w:tcBorders>
+          </w:tcPr>
+          <w:p/>
+          <w:p>
+            <w:pPr>
+              <w:spacing w:before="20" w:after="40"/>
+              <w:ind w:left="283" w:hanging="227"/>
+            </w:pPr>
+            <w:r>
+              <w:rPr>
+                <w:b/>
+                <w:color w:val="004787"/>
+                <w:sz w:val="20"/>
+              </w:rPr>
+              <w:t xml:space="preserve">▸  </w:t>
+            </w:r>
+            <w:r>
+              <w:rPr>
+                <w:color w:val="3A3A3A"/>
+                <w:sz w:val="20"/>
+              </w:rPr>
+              <w:t>Documenteer de arbeidsbesparing met een nulmeting (uren per week vóór tool) en nameting (uren na tool).</w:t>
+            </w:r>
+          </w:p>
+          <w:p>
+            <w:pPr>
+              <w:spacing w:before="20" w:after="40"/>
+              <w:ind w:left="283" w:hanging="227"/>
+            </w:pPr>
+            <w:r>
+              <w:rPr>
+                <w:b/>
+                <w:color w:val="004787"/>
+                <w:sz w:val="20"/>
+              </w:rPr>
+              <w:t xml:space="preserve">▸  </w:t>
+            </w:r>
+            <w:r>
+              <w:rPr>
+                <w:color w:val="3A3A3A"/>
+                <w:sz w:val="20"/>
+              </w:rPr>
+              <w:t>Laat de tool toetsen op beveiliging en privacy (DPIA + verwerkersovereenkomst als externe data wordt verwerkt).</w:t>
+            </w:r>
+          </w:p>
+          <w:p>
+            <w:pPr>
+              <w:spacing w:before="20" w:after="40"/>
+              <w:ind w:left="283" w:hanging="227"/>
+            </w:pPr>
+            <w:r>
+              <w:rPr>
+                <w:b/>
+                <w:color w:val="004787"/>
+                <w:sz w:val="20"/>
+              </w:rPr>
+              <w:t xml:space="preserve">▸  </w:t>
+            </w:r>
+            <w:r>
+              <w:rPr>
+                <w:color w:val="3A3A3A"/>
+                <w:sz w:val="20"/>
+              </w:rPr>
+              <w:t>Beschrijf de werking en bewezen effectiviteit in een technisch rapport — dit telt als 'bewijs van effectiviteit'.</w:t>
+            </w:r>
+          </w:p>
+          <w:p>
+            <w:pPr>
+              <w:spacing w:before="20" w:after="40"/>
+              <w:ind w:left="283" w:hanging="227"/>
+            </w:pPr>
+            <w:r>
+              <w:rPr>
+                <w:b/>
+                <w:color w:val="004787"/>
+                <w:sz w:val="20"/>
+              </w:rPr>
+              <w:t xml:space="preserve">▸  </w:t>
+            </w:r>
+            <w:r>
+              <w:rPr>
+                <w:color w:val="3A3A3A"/>
+                <w:sz w:val="20"/>
+              </w:rPr>
+              <w:t>Overleg met uw dominante zorgverzekeraar of de tool voldoet aan hun aanvullende eisen voor MP01.</w:t>
+            </w:r>
+          </w:p>
+          <w:p>
+            <w:pPr>
+              <w:spacing w:before="20" w:after="40"/>
+              <w:ind w:left="283" w:hanging="227"/>
+            </w:pPr>
+            <w:r>
+              <w:rPr>
+                <w:b/>
+                <w:color w:val="004787"/>
+                <w:sz w:val="20"/>
+              </w:rPr>
+              <w:t xml:space="preserve">▸  </w:t>
+            </w:r>
+            <w:r>
+              <w:rPr>
+                <w:color w:val="3A3A3A"/>
+                <w:sz w:val="20"/>
+              </w:rPr>
+              <w:t>Als de tool ook door andere ziekenhuizen/poli's gebruikt gaat worden: overweeg Digizo.nu-toetsing aan te vragen.</w:t>
+            </w:r>
+          </w:p>
+          <w:p>
+            <w:pPr>
+              <w:spacing w:before="20" w:after="40"/>
+              <w:ind w:left="283" w:hanging="227"/>
+            </w:pPr>
+            <w:r>
+              <w:rPr>
+                <w:b/>
+                <w:color w:val="004787"/>
+                <w:sz w:val="20"/>
+              </w:rPr>
+              <w:t xml:space="preserve">▸  </w:t>
+            </w:r>
+            <w:r>
+              <w:rPr>
+                <w:color w:val="3A3A3A"/>
+                <w:sz w:val="20"/>
+              </w:rPr>
+              <w:t>Kosten die in aanmerking komen: ontwikkelkosten (intern of extern), licentiekosten voor AI-API, implementatiekosten.</w:t>
+            </w:r>
+          </w:p>
+          <w:p>
+            <w:pPr>
+              <w:spacing w:after="80"/>
+            </w:pPr>
+          </w:p>
+        </w:tc>
+      </w:tr>
+    </w:tbl>
+    <w:p>
+      <w:pPr>
+        <w:spacing w:after="80"/>
+      </w:pPr>
+    </w:p>
+    <w:p>
+      <w:pPr>
+        <w:spacing w:before="120" w:after="60"/>
+      </w:pPr>
+      <w:r>
+        <w:rPr>
+          <w:b/>
+          <w:color w:val="177FBA"/>
+          <w:sz w:val="24"/>
+        </w:rPr>
+        <w:t>Case 2 — AI Rasterplanning voor de Afdeling Radiologie</w:t>
+      </w:r>
+    </w:p>
+    <w:p>
+      <w:pPr>
+        <w:spacing w:before="0" w:after="120"/>
+      </w:pPr>
+      <w:r>
+        <w:rPr>
+          <w:b w:val="0"/>
+          <w:i w:val="0"/>
+          <w:color w:val="3A3A3A"/>
+          <w:sz w:val="20"/>
+        </w:rPr>
+        <w:t>De afdeling radiologie heeft een eigen AI-rasterplanning-tool ontwikkeld die specifiek rekening houdt met de typische kenmerken van radiologische planning: doorlooptijden per onderzoekstype (MRI, CT, echo, röntgen), bezetting van apparatuur en personeel, spoedonderzoeken versus electieve onderzoeken, en de beschikbaarheid van radiologen en radiodiagnostisch laboranten. De tool combineert deze parameters en genereert dagelijks een geoptimaliseerd rooster per modaliteit.</w:t>
+      </w:r>
+    </w:p>
+    <w:tbl>
+      <w:tblPr>
+        <w:tblW w:type="auto" w:w="0"/>
+        <w:jc w:val="left"/>
+        <w:tblLook w:firstColumn="1" w:firstRow="1" w:lastColumn="0" w:lastRow="0" w:noHBand="0" w:noVBand="1" w:val="04A0"/>
+      </w:tblPr>
+      <w:tblGrid>
+        <w:gridCol w:w="4819"/>
+        <w:gridCol w:w="4819"/>
+      </w:tblGrid>
+      <w:tr>
+        <w:tc>
+          <w:tcPr>
+            <w:tcW w:type="dxa" w:w="4819"/>
+            <w:shd w:val="clear" w:color="auto" w:fill="177FBA"/>
+            <w:tcBorders>
+              <w:top w:val="nil"/>
+              <w:left w:val="nil"/>
+              <w:bottom w:val="nil"/>
+              <w:right w:val="nil"/>
+              <w:insideH w:val="nil"/>
+              <w:insideV w:val="nil"/>
+            </w:tcBorders>
+          </w:tcPr>
+          <w:p>
+            <w:pPr>
+              <w:spacing w:before="60" w:after="60"/>
+              <w:ind w:left="113"/>
+            </w:pPr>
+            <w:r>
+              <w:rPr>
+                <w:b/>
+                <w:color w:val="FFFFFF"/>
+                <w:sz w:val="18"/>
+              </w:rPr>
+              <w:t>Aspect</w:t>
+            </w:r>
+          </w:p>
+        </w:tc>
+        <w:tc>
+          <w:tcPr>
+            <w:tcW w:type="dxa" w:w="4819"/>
+            <w:shd w:val="clear" w:color="auto" w:fill="177FBA"/>
+            <w:tcBorders>
+              <w:top w:val="nil"/>
+              <w:left w:val="nil"/>
+              <w:bottom w:val="nil"/>
+              <w:right w:val="nil"/>
+              <w:insideH w:val="nil"/>
+              <w:insideV w:val="nil"/>
+            </w:tcBorders>
+          </w:tcPr>
+          <w:p>
+            <w:pPr>
+              <w:spacing w:before="60" w:after="60"/>
+              <w:ind w:left="113"/>
+            </w:pPr>
+            <w:r>
+              <w:rPr>
+                <w:b/>
+                <w:color w:val="FFFFFF"/>
+                <w:sz w:val="18"/>
+              </w:rPr>
+              <w:t>Uitwerking</w:t>
+            </w:r>
+          </w:p>
+        </w:tc>
+      </w:tr>
+      <w:tr>
+        <w:tc>
+          <w:tcPr>
+            <w:tcW w:type="dxa" w:w="4819"/>
+            <w:shd w:val="clear" w:color="auto" w:fill="F2F2F2"/>
+            <w:tcBorders>
+              <w:top w:val="nil"/>
+              <w:left w:val="nil"/>
+              <w:bottom w:val="nil"/>
+              <w:right w:val="nil"/>
+              <w:insideH w:val="nil"/>
+              <w:insideV w:val="nil"/>
+            </w:tcBorders>
+          </w:tcPr>
+          <w:p>
+            <w:pPr>
+              <w:spacing w:before="60" w:after="60"/>
+              <w:ind w:left="113"/>
+            </w:pPr>
+            <w:r>
+              <w:rPr>
+                <w:b w:val="0"/>
+                <w:color w:val="3A3A3A"/>
+                <w:sz w:val="19"/>
+              </w:rPr>
+              <w:t>Modelplan</w:t>
+            </w:r>
+          </w:p>
+        </w:tc>
+        <w:tc>
+          <w:tcPr>
+            <w:tcW w:type="dxa" w:w="4819"/>
+            <w:shd w:val="clear" w:color="auto" w:fill="F2F2F2"/>
+            <w:tcBorders>
+              <w:top w:val="nil"/>
+              <w:left w:val="nil"/>
+              <w:bottom w:val="nil"/>
+              <w:right w:val="nil"/>
+              <w:insideH w:val="nil"/>
+              <w:insideV w:val="nil"/>
+            </w:tcBorders>
+          </w:tcPr>
+          <w:p>
+            <w:pPr>
+              <w:spacing w:before="60" w:after="60"/>
+              <w:ind w:left="113"/>
+            </w:pPr>
+            <w:r>
+              <w:rPr>
+                <w:b w:val="0"/>
+                <w:color w:val="3A3A3A"/>
+                <w:sz w:val="19"/>
+              </w:rPr>
+              <w:t>MP01 – Capaciteitsplanning met AI (MSZ – radiologie valt onder MSZ/Zvw)</w:t>
+            </w:r>
+          </w:p>
+        </w:tc>
+      </w:tr>
+      <w:tr>
+        <w:tc>
+          <w:tcPr>
+            <w:tcW w:type="dxa" w:w="4819"/>
+            <w:shd w:val="clear" w:color="auto" w:fill="FFFFFF"/>
+            <w:tcBorders>
+              <w:top w:val="nil"/>
+              <w:left w:val="nil"/>
+              <w:bottom w:val="nil"/>
+              <w:right w:val="nil"/>
+              <w:insideH w:val="nil"/>
+              <w:insideV w:val="nil"/>
+            </w:tcBorders>
+          </w:tcPr>
+          <w:p>
+            <w:pPr>
+              <w:spacing w:before="60" w:after="60"/>
+              <w:ind w:left="113"/>
+            </w:pPr>
+            <w:r>
+              <w:rPr>
+                <w:b w:val="0"/>
+                <w:color w:val="3A3A3A"/>
+                <w:sz w:val="19"/>
+              </w:rPr>
+              <w:t>Sector</w:t>
+            </w:r>
+          </w:p>
+        </w:tc>
+        <w:tc>
+          <w:tcPr>
+            <w:tcW w:type="dxa" w:w="4819"/>
+            <w:shd w:val="clear" w:color="auto" w:fill="FFFFFF"/>
+            <w:tcBorders>
+              <w:top w:val="nil"/>
+              <w:left w:val="nil"/>
+              <w:bottom w:val="nil"/>
+              <w:right w:val="nil"/>
+              <w:insideH w:val="nil"/>
+              <w:insideV w:val="nil"/>
+            </w:tcBorders>
+          </w:tcPr>
+          <w:p>
+            <w:pPr>
+              <w:spacing w:before="60" w:after="60"/>
+              <w:ind w:left="113"/>
+            </w:pPr>
+            <w:r>
+              <w:rPr>
+                <w:b w:val="0"/>
+                <w:color w:val="3A3A3A"/>
+                <w:sz w:val="19"/>
+              </w:rPr>
+              <w:t>Radiologie is onderdeel van medisch specialistische zorg (ziekenhuisZvw)</w:t>
+            </w:r>
+          </w:p>
+        </w:tc>
+      </w:tr>
+      <w:tr>
+        <w:tc>
+          <w:tcPr>
+            <w:tcW w:type="dxa" w:w="4819"/>
+            <w:shd w:val="clear" w:color="auto" w:fill="F2F2F2"/>
+            <w:tcBorders>
+              <w:top w:val="nil"/>
+              <w:left w:val="nil"/>
+              <w:bottom w:val="nil"/>
+              <w:right w:val="nil"/>
+              <w:insideH w:val="nil"/>
+              <w:insideV w:val="nil"/>
+            </w:tcBorders>
+          </w:tcPr>
+          <w:p>
+            <w:pPr>
+              <w:spacing w:before="60" w:after="60"/>
+              <w:ind w:left="113"/>
+            </w:pPr>
+            <w:r>
+              <w:rPr>
+                <w:b w:val="0"/>
+                <w:color w:val="3A3A3A"/>
+                <w:sz w:val="19"/>
+              </w:rPr>
+              <w:t>Arbeidsbesparing</w:t>
+            </w:r>
+          </w:p>
+        </w:tc>
+        <w:tc>
+          <w:tcPr>
+            <w:tcW w:type="dxa" w:w="4819"/>
+            <w:shd w:val="clear" w:color="auto" w:fill="F2F2F2"/>
+            <w:tcBorders>
+              <w:top w:val="nil"/>
+              <w:left w:val="nil"/>
+              <w:bottom w:val="nil"/>
+              <w:right w:val="nil"/>
+              <w:insideH w:val="nil"/>
+              <w:insideV w:val="nil"/>
+            </w:tcBorders>
+          </w:tcPr>
+          <w:p>
+            <w:pPr>
+              <w:spacing w:before="60" w:after="60"/>
+              <w:ind w:left="113"/>
+            </w:pPr>
+            <w:r>
+              <w:rPr>
+                <w:b w:val="0"/>
+                <w:color w:val="3A3A3A"/>
+                <w:sz w:val="19"/>
+              </w:rPr>
+              <w:t>Roostercoördinator bespaart 6-10 uur/week; minder ad-hoc aanpassingen</w:t>
+            </w:r>
+          </w:p>
+        </w:tc>
+      </w:tr>
+      <w:tr>
+        <w:tc>
+          <w:tcPr>
+            <w:tcW w:type="dxa" w:w="4819"/>
+            <w:shd w:val="clear" w:color="auto" w:fill="FFFFFF"/>
+            <w:tcBorders>
+              <w:top w:val="nil"/>
+              <w:left w:val="nil"/>
+              <w:bottom w:val="nil"/>
+              <w:right w:val="nil"/>
+              <w:insideH w:val="nil"/>
+              <w:insideV w:val="nil"/>
+            </w:tcBorders>
+          </w:tcPr>
+          <w:p>
+            <w:pPr>
+              <w:spacing w:before="60" w:after="60"/>
+              <w:ind w:left="113"/>
+            </w:pPr>
+            <w:r>
+              <w:rPr>
+                <w:b w:val="0"/>
+                <w:color w:val="3A3A3A"/>
+                <w:sz w:val="19"/>
+              </w:rPr>
+              <w:t>Bijkomend voordeel</w:t>
+            </w:r>
+          </w:p>
+        </w:tc>
+        <w:tc>
+          <w:tcPr>
+            <w:tcW w:type="dxa" w:w="4819"/>
+            <w:shd w:val="clear" w:color="auto" w:fill="FFFFFF"/>
+            <w:tcBorders>
+              <w:top w:val="nil"/>
+              <w:left w:val="nil"/>
+              <w:bottom w:val="nil"/>
+              <w:right w:val="nil"/>
+              <w:insideH w:val="nil"/>
+              <w:insideV w:val="nil"/>
+            </w:tcBorders>
+          </w:tcPr>
+          <w:p>
+            <w:pPr>
+              <w:spacing w:before="60" w:after="60"/>
+              <w:ind w:left="113"/>
+            </w:pPr>
+            <w:r>
+              <w:rPr>
+                <w:b w:val="0"/>
+                <w:color w:val="3A3A3A"/>
+                <w:sz w:val="19"/>
+              </w:rPr>
+              <w:t>Apparatuurbenutting stijgt (minder leegstand MRI, CT); wachttijden dalen</w:t>
+            </w:r>
+          </w:p>
+        </w:tc>
+      </w:tr>
+      <w:tr>
+        <w:tc>
+          <w:tcPr>
+            <w:tcW w:type="dxa" w:w="4819"/>
+            <w:shd w:val="clear" w:color="auto" w:fill="F2F2F2"/>
+            <w:tcBorders>
+              <w:top w:val="nil"/>
+              <w:left w:val="nil"/>
+              <w:bottom w:val="nil"/>
+              <w:right w:val="nil"/>
+              <w:insideH w:val="nil"/>
+              <w:insideV w:val="nil"/>
+            </w:tcBorders>
+          </w:tcPr>
+          <w:p>
+            <w:pPr>
+              <w:spacing w:before="60" w:after="60"/>
+              <w:ind w:left="113"/>
+            </w:pPr>
+            <w:r>
+              <w:rPr>
+                <w:b w:val="0"/>
+                <w:color w:val="3A3A3A"/>
+                <w:sz w:val="19"/>
+              </w:rPr>
+              <w:t>Integratie</w:t>
+            </w:r>
+          </w:p>
+        </w:tc>
+        <w:tc>
+          <w:tcPr>
+            <w:tcW w:type="dxa" w:w="4819"/>
+            <w:shd w:val="clear" w:color="auto" w:fill="F2F2F2"/>
+            <w:tcBorders>
+              <w:top w:val="nil"/>
+              <w:left w:val="nil"/>
+              <w:bottom w:val="nil"/>
+              <w:right w:val="nil"/>
+              <w:insideH w:val="nil"/>
+              <w:insideV w:val="nil"/>
+            </w:tcBorders>
+          </w:tcPr>
+          <w:p>
+            <w:pPr>
+              <w:spacing w:before="60" w:after="60"/>
+              <w:ind w:left="113"/>
+            </w:pPr>
+            <w:r>
+              <w:rPr>
+                <w:b w:val="0"/>
+                <w:color w:val="3A3A3A"/>
+                <w:sz w:val="19"/>
+              </w:rPr>
+              <w:t>Koppeling met RIS (Radiology Information System) en HIS voor afsprakenstroom</w:t>
+            </w:r>
+          </w:p>
+        </w:tc>
+      </w:tr>
+      <w:tr>
+        <w:tc>
+          <w:tcPr>
+            <w:tcW w:type="dxa" w:w="4819"/>
+            <w:shd w:val="clear" w:color="auto" w:fill="FFFFFF"/>
+            <w:tcBorders>
+              <w:top w:val="nil"/>
+              <w:left w:val="nil"/>
+              <w:bottom w:val="nil"/>
+              <w:right w:val="nil"/>
+              <w:insideH w:val="nil"/>
+              <w:insideV w:val="nil"/>
+            </w:tcBorders>
+          </w:tcPr>
+          <w:p>
+            <w:pPr>
+              <w:spacing w:before="60" w:after="60"/>
+              <w:ind w:left="113"/>
+            </w:pPr>
+            <w:r>
+              <w:rPr>
+                <w:b w:val="0"/>
+                <w:color w:val="3A3A3A"/>
+                <w:sz w:val="19"/>
+              </w:rPr>
+              <w:t>Aandachtspunt</w:t>
+            </w:r>
+          </w:p>
+        </w:tc>
+        <w:tc>
+          <w:tcPr>
+            <w:tcW w:type="dxa" w:w="4819"/>
+            <w:shd w:val="clear" w:color="auto" w:fill="FFFFFF"/>
+            <w:tcBorders>
+              <w:top w:val="nil"/>
+              <w:left w:val="nil"/>
+              <w:bottom w:val="nil"/>
+              <w:right w:val="nil"/>
+              <w:insideH w:val="nil"/>
+              <w:insideV w:val="nil"/>
+            </w:tcBorders>
+          </w:tcPr>
+          <w:p>
+            <w:pPr>
+              <w:spacing w:before="60" w:after="60"/>
+              <w:ind w:left="113"/>
+            </w:pPr>
+            <w:r>
+              <w:rPr>
+                <w:b w:val="0"/>
+                <w:color w:val="3A3A3A"/>
+                <w:sz w:val="19"/>
+              </w:rPr>
+              <w:t>Radiologie-specifieke planning wijkt af van generieke planningssoftware — dit is een voordeel (bewijs van maatwerk)</w:t>
+            </w:r>
+          </w:p>
+        </w:tc>
+      </w:tr>
+    </w:tbl>
+    <w:p>
+      <w:pPr>
+        <w:spacing w:after="80"/>
+      </w:pPr>
+    </w:p>
+    <w:tbl>
+      <w:tblPr>
+        <w:tblW w:type="auto" w:w="0"/>
+        <w:jc w:val="left"/>
+        <w:tblLook w:firstColumn="1" w:firstRow="1" w:lastColumn="0" w:lastRow="0" w:noHBand="0" w:noVBand="1" w:val="04A0"/>
+      </w:tblPr>
+      <w:tblGrid>
+        <w:gridCol w:w="9638"/>
+      </w:tblGrid>
+      <w:tr>
+        <w:tc>
+          <w:tcPr>
+            <w:tcW w:type="dxa" w:w="9638"/>
+            <w:shd w:val="clear" w:color="auto" w:fill="177FBA"/>
+            <w:tcBorders>
+              <w:top w:val="nil"/>
+              <w:left w:val="nil"/>
+              <w:bottom w:val="nil"/>
+              <w:right w:val="nil"/>
+              <w:insideH w:val="nil"/>
+              <w:insideV w:val="nil"/>
+            </w:tcBorders>
+          </w:tcPr>
+          <w:p>
+            <w:pPr>
+              <w:spacing w:before="100" w:after="100"/>
+              <w:ind w:left="227"/>
+            </w:pPr>
+            <w:r>
+              <w:rPr>
+                <w:b/>
+                <w:color w:val="FFFFFF"/>
+                <w:sz w:val="22"/>
+              </w:rPr>
+              <w:t>ℹ  Hoe verschilt de radiologie-case van de poli-case?</w:t>
+            </w:r>
+          </w:p>
+        </w:tc>
+      </w:tr>
+      <w:tr>
+        <w:tc>
+          <w:tcPr>
+            <w:tcW w:type="dxa" w:w="9638"/>
+            <w:shd w:val="clear" w:color="auto" w:fill="CFE9F8"/>
+            <w:tcBorders>
+              <w:top w:val="nil"/>
+              <w:left w:val="nil"/>
+              <w:bottom w:val="nil"/>
+              <w:right w:val="nil"/>
+              <w:insideH w:val="nil"/>
+              <w:insideV w:val="nil"/>
+            </w:tcBorders>
+          </w:tcPr>
+          <w:p/>
+          <w:p>
+            <w:pPr>
+              <w:spacing w:before="20" w:after="40"/>
+              <w:ind w:left="283" w:hanging="227"/>
+            </w:pPr>
+            <w:r>
+              <w:rPr>
+                <w:b/>
+                <w:color w:val="177FBA"/>
+                <w:sz w:val="20"/>
+              </w:rPr>
+              <w:t xml:space="preserve">▸  </w:t>
+            </w:r>
+            <w:r>
+              <w:rPr>
+                <w:color w:val="3A3A3A"/>
+                <w:sz w:val="20"/>
+              </w:rPr>
+              <w:t>Radiologie heeft eigen systemen (RIS): zorg voor een werkende koppeling met de tool — dit vergroot de kans op goedkeuring.</w:t>
+            </w:r>
+          </w:p>
+          <w:p>
+            <w:pPr>
+              <w:spacing w:before="20" w:after="40"/>
+              <w:ind w:left="283" w:hanging="227"/>
+            </w:pPr>
+            <w:r>
+              <w:rPr>
+                <w:b/>
+                <w:color w:val="177FBA"/>
+                <w:sz w:val="20"/>
+              </w:rPr>
+              <w:t xml:space="preserve">▸  </w:t>
+            </w:r>
+            <w:r>
+              <w:rPr>
+                <w:color w:val="3A3A3A"/>
+                <w:sz w:val="20"/>
+              </w:rPr>
+              <w:t>De mix van urgente en electieve onderzoeken maakt de planning complexer: dit versterkt het argument voor AI-ondersteuning.</w:t>
+            </w:r>
+          </w:p>
+          <w:p>
+            <w:pPr>
+              <w:spacing w:before="20" w:after="40"/>
+              <w:ind w:left="283" w:hanging="227"/>
+            </w:pPr>
+            <w:r>
+              <w:rPr>
+                <w:b/>
+                <w:color w:val="177FBA"/>
+                <w:sz w:val="20"/>
+              </w:rPr>
+              <w:t xml:space="preserve">▸  </w:t>
+            </w:r>
+            <w:r>
+              <w:rPr>
+                <w:color w:val="3A3A3A"/>
+                <w:sz w:val="20"/>
+              </w:rPr>
+              <w:t>Betrek radiodiagnostisch laboranten (RTL) in de implementatie — zij zijn de primaire gebruikers, niet alleen planners.</w:t>
+            </w:r>
+          </w:p>
+          <w:p>
+            <w:pPr>
+              <w:spacing w:before="20" w:after="40"/>
+              <w:ind w:left="283" w:hanging="227"/>
+            </w:pPr>
+            <w:r>
+              <w:rPr>
+                <w:b/>
+                <w:color w:val="177FBA"/>
+                <w:sz w:val="20"/>
+              </w:rPr>
+              <w:t xml:space="preserve">▸  </w:t>
+            </w:r>
+            <w:r>
+              <w:rPr>
+                <w:color w:val="3A3A3A"/>
+                <w:sz w:val="20"/>
+              </w:rPr>
+              <w:t>Meten van apparaatbenutting (bijv. MRI-bezettingsgraad) is een goede aanvullende KPI naast uren arbeidsbesparing.</w:t>
+            </w:r>
+          </w:p>
+          <w:p>
+            <w:pPr>
+              <w:spacing w:before="20" w:after="40"/>
+              <w:ind w:left="283" w:hanging="227"/>
+            </w:pPr>
+            <w:r>
+              <w:rPr>
+                <w:b/>
+                <w:color w:val="177FBA"/>
+                <w:sz w:val="20"/>
+              </w:rPr>
+              <w:t xml:space="preserve">▸  </w:t>
+            </w:r>
+            <w:r>
+              <w:rPr>
+                <w:color w:val="3A3A3A"/>
+                <w:sz w:val="20"/>
+              </w:rPr>
+              <w:t>Als de tool ook voor andere afdelingen gebruikt gaat worden (bijv. OK-planning), kan dit als aparte mijlpaal worden opgevoerd.</w:t>
+            </w:r>
+          </w:p>
+          <w:p>
+            <w:pPr>
+              <w:spacing w:after="80"/>
+            </w:pPr>
+          </w:p>
+        </w:tc>
+      </w:tr>
+    </w:tbl>
+    <w:p>
+      <w:pPr>
+        <w:spacing w:after="80"/>
+      </w:pPr>
+    </w:p>
+    <w:p>
+      <w:pPr>
+        <w:spacing w:before="120" w:after="60"/>
+      </w:pPr>
+      <w:r>
+        <w:rPr>
+          <w:b/>
+          <w:color w:val="1E7E34"/>
+          <w:sz w:val="24"/>
+        </w:rPr>
+        <w:t>Case 3 — AI Capaciteitsdashboard SEH met Scenario-Analyse</w:t>
+      </w:r>
+    </w:p>
+    <w:p>
+      <w:pPr>
+        <w:spacing w:before="0" w:after="120"/>
+      </w:pPr>
+      <w:r>
+        <w:rPr>
+          <w:b w:val="0"/>
+          <w:i w:val="0"/>
+          <w:color w:val="3A3A3A"/>
+          <w:sz w:val="20"/>
+        </w:rPr>
+        <w:t>Voor de Spoedeisende Hulp (SEH) is een AI-dashboard ontwikkeld dat real-time inzicht geeft in de bezetting, doorlooptijden en wachtrijen. Het unieke van dit dashboard is de scenario-analyse functie: de gebruiker kan simuleren wat er met de SEH-capaciteit gebeurt als bepaalde zorgstromen worden afgebogen naar de huisartsenpost (HAP), een spoedpoli of een andere setting. Zo kan het management gefundeerde beslissingen nemen over doorverwijsprotocollen, triage en capaciteitsverdeling.</w:t>
+      </w:r>
+    </w:p>
+    <w:tbl>
+      <w:tblPr>
+        <w:tblW w:type="auto" w:w="0"/>
+        <w:jc w:val="left"/>
+        <w:tblLook w:firstColumn="1" w:firstRow="1" w:lastColumn="0" w:lastRow="0" w:noHBand="0" w:noVBand="1" w:val="04A0"/>
+      </w:tblPr>
+      <w:tblGrid>
+        <w:gridCol w:w="4819"/>
+        <w:gridCol w:w="4819"/>
+      </w:tblGrid>
+      <w:tr>
+        <w:tc>
+          <w:tcPr>
+            <w:tcW w:type="dxa" w:w="4819"/>
+            <w:shd w:val="clear" w:color="auto" w:fill="1E7E34"/>
+            <w:tcBorders>
+              <w:top w:val="nil"/>
+              <w:left w:val="nil"/>
+              <w:bottom w:val="nil"/>
+              <w:right w:val="nil"/>
+              <w:insideH w:val="nil"/>
+              <w:insideV w:val="nil"/>
+            </w:tcBorders>
+          </w:tcPr>
+          <w:p>
+            <w:pPr>
+              <w:spacing w:before="60" w:after="60"/>
+              <w:ind w:left="113"/>
+            </w:pPr>
+            <w:r>
+              <w:rPr>
+                <w:b/>
+                <w:color w:val="FFFFFF"/>
+                <w:sz w:val="18"/>
+              </w:rPr>
+              <w:t>Functionaliteit</w:t>
+            </w:r>
+          </w:p>
+        </w:tc>
+        <w:tc>
+          <w:tcPr>
+            <w:tcW w:type="dxa" w:w="4819"/>
+            <w:shd w:val="clear" w:color="auto" w:fill="1E7E34"/>
+            <w:tcBorders>
+              <w:top w:val="nil"/>
+              <w:left w:val="nil"/>
+              <w:bottom w:val="nil"/>
+              <w:right w:val="nil"/>
+              <w:insideH w:val="nil"/>
+              <w:insideV w:val="nil"/>
+            </w:tcBorders>
+          </w:tcPr>
+          <w:p>
+            <w:pPr>
+              <w:spacing w:before="60" w:after="60"/>
+              <w:ind w:left="113"/>
+            </w:pPr>
+            <w:r>
+              <w:rPr>
+                <w:b/>
+                <w:color w:val="FFFFFF"/>
+                <w:sz w:val="18"/>
+              </w:rPr>
+              <w:t>Omschrijving</w:t>
+            </w:r>
+          </w:p>
+        </w:tc>
+      </w:tr>
+      <w:tr>
+        <w:tc>
+          <w:tcPr>
+            <w:tcW w:type="dxa" w:w="4819"/>
+            <w:shd w:val="clear" w:color="auto" w:fill="F2F2F2"/>
+            <w:tcBorders>
+              <w:top w:val="nil"/>
+              <w:left w:val="nil"/>
+              <w:bottom w:val="nil"/>
+              <w:right w:val="nil"/>
+              <w:insideH w:val="nil"/>
+              <w:insideV w:val="nil"/>
+            </w:tcBorders>
+          </w:tcPr>
+          <w:p>
+            <w:pPr>
+              <w:spacing w:before="60" w:after="60"/>
+              <w:ind w:left="113"/>
+            </w:pPr>
+            <w:r>
+              <w:rPr>
+                <w:b w:val="0"/>
+                <w:color w:val="3A3A3A"/>
+                <w:sz w:val="19"/>
+              </w:rPr>
+              <w:t>Real-time bezettingsdashboard</w:t>
+            </w:r>
+          </w:p>
+        </w:tc>
+        <w:tc>
+          <w:tcPr>
+            <w:tcW w:type="dxa" w:w="4819"/>
+            <w:shd w:val="clear" w:color="auto" w:fill="F2F2F2"/>
+            <w:tcBorders>
+              <w:top w:val="nil"/>
+              <w:left w:val="nil"/>
+              <w:bottom w:val="nil"/>
+              <w:right w:val="nil"/>
+              <w:insideH w:val="nil"/>
+              <w:insideV w:val="nil"/>
+            </w:tcBorders>
+          </w:tcPr>
+          <w:p>
+            <w:pPr>
+              <w:spacing w:before="60" w:after="60"/>
+              <w:ind w:left="113"/>
+            </w:pPr>
+            <w:r>
+              <w:rPr>
+                <w:b w:val="0"/>
+                <w:color w:val="3A3A3A"/>
+                <w:sz w:val="19"/>
+              </w:rPr>
+              <w:t>Actuele bezetting SEH-bedden, wachtende patiënten, doorlooptijd triage t/m ontslag</w:t>
+            </w:r>
+          </w:p>
+        </w:tc>
+      </w:tr>
+      <w:tr>
+        <w:tc>
+          <w:tcPr>
+            <w:tcW w:type="dxa" w:w="4819"/>
+            <w:shd w:val="clear" w:color="auto" w:fill="FFFFFF"/>
+            <w:tcBorders>
+              <w:top w:val="nil"/>
+              <w:left w:val="nil"/>
+              <w:bottom w:val="nil"/>
+              <w:right w:val="nil"/>
+              <w:insideH w:val="nil"/>
+              <w:insideV w:val="nil"/>
+            </w:tcBorders>
+          </w:tcPr>
+          <w:p>
+            <w:pPr>
+              <w:spacing w:before="60" w:after="60"/>
+              <w:ind w:left="113"/>
+            </w:pPr>
+            <w:r>
+              <w:rPr>
+                <w:b w:val="0"/>
+                <w:color w:val="3A3A3A"/>
+                <w:sz w:val="19"/>
+              </w:rPr>
+              <w:t>Historische trend-analyse</w:t>
+            </w:r>
+          </w:p>
+        </w:tc>
+        <w:tc>
+          <w:tcPr>
+            <w:tcW w:type="dxa" w:w="4819"/>
+            <w:shd w:val="clear" w:color="auto" w:fill="FFFFFF"/>
+            <w:tcBorders>
+              <w:top w:val="nil"/>
+              <w:left w:val="nil"/>
+              <w:bottom w:val="nil"/>
+              <w:right w:val="nil"/>
+              <w:insideH w:val="nil"/>
+              <w:insideV w:val="nil"/>
+            </w:tcBorders>
+          </w:tcPr>
+          <w:p>
+            <w:pPr>
+              <w:spacing w:before="60" w:after="60"/>
+              <w:ind w:left="113"/>
+            </w:pPr>
+            <w:r>
+              <w:rPr>
+                <w:b w:val="0"/>
+                <w:color w:val="3A3A3A"/>
+                <w:sz w:val="19"/>
+              </w:rPr>
+              <w:t>Piektijden per dag/week/maand, seizoenspatronen, type aanmeldingen</w:t>
+            </w:r>
+          </w:p>
+        </w:tc>
+      </w:tr>
+      <w:tr>
+        <w:tc>
+          <w:tcPr>
+            <w:tcW w:type="dxa" w:w="4819"/>
+            <w:shd w:val="clear" w:color="auto" w:fill="F2F2F2"/>
+            <w:tcBorders>
+              <w:top w:val="nil"/>
+              <w:left w:val="nil"/>
+              <w:bottom w:val="nil"/>
+              <w:right w:val="nil"/>
+              <w:insideH w:val="nil"/>
+              <w:insideV w:val="nil"/>
+            </w:tcBorders>
+          </w:tcPr>
+          <w:p>
+            <w:pPr>
+              <w:spacing w:before="60" w:after="60"/>
+              <w:ind w:left="113"/>
+            </w:pPr>
+            <w:r>
+              <w:rPr>
+                <w:b w:val="0"/>
+                <w:color w:val="3A3A3A"/>
+                <w:sz w:val="19"/>
+              </w:rPr>
+              <w:t>Scenario-analyse: zorgafbuiging</w:t>
+            </w:r>
+          </w:p>
+        </w:tc>
+        <w:tc>
+          <w:tcPr>
+            <w:tcW w:type="dxa" w:w="4819"/>
+            <w:shd w:val="clear" w:color="auto" w:fill="F2F2F2"/>
+            <w:tcBorders>
+              <w:top w:val="nil"/>
+              <w:left w:val="nil"/>
+              <w:bottom w:val="nil"/>
+              <w:right w:val="nil"/>
+              <w:insideH w:val="nil"/>
+              <w:insideV w:val="nil"/>
+            </w:tcBorders>
+          </w:tcPr>
+          <w:p>
+            <w:pPr>
+              <w:spacing w:before="60" w:after="60"/>
+              <w:ind w:left="113"/>
+            </w:pPr>
+            <w:r>
+              <w:rPr>
+                <w:b w:val="0"/>
+                <w:color w:val="3A3A3A"/>
+                <w:sz w:val="19"/>
+              </w:rPr>
+              <w:t>Simuleer: 'Als we X% HAP-waardig aanbod afbuigen → hoeveel capaciteit vrij?'</w:t>
+            </w:r>
+          </w:p>
+        </w:tc>
+      </w:tr>
+      <w:tr>
+        <w:tc>
+          <w:tcPr>
+            <w:tcW w:type="dxa" w:w="4819"/>
+            <w:shd w:val="clear" w:color="auto" w:fill="FFFFFF"/>
+            <w:tcBorders>
+              <w:top w:val="nil"/>
+              <w:left w:val="nil"/>
+              <w:bottom w:val="nil"/>
+              <w:right w:val="nil"/>
+              <w:insideH w:val="nil"/>
+              <w:insideV w:val="nil"/>
+            </w:tcBorders>
+          </w:tcPr>
+          <w:p>
+            <w:pPr>
+              <w:spacing w:before="60" w:after="60"/>
+              <w:ind w:left="113"/>
+            </w:pPr>
+            <w:r>
+              <w:rPr>
+                <w:b w:val="0"/>
+                <w:color w:val="3A3A3A"/>
+                <w:sz w:val="19"/>
+              </w:rPr>
+              <w:t>Scenario-analyse: personeelsbezetting</w:t>
+            </w:r>
+          </w:p>
+        </w:tc>
+        <w:tc>
+          <w:tcPr>
+            <w:tcW w:type="dxa" w:w="4819"/>
+            <w:shd w:val="clear" w:color="auto" w:fill="FFFFFF"/>
+            <w:tcBorders>
+              <w:top w:val="nil"/>
+              <w:left w:val="nil"/>
+              <w:bottom w:val="nil"/>
+              <w:right w:val="nil"/>
+              <w:insideH w:val="nil"/>
+              <w:insideV w:val="nil"/>
+            </w:tcBorders>
+          </w:tcPr>
+          <w:p>
+            <w:pPr>
+              <w:spacing w:before="60" w:after="60"/>
+              <w:ind w:left="113"/>
+            </w:pPr>
+            <w:r>
+              <w:rPr>
+                <w:b w:val="0"/>
+                <w:color w:val="3A3A3A"/>
+                <w:sz w:val="19"/>
+              </w:rPr>
+              <w:t>Simuleer: 'Als we 1 arts minder hebben op zondagnacht → wat is impact op wachttijden?'</w:t>
+            </w:r>
+          </w:p>
+        </w:tc>
+      </w:tr>
+      <w:tr>
+        <w:tc>
+          <w:tcPr>
+            <w:tcW w:type="dxa" w:w="4819"/>
+            <w:shd w:val="clear" w:color="auto" w:fill="F2F2F2"/>
+            <w:tcBorders>
+              <w:top w:val="nil"/>
+              <w:left w:val="nil"/>
+              <w:bottom w:val="nil"/>
+              <w:right w:val="nil"/>
+              <w:insideH w:val="nil"/>
+              <w:insideV w:val="nil"/>
+            </w:tcBorders>
+          </w:tcPr>
+          <w:p>
+            <w:pPr>
+              <w:spacing w:before="60" w:after="60"/>
+              <w:ind w:left="113"/>
+            </w:pPr>
+            <w:r>
+              <w:rPr>
+                <w:b w:val="0"/>
+                <w:color w:val="3A3A3A"/>
+                <w:sz w:val="19"/>
+              </w:rPr>
+              <w:t>Integratie</w:t>
+            </w:r>
+          </w:p>
+        </w:tc>
+        <w:tc>
+          <w:tcPr>
+            <w:tcW w:type="dxa" w:w="4819"/>
+            <w:shd w:val="clear" w:color="auto" w:fill="F2F2F2"/>
+            <w:tcBorders>
+              <w:top w:val="nil"/>
+              <w:left w:val="nil"/>
+              <w:bottom w:val="nil"/>
+              <w:right w:val="nil"/>
+              <w:insideH w:val="nil"/>
+              <w:insideV w:val="nil"/>
+            </w:tcBorders>
+          </w:tcPr>
+          <w:p>
+            <w:pPr>
+              <w:spacing w:before="60" w:after="60"/>
+              <w:ind w:left="113"/>
+            </w:pPr>
+            <w:r>
+              <w:rPr>
+                <w:b w:val="0"/>
+                <w:color w:val="3A3A3A"/>
+                <w:sz w:val="19"/>
+              </w:rPr>
+              <w:t>Koppeling met ZIS/EPD (bijv. HiX, Epic, EPIC) voor live datafeed</w:t>
+            </w:r>
+          </w:p>
+        </w:tc>
+      </w:tr>
+      <w:tr>
+        <w:tc>
+          <w:tcPr>
+            <w:tcW w:type="dxa" w:w="4819"/>
+            <w:shd w:val="clear" w:color="auto" w:fill="FFFFFF"/>
+            <w:tcBorders>
+              <w:top w:val="nil"/>
+              <w:left w:val="nil"/>
+              <w:bottom w:val="nil"/>
+              <w:right w:val="nil"/>
+              <w:insideH w:val="nil"/>
+              <w:insideV w:val="nil"/>
+            </w:tcBorders>
+          </w:tcPr>
+          <w:p>
+            <w:pPr>
+              <w:spacing w:before="60" w:after="60"/>
+              <w:ind w:left="113"/>
+            </w:pPr>
+            <w:r>
+              <w:rPr>
+                <w:b w:val="0"/>
+                <w:color w:val="3A3A3A"/>
+                <w:sz w:val="19"/>
+              </w:rPr>
+              <w:t>Modelplan aansluiting</w:t>
+            </w:r>
+          </w:p>
+        </w:tc>
+        <w:tc>
+          <w:tcPr>
+            <w:tcW w:type="dxa" w:w="4819"/>
+            <w:shd w:val="clear" w:color="auto" w:fill="FFFFFF"/>
+            <w:tcBorders>
+              <w:top w:val="nil"/>
+              <w:left w:val="nil"/>
+              <w:bottom w:val="nil"/>
+              <w:right w:val="nil"/>
+              <w:insideH w:val="nil"/>
+              <w:insideV w:val="nil"/>
+            </w:tcBorders>
+          </w:tcPr>
+          <w:p>
+            <w:pPr>
+              <w:spacing w:before="60" w:after="60"/>
+              <w:ind w:left="113"/>
+            </w:pPr>
+            <w:r>
+              <w:rPr>
+                <w:b w:val="0"/>
+                <w:color w:val="3A3A3A"/>
+                <w:sz w:val="19"/>
+              </w:rPr>
+              <w:t>MP01 – Capaciteitsplanning met AI (SEH valt onder MSZ/Zvw)</w:t>
+            </w:r>
+          </w:p>
+        </w:tc>
+      </w:tr>
+    </w:tbl>
+    <w:p>
+      <w:pPr>
+        <w:spacing w:after="80"/>
+      </w:pPr>
+    </w:p>
+    <w:tbl>
+      <w:tblPr>
+        <w:tblW w:type="auto" w:w="0"/>
+        <w:jc w:val="left"/>
+        <w:tblLook w:firstColumn="1" w:firstRow="1" w:lastColumn="0" w:lastRow="0" w:noHBand="0" w:noVBand="1" w:val="04A0"/>
+      </w:tblPr>
+      <w:tblGrid>
+        <w:gridCol w:w="9638"/>
+      </w:tblGrid>
+      <w:tr>
+        <w:tc>
+          <w:tcPr>
+            <w:tcW w:type="dxa" w:w="9638"/>
+            <w:shd w:val="clear" w:color="auto" w:fill="1E7E34"/>
+            <w:tcBorders>
+              <w:top w:val="nil"/>
+              <w:left w:val="nil"/>
+              <w:bottom w:val="nil"/>
+              <w:right w:val="nil"/>
+              <w:insideH w:val="nil"/>
+              <w:insideV w:val="nil"/>
+            </w:tcBorders>
+          </w:tcPr>
+          <w:p>
+            <w:pPr>
+              <w:spacing w:before="100" w:after="100"/>
+              <w:ind w:left="227"/>
+            </w:pPr>
+            <w:r>
+              <w:rPr>
+                <w:b/>
+                <w:color w:val="FFFFFF"/>
+                <w:sz w:val="22"/>
+              </w:rPr>
+              <w:t>💡  Waarom is het scenario-analysedeel zo waardevol voor de aanvraag?</w:t>
+            </w:r>
+          </w:p>
+        </w:tc>
+      </w:tr>
+      <w:tr>
+        <w:tc>
+          <w:tcPr>
+            <w:tcW w:type="dxa" w:w="9638"/>
+            <w:shd w:val="clear" w:color="auto" w:fill="D4EDDA"/>
+            <w:tcBorders>
+              <w:top w:val="nil"/>
+              <w:left w:val="nil"/>
+              <w:bottom w:val="nil"/>
+              <w:right w:val="nil"/>
+              <w:insideH w:val="nil"/>
+              <w:insideV w:val="nil"/>
+            </w:tcBorders>
+          </w:tcPr>
+          <w:p/>
+          <w:p>
+            <w:pPr>
+              <w:spacing w:before="20" w:after="40"/>
+              <w:ind w:left="283" w:hanging="227"/>
+            </w:pPr>
+            <w:r>
+              <w:rPr>
+                <w:b/>
+                <w:color w:val="1E7E34"/>
+                <w:sz w:val="20"/>
+              </w:rPr>
+              <w:t xml:space="preserve">▸  </w:t>
+            </w:r>
+            <w:r>
+              <w:rPr>
+                <w:color w:val="3A3A3A"/>
+                <w:sz w:val="20"/>
+              </w:rPr>
+              <w:t>Scenario-analyse toont aan dat de tool niet alleen rapporteert maar ook voorspelt en adviseert — dit is 'AI' in de echte zin.</w:t>
+            </w:r>
+          </w:p>
+          <w:p>
+            <w:pPr>
+              <w:spacing w:before="20" w:after="40"/>
+              <w:ind w:left="283" w:hanging="227"/>
+            </w:pPr>
+            <w:r>
+              <w:rPr>
+                <w:b/>
+                <w:color w:val="1E7E34"/>
+                <w:sz w:val="20"/>
+              </w:rPr>
+              <w:t xml:space="preserve">▸  </w:t>
+            </w:r>
+            <w:r>
+              <w:rPr>
+                <w:color w:val="3A3A3A"/>
+                <w:sz w:val="20"/>
+              </w:rPr>
+              <w:t>Het afbuigen van zorg (bijv. naar HAP) heeft directe impact op de SEH-werkdruk: dit is aantoonbare arbeidsbesparing via capaciteitsoptimalisatie.</w:t>
+            </w:r>
+          </w:p>
+          <w:p>
+            <w:pPr>
+              <w:spacing w:before="20" w:after="40"/>
+              <w:ind w:left="283" w:hanging="227"/>
+            </w:pPr>
+            <w:r>
+              <w:rPr>
+                <w:b/>
+                <w:color w:val="1E7E34"/>
+                <w:sz w:val="20"/>
+              </w:rPr>
+              <w:t xml:space="preserve">▸  </w:t>
+            </w:r>
+            <w:r>
+              <w:rPr>
+                <w:color w:val="3A3A3A"/>
+                <w:sz w:val="20"/>
+              </w:rPr>
+              <w:t>U kunt met dit dashboard precies onderbouwen hoeveel uren/FTE bespaard worden per scenario — ideaal voor de nulmeting en mijlpaalonderbouwing.</w:t>
+            </w:r>
+          </w:p>
+          <w:p>
+            <w:pPr>
+              <w:spacing w:before="20" w:after="40"/>
+              <w:ind w:left="283" w:hanging="227"/>
+            </w:pPr>
+            <w:r>
+              <w:rPr>
+                <w:b/>
+                <w:color w:val="1E7E34"/>
+                <w:sz w:val="20"/>
+              </w:rPr>
+              <w:t xml:space="preserve">▸  </w:t>
+            </w:r>
+            <w:r>
+              <w:rPr>
+                <w:color w:val="3A3A3A"/>
+                <w:sz w:val="20"/>
+              </w:rPr>
+              <w:t>Het dashboard kan ook worden ingezet voor ketensamenwerking (SEH + HAP + huisarts) — dit raakt aan regionaal capaciteitsbeheer.</w:t>
+            </w:r>
+          </w:p>
+          <w:p>
+            <w:pPr>
+              <w:spacing w:before="20" w:after="40"/>
+              <w:ind w:left="283" w:hanging="227"/>
+            </w:pPr>
+            <w:r>
+              <w:rPr>
+                <w:b/>
+                <w:color w:val="1E7E34"/>
+                <w:sz w:val="20"/>
+              </w:rPr>
+              <w:t xml:space="preserve">▸  </w:t>
+            </w:r>
+            <w:r>
+              <w:rPr>
+                <w:color w:val="3A3A3A"/>
+                <w:sz w:val="20"/>
+              </w:rPr>
+              <w:t>Let op: als het dashboard data van meerdere instellingen verwerkt, gelden extra privacy-vereisten (NTA 8028, data-overeenkomst).</w:t>
+            </w:r>
+          </w:p>
+          <w:p>
+            <w:pPr>
+              <w:spacing w:after="80"/>
+            </w:pPr>
+          </w:p>
+        </w:tc>
+      </w:tr>
+    </w:tbl>
+    <w:p>
+      <w:pPr>
+        <w:spacing w:after="80"/>
+      </w:pPr>
+    </w:p>
+    <w:p>
+      <w:pPr>
+        <w:spacing w:before="120" w:after="120"/>
+        <w:pBdr>
+          <w:bottom w:val="single" w:sz="6" w:space="1" w:color="004787"/>
+        </w:pBdr>
+      </w:pPr>
+    </w:p>
+    <w:p>
+      <w:pPr>
+        <w:spacing w:before="120" w:after="80"/>
+      </w:pPr>
+      <w:r>
+        <w:rPr>
+          <w:b/>
+          <w:color w:val="004787"/>
+          <w:sz w:val="24"/>
+        </w:rPr>
+        <w:t>Overzicht: Wat mag wel en niet met zelf gebouwde AI-tools?</w:t>
+      </w:r>
+    </w:p>
+    <w:tbl>
+      <w:tblPr>
+        <w:tblW w:type="auto" w:w="0"/>
+        <w:jc w:val="left"/>
+        <w:tblLook w:firstColumn="1" w:firstRow="1" w:lastColumn="0" w:lastRow="0" w:noHBand="0" w:noVBand="1" w:val="04A0"/>
+      </w:tblPr>
+      <w:tblGrid>
+        <w:gridCol w:w="4819"/>
+        <w:gridCol w:w="4819"/>
+      </w:tblGrid>
+      <w:tr>
+        <w:tc>
+          <w:tcPr>
+            <w:tcW w:type="dxa" w:w="4819"/>
+            <w:shd w:val="clear" w:color="auto" w:fill="1E7E34"/>
+            <w:tcBorders>
+              <w:top w:val="nil"/>
+              <w:left w:val="nil"/>
+              <w:bottom w:val="nil"/>
+              <w:right w:val="nil"/>
+              <w:insideH w:val="nil"/>
+              <w:insideV w:val="nil"/>
+            </w:tcBorders>
+          </w:tcPr>
+          <w:p>
+            <w:pPr>
+              <w:spacing w:before="100" w:after="100"/>
+              <w:jc w:val="center"/>
+            </w:pPr>
+            <w:r>
+              <w:rPr>
+                <w:b/>
+                <w:color w:val="FFFFFF"/>
+                <w:sz w:val="21"/>
+              </w:rPr>
+              <w:t>✓  Zelf gebouwde tool MAG kwalificeren als:</w:t>
+            </w:r>
+          </w:p>
+        </w:tc>
+        <w:tc>
+          <w:tcPr>
+            <w:tcW w:type="dxa" w:w="4819"/>
+            <w:shd w:val="clear" w:color="auto" w:fill="C0392B"/>
+            <w:tcBorders>
+              <w:top w:val="nil"/>
+              <w:left w:val="nil"/>
+              <w:bottom w:val="nil"/>
+              <w:right w:val="nil"/>
+              <w:insideH w:val="nil"/>
+              <w:insideV w:val="nil"/>
+            </w:tcBorders>
+          </w:tcPr>
+          <w:p>
+            <w:pPr>
+              <w:spacing w:before="100" w:after="100"/>
+              <w:jc w:val="center"/>
+            </w:pPr>
+            <w:r>
+              <w:rPr>
+                <w:b/>
+                <w:color w:val="FFFFFF"/>
+                <w:sz w:val="21"/>
+              </w:rPr>
+              <w:t>✗  Zelf gebouwde tool kwalificeert NIET als:</w:t>
+            </w:r>
+          </w:p>
+        </w:tc>
+      </w:tr>
+      <w:tr>
+        <w:tc>
+          <w:tcPr>
+            <w:tcW w:type="dxa" w:w="4819"/>
+            <w:shd w:val="clear" w:color="auto" w:fill="D4EDDA"/>
+            <w:tcBorders>
+              <w:top w:val="nil"/>
+              <w:left w:val="nil"/>
+              <w:bottom w:val="nil"/>
+              <w:right w:val="nil"/>
+              <w:insideH w:val="nil"/>
+              <w:insideV w:val="nil"/>
+            </w:tcBorders>
+          </w:tcPr>
+          <w:p/>
+          <w:p>
+            <w:pPr>
+              <w:spacing w:before="20" w:after="40"/>
+              <w:ind w:left="227" w:hanging="227"/>
+            </w:pPr>
+            <w:r>
+              <w:rPr>
+                <w:b/>
+                <w:color w:val="1E7E34"/>
+                <w:sz w:val="20"/>
+              </w:rPr>
+              <w:t xml:space="preserve">✓  </w:t>
+            </w:r>
+            <w:r>
+              <w:rPr>
+                <w:color w:val="3A3A3A"/>
+                <w:sz w:val="20"/>
+              </w:rPr>
+              <w:t>De tool aantoonbaar arbeidsbesparend werkt (meting, nulmeting, data)</w:t>
+            </w:r>
+          </w:p>
+          <w:p>
+            <w:pPr>
+              <w:spacing w:before="20" w:after="40"/>
+              <w:ind w:left="227" w:hanging="227"/>
+            </w:pPr>
+            <w:r>
+              <w:rPr>
+                <w:b/>
+                <w:color w:val="1E7E34"/>
+                <w:sz w:val="20"/>
+              </w:rPr>
+              <w:t xml:space="preserve">✓  </w:t>
+            </w:r>
+            <w:r>
+              <w:rPr>
+                <w:color w:val="3A3A3A"/>
+                <w:sz w:val="20"/>
+              </w:rPr>
+              <w:t>De tool valt binnen een van de 5 vastgestelde modelplannen</w:t>
+            </w:r>
+          </w:p>
+          <w:p>
+            <w:pPr>
+              <w:spacing w:before="20" w:after="40"/>
+              <w:ind w:left="227" w:hanging="227"/>
+            </w:pPr>
+            <w:r>
+              <w:rPr>
+                <w:b/>
+                <w:color w:val="1E7E34"/>
+                <w:sz w:val="20"/>
+              </w:rPr>
+              <w:t xml:space="preserve">✓  </w:t>
+            </w:r>
+            <w:r>
+              <w:rPr>
+                <w:color w:val="3A3A3A"/>
+                <w:sz w:val="20"/>
+              </w:rPr>
+              <w:t>De zorg die de tool ondersteunt valt onder de Zvw</w:t>
+            </w:r>
+          </w:p>
+          <w:p>
+            <w:pPr>
+              <w:spacing w:before="20" w:after="40"/>
+              <w:ind w:left="227" w:hanging="227"/>
+            </w:pPr>
+            <w:r>
+              <w:rPr>
+                <w:b/>
+                <w:color w:val="1E7E34"/>
+                <w:sz w:val="20"/>
+              </w:rPr>
+              <w:t xml:space="preserve">✓  </w:t>
+            </w:r>
+            <w:r>
+              <w:rPr>
+                <w:color w:val="3A3A3A"/>
+                <w:sz w:val="20"/>
+              </w:rPr>
+              <w:t>Er een DPIA en verwerkersovereenkomst aanwezig is</w:t>
+            </w:r>
+          </w:p>
+          <w:p>
+            <w:pPr>
+              <w:spacing w:before="20" w:after="40"/>
+              <w:ind w:left="227" w:hanging="227"/>
+            </w:pPr>
+            <w:r>
+              <w:rPr>
+                <w:b/>
+                <w:color w:val="1E7E34"/>
+                <w:sz w:val="20"/>
+              </w:rPr>
+              <w:t xml:space="preserve">✓  </w:t>
+            </w:r>
+            <w:r>
+              <w:rPr>
+                <w:color w:val="3A3A3A"/>
+                <w:sz w:val="20"/>
+              </w:rPr>
+              <w:t>De tool voldoet aan NEN 7510 / NEN 7512 voor informatiebeveiliging</w:t>
+            </w:r>
+          </w:p>
+          <w:p>
+            <w:pPr>
+              <w:spacing w:before="20" w:after="40"/>
+              <w:ind w:left="227" w:hanging="227"/>
+            </w:pPr>
+            <w:r>
+              <w:rPr>
+                <w:b/>
+                <w:color w:val="1E7E34"/>
+                <w:sz w:val="20"/>
+              </w:rPr>
+              <w:t xml:space="preserve">✓  </w:t>
+            </w:r>
+            <w:r>
+              <w:rPr>
+                <w:color w:val="3A3A3A"/>
+                <w:sz w:val="20"/>
+              </w:rPr>
+              <w:t>Patiëntdata uitsluitend op Europese servers wordt verwerkt (AVG)</w:t>
+            </w:r>
+          </w:p>
+          <w:p>
+            <w:pPr>
+              <w:spacing w:before="20" w:after="40"/>
+              <w:ind w:left="227" w:hanging="227"/>
+            </w:pPr>
+            <w:r>
+              <w:rPr>
+                <w:b/>
+                <w:color w:val="1E7E34"/>
+                <w:sz w:val="20"/>
+              </w:rPr>
+              <w:t xml:space="preserve">✓  </w:t>
+            </w:r>
+            <w:r>
+              <w:rPr>
+                <w:color w:val="3A3A3A"/>
+                <w:sz w:val="20"/>
+              </w:rPr>
+              <w:t>De tool is geïntegreerd met het bestaande EPD/HIS/RIS</w:t>
+            </w:r>
+          </w:p>
+          <w:p>
+            <w:pPr>
+              <w:spacing w:before="20" w:after="40"/>
+              <w:ind w:left="227" w:hanging="227"/>
+            </w:pPr>
+            <w:r>
+              <w:rPr>
+                <w:b/>
+                <w:color w:val="1E7E34"/>
+                <w:sz w:val="20"/>
+              </w:rPr>
+              <w:t xml:space="preserve">✓  </w:t>
+            </w:r>
+            <w:r>
+              <w:rPr>
+                <w:color w:val="3A3A3A"/>
+                <w:sz w:val="20"/>
+              </w:rPr>
+              <w:t>Er intern draagvlak is (OR, medewerkers, management)</w:t>
+            </w:r>
+          </w:p>
+          <w:p>
+            <w:pPr>
+              <w:spacing w:before="20" w:after="40"/>
+              <w:ind w:left="227" w:hanging="227"/>
+            </w:pPr>
+            <w:r>
+              <w:rPr>
+                <w:b/>
+                <w:color w:val="1E7E34"/>
+                <w:sz w:val="20"/>
+              </w:rPr>
+              <w:t xml:space="preserve">✓  </w:t>
+            </w:r>
+            <w:r>
+              <w:rPr>
+                <w:color w:val="3A3A3A"/>
+                <w:sz w:val="20"/>
+              </w:rPr>
+              <w:t>Ontwikkelkosten aantoonbaar zijn (intern uren of extern factuur)</w:t>
+            </w:r>
+          </w:p>
+          <w:p>
+            <w:pPr>
+              <w:spacing w:before="20" w:after="40"/>
+              <w:ind w:left="227" w:hanging="227"/>
+            </w:pPr>
+            <w:r>
+              <w:rPr>
+                <w:b/>
+                <w:color w:val="1E7E34"/>
+                <w:sz w:val="20"/>
+              </w:rPr>
+              <w:t xml:space="preserve">✓  </w:t>
+            </w:r>
+            <w:r>
+              <w:rPr>
+                <w:color w:val="3A3A3A"/>
+                <w:sz w:val="20"/>
+              </w:rPr>
+              <w:t>De tool structureel wordt ingezet, niet eenmalig</w:t>
+            </w:r>
+          </w:p>
+        </w:tc>
+        <w:tc>
+          <w:tcPr>
+            <w:tcW w:type="dxa" w:w="4819"/>
+            <w:shd w:val="clear" w:color="auto" w:fill="F8D7DA"/>
+            <w:tcBorders>
+              <w:top w:val="nil"/>
+              <w:left w:val="nil"/>
+              <w:bottom w:val="nil"/>
+              <w:right w:val="nil"/>
+              <w:insideH w:val="nil"/>
+              <w:insideV w:val="nil"/>
+            </w:tcBorders>
+          </w:tcPr>
+          <w:p/>
+          <w:p>
+            <w:pPr>
+              <w:spacing w:before="20" w:after="40"/>
+              <w:ind w:left="227" w:hanging="227"/>
+            </w:pPr>
+            <w:r>
+              <w:rPr>
+                <w:b/>
+                <w:color w:val="C0392B"/>
+                <w:sz w:val="20"/>
+              </w:rPr>
+              <w:t xml:space="preserve">✗  </w:t>
+            </w:r>
+            <w:r>
+              <w:rPr>
+                <w:color w:val="3A3A3A"/>
+                <w:sz w:val="20"/>
+              </w:rPr>
+              <w:t>Er geen bewijs van effectiviteit is (alleen 'het werkt goed' is niet genoeg)</w:t>
+            </w:r>
+          </w:p>
+          <w:p>
+            <w:pPr>
+              <w:spacing w:before="20" w:after="40"/>
+              <w:ind w:left="227" w:hanging="227"/>
+            </w:pPr>
+            <w:r>
+              <w:rPr>
+                <w:b/>
+                <w:color w:val="C0392B"/>
+                <w:sz w:val="20"/>
+              </w:rPr>
+              <w:t xml:space="preserve">✗  </w:t>
+            </w:r>
+            <w:r>
+              <w:rPr>
+                <w:color w:val="3A3A3A"/>
+                <w:sz w:val="20"/>
+              </w:rPr>
+              <w:t>De tool nog in pilot-fase zit op moment van aanvraag</w:t>
+            </w:r>
+          </w:p>
+          <w:p>
+            <w:pPr>
+              <w:spacing w:before="20" w:after="40"/>
+              <w:ind w:left="227" w:hanging="227"/>
+            </w:pPr>
+            <w:r>
+              <w:rPr>
+                <w:b/>
+                <w:color w:val="C0392B"/>
+                <w:sz w:val="20"/>
+              </w:rPr>
+              <w:t xml:space="preserve">✗  </w:t>
+            </w:r>
+            <w:r>
+              <w:rPr>
+                <w:color w:val="3A3A3A"/>
+                <w:sz w:val="20"/>
+              </w:rPr>
+              <w:t>De tool Wlz- of WMO-gefinancierde zorg ondersteunt</w:t>
+            </w:r>
+          </w:p>
+          <w:p>
+            <w:pPr>
+              <w:spacing w:before="20" w:after="40"/>
+              <w:ind w:left="227" w:hanging="227"/>
+            </w:pPr>
+            <w:r>
+              <w:rPr>
+                <w:b/>
+                <w:color w:val="C0392B"/>
+                <w:sz w:val="20"/>
+              </w:rPr>
+              <w:t xml:space="preserve">✗  </w:t>
+            </w:r>
+            <w:r>
+              <w:rPr>
+                <w:color w:val="3A3A3A"/>
+                <w:sz w:val="20"/>
+              </w:rPr>
+              <w:t>Er geen privacy-documentatie aanwezig is (DPIA ontbreekt)</w:t>
+            </w:r>
+          </w:p>
+          <w:p>
+            <w:pPr>
+              <w:spacing w:before="20" w:after="40"/>
+              <w:ind w:left="227" w:hanging="227"/>
+            </w:pPr>
+            <w:r>
+              <w:rPr>
+                <w:b/>
+                <w:color w:val="C0392B"/>
+                <w:sz w:val="20"/>
+              </w:rPr>
+              <w:t xml:space="preserve">✗  </w:t>
+            </w:r>
+            <w:r>
+              <w:rPr>
+                <w:color w:val="3A3A3A"/>
+                <w:sz w:val="20"/>
+              </w:rPr>
+              <w:t>Patiëntdata via buitenlandse (bijv. VS) AI-servers wordt verwerkt zonder EU-addendum</w:t>
+            </w:r>
+          </w:p>
+          <w:p>
+            <w:pPr>
+              <w:spacing w:before="20" w:after="40"/>
+              <w:ind w:left="227" w:hanging="227"/>
+            </w:pPr>
+            <w:r>
+              <w:rPr>
+                <w:b/>
+                <w:color w:val="C0392B"/>
+                <w:sz w:val="20"/>
+              </w:rPr>
+              <w:t xml:space="preserve">✗  </w:t>
+            </w:r>
+            <w:r>
+              <w:rPr>
+                <w:color w:val="3A3A3A"/>
+                <w:sz w:val="20"/>
+              </w:rPr>
+              <w:t>De tool al gefinancierd wordt via andere budgetten of subsidies</w:t>
+            </w:r>
+          </w:p>
+          <w:p>
+            <w:pPr>
+              <w:spacing w:before="20" w:after="40"/>
+              <w:ind w:left="227" w:hanging="227"/>
+            </w:pPr>
+            <w:r>
+              <w:rPr>
+                <w:b/>
+                <w:color w:val="C0392B"/>
+                <w:sz w:val="20"/>
+              </w:rPr>
+              <w:t xml:space="preserve">✗  </w:t>
+            </w:r>
+            <w:r>
+              <w:rPr>
+                <w:color w:val="3A3A3A"/>
+                <w:sz w:val="20"/>
+              </w:rPr>
+              <w:t>Ontwikkelkosten al zijn gemaakt vóór toekenning (additionaliteit!)</w:t>
+            </w:r>
+          </w:p>
+          <w:p>
+            <w:pPr>
+              <w:spacing w:before="20" w:after="40"/>
+              <w:ind w:left="227" w:hanging="227"/>
+            </w:pPr>
+            <w:r>
+              <w:rPr>
+                <w:b/>
+                <w:color w:val="C0392B"/>
+                <w:sz w:val="20"/>
+              </w:rPr>
+              <w:t xml:space="preserve">✗  </w:t>
+            </w:r>
+            <w:r>
+              <w:rPr>
+                <w:color w:val="3A3A3A"/>
+                <w:sz w:val="20"/>
+              </w:rPr>
+              <w:t>De tool niet aansluit bij een van de 5 modelplannen</w:t>
+            </w:r>
+          </w:p>
+          <w:p>
+            <w:pPr>
+              <w:spacing w:before="20" w:after="40"/>
+              <w:ind w:left="227" w:hanging="227"/>
+            </w:pPr>
+            <w:r>
+              <w:rPr>
+                <w:b/>
+                <w:color w:val="C0392B"/>
+                <w:sz w:val="20"/>
+              </w:rPr>
+              <w:t xml:space="preserve">✗  </w:t>
+            </w:r>
+            <w:r>
+              <w:rPr>
+                <w:color w:val="3A3A3A"/>
+                <w:sz w:val="20"/>
+              </w:rPr>
+              <w:t>Er geen koppeling is met bestaande zorgregistratiesystemen</w:t>
+            </w:r>
+          </w:p>
+          <w:p>
+            <w:pPr>
+              <w:spacing w:before="20" w:after="40"/>
+              <w:ind w:left="227" w:hanging="227"/>
+            </w:pPr>
+            <w:r>
+              <w:rPr>
+                <w:b/>
+                <w:color w:val="C0392B"/>
+                <w:sz w:val="20"/>
+              </w:rPr>
+              <w:t xml:space="preserve">✗  </w:t>
+            </w:r>
+            <w:r>
+              <w:rPr>
+                <w:color w:val="3A3A3A"/>
+                <w:sz w:val="20"/>
+              </w:rPr>
+              <w:t>De tool door slechts één persoon wordt gebruikt (geen organisatiebrede inzet)</w:t>
+            </w:r>
+          </w:p>
+        </w:tc>
+      </w:tr>
+      <w:tr>
+        <w:tc>
+          <w:tcPr>
+            <w:tcW w:type="dxa" w:w="4819"/>
+            <w:shd w:val="clear" w:color="auto" w:fill="D4EDDA"/>
+            <w:tcBorders>
+              <w:top w:val="nil"/>
+              <w:left w:val="nil"/>
+              <w:bottom w:val="nil"/>
+              <w:right w:val="nil"/>
+              <w:insideH w:val="nil"/>
+              <w:insideV w:val="nil"/>
+            </w:tcBorders>
+          </w:tcPr>
+          <w:p>
+            <w:pPr>
+              <w:spacing w:after="80"/>
+            </w:pPr>
+          </w:p>
+        </w:tc>
+        <w:tc>
+          <w:tcPr>
+            <w:tcW w:type="dxa" w:w="4819"/>
+            <w:shd w:val="clear" w:color="auto" w:fill="F8D7DA"/>
+            <w:tcBorders>
+              <w:top w:val="nil"/>
+              <w:left w:val="nil"/>
+              <w:bottom w:val="nil"/>
+              <w:right w:val="nil"/>
+              <w:insideH w:val="nil"/>
+              <w:insideV w:val="nil"/>
+            </w:tcBorders>
+          </w:tcPr>
+          <w:p>
+            <w:pPr>
+              <w:spacing w:after="80"/>
+            </w:pPr>
+          </w:p>
+        </w:tc>
+      </w:tr>
+    </w:tbl>
+    <w:p>
+      <w:pPr>
+        <w:spacing w:after="80"/>
+      </w:pPr>
+    </w:p>
+    <w:p>
+      <w:pPr>
+        <w:spacing w:before="120" w:after="80"/>
+      </w:pPr>
+      <w:r>
+        <w:rPr>
+          <w:b/>
+          <w:color w:val="004787"/>
+          <w:sz w:val="24"/>
+        </w:rPr>
+        <w:t>Stappenplan: Zelf gebouwde AI-tool laten kwalificeren voor doorbraakmiddelen</w:t>
+      </w:r>
+    </w:p>
+    <w:tbl>
+      <w:tblPr>
+        <w:tblW w:type="auto" w:w="0"/>
+        <w:jc w:val="left"/>
+        <w:tblLook w:firstColumn="1" w:firstRow="1" w:lastColumn="0" w:lastRow="0" w:noHBand="0" w:noVBand="1" w:val="04A0"/>
+      </w:tblPr>
+      <w:tblGrid>
+        <w:gridCol w:w="4819"/>
+        <w:gridCol w:w="4819"/>
+      </w:tblGrid>
+      <w:tr>
+        <w:tc>
+          <w:tcPr>
+            <w:tcW w:type="dxa" w:w="907"/>
+            <w:shd w:val="clear" w:color="auto" w:fill="004787"/>
+            <w:tcBorders>
+              <w:top w:val="nil"/>
+              <w:left w:val="nil"/>
+              <w:bottom w:val="nil"/>
+              <w:right w:val="nil"/>
+              <w:insideH w:val="nil"/>
+              <w:insideV w:val="nil"/>
+            </w:tcBorders>
+          </w:tcPr>
+          <w:p>
+            <w:pPr>
+              <w:spacing w:before="120" w:after="40"/>
+              <w:jc w:val="center"/>
+            </w:pPr>
+            <w:r>
+              <w:rPr>
+                <w:b/>
+                <w:i w:val="0"/>
+                <w:color w:val="FFFFCC"/>
+                <w:sz w:val="12"/>
+              </w:rPr>
+              <w:t>STAP</w:t>
+            </w:r>
+          </w:p>
+          <w:p>
+            <w:pPr>
+              <w:spacing w:before="0" w:after="120"/>
+              <w:jc w:val="center"/>
+            </w:pPr>
+            <w:r>
+              <w:rPr>
+                <w:b/>
+                <w:i w:val="0"/>
+                <w:color w:val="FFFFFF"/>
+                <w:sz w:val="22"/>
+              </w:rPr>
+              <w:t>1</w:t>
+            </w:r>
+          </w:p>
+        </w:tc>
+        <w:tc>
+          <w:tcPr>
+            <w:tcW w:type="dxa" w:w="4819"/>
+            <w:shd w:val="clear" w:color="auto" w:fill="ECF5FD"/>
+            <w:tcBorders>
+              <w:top w:val="nil"/>
+              <w:left w:val="nil"/>
+              <w:bottom w:val="nil"/>
+              <w:right w:val="nil"/>
+              <w:insideH w:val="nil"/>
+              <w:insideV w:val="nil"/>
+            </w:tcBorders>
+          </w:tcPr>
+          <w:p>
+            <w:pPr>
+              <w:spacing w:before="100" w:after="40"/>
+              <w:ind w:left="170"/>
+            </w:pPr>
+            <w:r>
+              <w:rPr>
+                <w:b/>
+                <w:i w:val="0"/>
+                <w:color w:val="004787"/>
+                <w:sz w:val="21"/>
+              </w:rPr>
+              <w:t>Koppel uw tool expliciet aan één van de 5 modelplannen</w:t>
+            </w:r>
+          </w:p>
+          <w:p>
+            <w:pPr>
+              <w:spacing w:before="0" w:after="20"/>
+              <w:ind w:left="283" w:hanging="227"/>
+            </w:pPr>
+            <w:r>
+              <w:rPr>
+                <w:b/>
+                <w:i w:val="0"/>
+                <w:color w:val="004787"/>
+                <w:sz w:val="18"/>
+              </w:rPr>
+              <w:t xml:space="preserve">▸  </w:t>
+            </w:r>
+            <w:r>
+              <w:rPr>
+                <w:b w:val="0"/>
+                <w:i w:val="0"/>
+                <w:color w:val="3A3A3A"/>
+                <w:sz w:val="18"/>
+              </w:rPr>
+              <w:t>Analyseer welk modelplan het beste aansluit (voor capaciteitsplanning: MP01)</w:t>
+            </w:r>
+          </w:p>
+          <w:p>
+            <w:pPr>
+              <w:spacing w:before="0" w:after="20"/>
+              <w:ind w:left="283" w:hanging="227"/>
+            </w:pPr>
+            <w:r>
+              <w:rPr>
+                <w:b/>
+                <w:i w:val="0"/>
+                <w:color w:val="004787"/>
+                <w:sz w:val="18"/>
+              </w:rPr>
+              <w:t xml:space="preserve">▸  </w:t>
+            </w:r>
+            <w:r>
+              <w:rPr>
+                <w:b w:val="0"/>
+                <w:i w:val="0"/>
+                <w:color w:val="3A3A3A"/>
+                <w:sz w:val="18"/>
+              </w:rPr>
+              <w:t>Beschrijf in uw aanvraag expliciet hoe uw tool voldoet aan de criteria van dat modelplan</w:t>
+            </w:r>
+          </w:p>
+          <w:p>
+            <w:pPr>
+              <w:spacing w:before="0" w:after="20"/>
+              <w:ind w:left="283" w:hanging="227"/>
+            </w:pPr>
+            <w:r>
+              <w:rPr>
+                <w:b/>
+                <w:i w:val="0"/>
+                <w:color w:val="004787"/>
+                <w:sz w:val="18"/>
+              </w:rPr>
+              <w:t xml:space="preserve">▸  </w:t>
+            </w:r>
+            <w:r>
+              <w:rPr>
+                <w:b w:val="0"/>
+                <w:i w:val="0"/>
+                <w:color w:val="3A3A3A"/>
+                <w:sz w:val="18"/>
+              </w:rPr>
+              <w:t>Als uw tool meerdere modelplannen raakt: kies het meest passende plan als primair anker</w:t>
+            </w:r>
+          </w:p>
+          <w:p>
+            <w:pPr>
+              <w:spacing w:after="80"/>
+            </w:pPr>
+          </w:p>
+        </w:tc>
+      </w:tr>
+    </w:tbl>
+    <w:p>
+      <w:pPr>
+        <w:spacing w:after="60"/>
+      </w:pPr>
+    </w:p>
+    <w:tbl>
+      <w:tblPr>
+        <w:tblW w:type="auto" w:w="0"/>
+        <w:jc w:val="left"/>
+        <w:tblLook w:firstColumn="1" w:firstRow="1" w:lastColumn="0" w:lastRow="0" w:noHBand="0" w:noVBand="1" w:val="04A0"/>
+      </w:tblPr>
+      <w:tblGrid>
+        <w:gridCol w:w="4819"/>
+        <w:gridCol w:w="4819"/>
+      </w:tblGrid>
+      <w:tr>
+        <w:tc>
+          <w:tcPr>
+            <w:tcW w:type="dxa" w:w="907"/>
+            <w:shd w:val="clear" w:color="auto" w:fill="177FBA"/>
+            <w:tcBorders>
+              <w:top w:val="nil"/>
+              <w:left w:val="nil"/>
+              <w:bottom w:val="nil"/>
+              <w:right w:val="nil"/>
+              <w:insideH w:val="nil"/>
+              <w:insideV w:val="nil"/>
+            </w:tcBorders>
+          </w:tcPr>
+          <w:p>
+            <w:pPr>
+              <w:spacing w:before="120" w:after="40"/>
+              <w:jc w:val="center"/>
+            </w:pPr>
+            <w:r>
+              <w:rPr>
+                <w:b/>
+                <w:i w:val="0"/>
+                <w:color w:val="FFFFCC"/>
+                <w:sz w:val="12"/>
+              </w:rPr>
+              <w:t>STAP</w:t>
+            </w:r>
+          </w:p>
+          <w:p>
+            <w:pPr>
+              <w:spacing w:before="0" w:after="120"/>
+              <w:jc w:val="center"/>
+            </w:pPr>
+            <w:r>
+              <w:rPr>
+                <w:b/>
+                <w:i w:val="0"/>
+                <w:color w:val="FFFFFF"/>
+                <w:sz w:val="22"/>
+              </w:rPr>
+              <w:t>2</w:t>
+            </w:r>
+          </w:p>
+        </w:tc>
+        <w:tc>
+          <w:tcPr>
+            <w:tcW w:type="dxa" w:w="4819"/>
+            <w:shd w:val="clear" w:color="auto" w:fill="ECF5FD"/>
+            <w:tcBorders>
+              <w:top w:val="nil"/>
+              <w:left w:val="nil"/>
+              <w:bottom w:val="nil"/>
+              <w:right w:val="nil"/>
+              <w:insideH w:val="nil"/>
+              <w:insideV w:val="nil"/>
+            </w:tcBorders>
+          </w:tcPr>
+          <w:p>
+            <w:pPr>
+              <w:spacing w:before="100" w:after="40"/>
+              <w:ind w:left="170"/>
+            </w:pPr>
+            <w:r>
+              <w:rPr>
+                <w:b/>
+                <w:i w:val="0"/>
+                <w:color w:val="177FBA"/>
+                <w:sz w:val="21"/>
+              </w:rPr>
+              <w:t>Voer een nulmeting uit vóórdat u de tool breed uitrolt</w:t>
+            </w:r>
+          </w:p>
+          <w:p>
+            <w:pPr>
+              <w:spacing w:before="0" w:after="20"/>
+              <w:ind w:left="283" w:hanging="227"/>
+            </w:pPr>
+            <w:r>
+              <w:rPr>
+                <w:b/>
+                <w:i w:val="0"/>
+                <w:color w:val="177FBA"/>
+                <w:sz w:val="18"/>
+              </w:rPr>
+              <w:t xml:space="preserve">▸  </w:t>
+            </w:r>
+            <w:r>
+              <w:rPr>
+                <w:b w:val="0"/>
+                <w:i w:val="0"/>
+                <w:color w:val="3A3A3A"/>
+                <w:sz w:val="18"/>
+              </w:rPr>
+              <w:t>Meet hoeveel uur per week uw medewerkers nu besteden aan de taak die de tool gaat overnemen</w:t>
+            </w:r>
+          </w:p>
+          <w:p>
+            <w:pPr>
+              <w:spacing w:before="0" w:after="20"/>
+              <w:ind w:left="283" w:hanging="227"/>
+            </w:pPr>
+            <w:r>
+              <w:rPr>
+                <w:b/>
+                <w:i w:val="0"/>
+                <w:color w:val="177FBA"/>
+                <w:sz w:val="18"/>
+              </w:rPr>
+              <w:t xml:space="preserve">▸  </w:t>
+            </w:r>
+            <w:r>
+              <w:rPr>
+                <w:b w:val="0"/>
+                <w:i w:val="0"/>
+                <w:color w:val="3A3A3A"/>
+                <w:sz w:val="18"/>
+              </w:rPr>
+              <w:t>Sla deze meting op met datum, methode en steekproefgrootte — dit is uw baseline</w:t>
+            </w:r>
+          </w:p>
+          <w:p>
+            <w:pPr>
+              <w:spacing w:before="0" w:after="20"/>
+              <w:ind w:left="283" w:hanging="227"/>
+            </w:pPr>
+            <w:r>
+              <w:rPr>
+                <w:b/>
+                <w:i w:val="0"/>
+                <w:color w:val="177FBA"/>
+                <w:sz w:val="18"/>
+              </w:rPr>
+              <w:t xml:space="preserve">▸  </w:t>
+            </w:r>
+            <w:r>
+              <w:rPr>
+                <w:b w:val="0"/>
+                <w:i w:val="0"/>
+                <w:color w:val="3A3A3A"/>
+                <w:sz w:val="18"/>
+              </w:rPr>
+              <w:t>Herhaal de meting na 6 en 12 maanden voor de mijlpaalbewijs</w:t>
+            </w:r>
+          </w:p>
+          <w:p>
+            <w:pPr>
+              <w:spacing w:after="80"/>
+            </w:pPr>
+          </w:p>
+        </w:tc>
+      </w:tr>
+    </w:tbl>
+    <w:p>
+      <w:pPr>
+        <w:spacing w:after="60"/>
+      </w:pPr>
+    </w:p>
+    <w:tbl>
+      <w:tblPr>
+        <w:tblW w:type="auto" w:w="0"/>
+        <w:jc w:val="left"/>
+        <w:tblLook w:firstColumn="1" w:firstRow="1" w:lastColumn="0" w:lastRow="0" w:noHBand="0" w:noVBand="1" w:val="04A0"/>
+      </w:tblPr>
+      <w:tblGrid>
+        <w:gridCol w:w="4819"/>
+        <w:gridCol w:w="4819"/>
+      </w:tblGrid>
+      <w:tr>
+        <w:tc>
+          <w:tcPr>
+            <w:tcW w:type="dxa" w:w="907"/>
+            <w:shd w:val="clear" w:color="auto" w:fill="1E7E34"/>
+            <w:tcBorders>
+              <w:top w:val="nil"/>
+              <w:left w:val="nil"/>
+              <w:bottom w:val="nil"/>
+              <w:right w:val="nil"/>
+              <w:insideH w:val="nil"/>
+              <w:insideV w:val="nil"/>
+            </w:tcBorders>
+          </w:tcPr>
+          <w:p>
+            <w:pPr>
+              <w:spacing w:before="120" w:after="40"/>
+              <w:jc w:val="center"/>
+            </w:pPr>
+            <w:r>
+              <w:rPr>
+                <w:b/>
+                <w:i w:val="0"/>
+                <w:color w:val="FFFFCC"/>
+                <w:sz w:val="12"/>
+              </w:rPr>
+              <w:t>STAP</w:t>
+            </w:r>
+          </w:p>
+          <w:p>
+            <w:pPr>
+              <w:spacing w:before="0" w:after="120"/>
+              <w:jc w:val="center"/>
+            </w:pPr>
+            <w:r>
+              <w:rPr>
+                <w:b/>
+                <w:i w:val="0"/>
+                <w:color w:val="FFFFFF"/>
+                <w:sz w:val="22"/>
+              </w:rPr>
+              <w:t>3</w:t>
+            </w:r>
+          </w:p>
+        </w:tc>
+        <w:tc>
+          <w:tcPr>
+            <w:tcW w:type="dxa" w:w="4819"/>
+            <w:shd w:val="clear" w:color="auto" w:fill="ECF5FD"/>
+            <w:tcBorders>
+              <w:top w:val="nil"/>
+              <w:left w:val="nil"/>
+              <w:bottom w:val="nil"/>
+              <w:right w:val="nil"/>
+              <w:insideH w:val="nil"/>
+              <w:insideV w:val="nil"/>
+            </w:tcBorders>
+          </w:tcPr>
+          <w:p>
+            <w:pPr>
+              <w:spacing w:before="100" w:after="40"/>
+              <w:ind w:left="170"/>
+            </w:pPr>
+            <w:r>
+              <w:rPr>
+                <w:b/>
+                <w:i w:val="0"/>
+                <w:color w:val="1E7E34"/>
+                <w:sz w:val="21"/>
+              </w:rPr>
+              <w:t>Regel privacy en beveiliging (DPIA + verwerkersovereenkomst)</w:t>
+            </w:r>
+          </w:p>
+          <w:p>
+            <w:pPr>
+              <w:spacing w:before="0" w:after="20"/>
+              <w:ind w:left="283" w:hanging="227"/>
+            </w:pPr>
+            <w:r>
+              <w:rPr>
+                <w:b/>
+                <w:i w:val="0"/>
+                <w:color w:val="1E7E34"/>
+                <w:sz w:val="18"/>
+              </w:rPr>
+              <w:t xml:space="preserve">▸  </w:t>
+            </w:r>
+            <w:r>
+              <w:rPr>
+                <w:b w:val="0"/>
+                <w:i w:val="0"/>
+                <w:color w:val="3A3A3A"/>
+                <w:sz w:val="18"/>
+              </w:rPr>
+              <w:t>Als uw tool patiëntdata verwerkt: voer een DPIA uit (verplicht bij AI en bijzondere persoonsgegevens)</w:t>
+            </w:r>
+          </w:p>
+          <w:p>
+            <w:pPr>
+              <w:spacing w:before="0" w:after="20"/>
+              <w:ind w:left="283" w:hanging="227"/>
+            </w:pPr>
+            <w:r>
+              <w:rPr>
+                <w:b/>
+                <w:i w:val="0"/>
+                <w:color w:val="1E7E34"/>
+                <w:sz w:val="18"/>
+              </w:rPr>
+              <w:t xml:space="preserve">▸  </w:t>
+            </w:r>
+            <w:r>
+              <w:rPr>
+                <w:b w:val="0"/>
+                <w:i w:val="0"/>
+                <w:color w:val="3A3A3A"/>
+                <w:sz w:val="18"/>
+              </w:rPr>
+              <w:t>Sluit een verwerkersovereenkomst met alle externe partijen (bijv. AI API-aanbieder zoals Anthropic/Azure/AWS)</w:t>
+            </w:r>
+          </w:p>
+          <w:p>
+            <w:pPr>
+              <w:spacing w:before="0" w:after="20"/>
+              <w:ind w:left="283" w:hanging="227"/>
+            </w:pPr>
+            <w:r>
+              <w:rPr>
+                <w:b/>
+                <w:i w:val="0"/>
+                <w:color w:val="1E7E34"/>
+                <w:sz w:val="18"/>
+              </w:rPr>
+              <w:t xml:space="preserve">▸  </w:t>
+            </w:r>
+            <w:r>
+              <w:rPr>
+                <w:b w:val="0"/>
+                <w:i w:val="0"/>
+                <w:color w:val="3A3A3A"/>
+                <w:sz w:val="18"/>
+              </w:rPr>
+              <w:t>Zorg dat patiëntdata op Europese servers blijft — controleer de servicevoorwaarden van uw AI-provider</w:t>
+            </w:r>
+          </w:p>
+          <w:p>
+            <w:pPr>
+              <w:spacing w:before="0" w:after="20"/>
+              <w:ind w:left="283" w:hanging="227"/>
+            </w:pPr>
+            <w:r>
+              <w:rPr>
+                <w:b/>
+                <w:i w:val="0"/>
+                <w:color w:val="1E7E34"/>
+                <w:sz w:val="18"/>
+              </w:rPr>
+              <w:t xml:space="preserve">▸  </w:t>
+            </w:r>
+            <w:r>
+              <w:rPr>
+                <w:b w:val="0"/>
+                <w:i w:val="0"/>
+                <w:color w:val="3A3A3A"/>
+                <w:sz w:val="18"/>
+              </w:rPr>
+              <w:t>Controleer of uw tool voldoet aan NEN 7510 (informatiebeveiliging in de zorg)</w:t>
+            </w:r>
+          </w:p>
+          <w:p>
+            <w:pPr>
+              <w:spacing w:after="80"/>
+            </w:pPr>
+          </w:p>
+        </w:tc>
+      </w:tr>
+    </w:tbl>
+    <w:p>
+      <w:pPr>
+        <w:spacing w:after="60"/>
+      </w:pPr>
+    </w:p>
+    <w:tbl>
+      <w:tblPr>
+        <w:tblW w:type="auto" w:w="0"/>
+        <w:jc w:val="left"/>
+        <w:tblLook w:firstColumn="1" w:firstRow="1" w:lastColumn="0" w:lastRow="0" w:noHBand="0" w:noVBand="1" w:val="04A0"/>
+      </w:tblPr>
+      <w:tblGrid>
+        <w:gridCol w:w="4819"/>
+        <w:gridCol w:w="4819"/>
+      </w:tblGrid>
+      <w:tr>
+        <w:tc>
+          <w:tcPr>
+            <w:tcW w:type="dxa" w:w="907"/>
+            <w:shd w:val="clear" w:color="auto" w:fill="D45600"/>
+            <w:tcBorders>
+              <w:top w:val="nil"/>
+              <w:left w:val="nil"/>
+              <w:bottom w:val="nil"/>
+              <w:right w:val="nil"/>
+              <w:insideH w:val="nil"/>
+              <w:insideV w:val="nil"/>
+            </w:tcBorders>
+          </w:tcPr>
+          <w:p>
+            <w:pPr>
+              <w:spacing w:before="120" w:after="40"/>
+              <w:jc w:val="center"/>
+            </w:pPr>
+            <w:r>
+              <w:rPr>
+                <w:b/>
+                <w:i w:val="0"/>
+                <w:color w:val="FFFFCC"/>
+                <w:sz w:val="12"/>
+              </w:rPr>
+              <w:t>STAP</w:t>
+            </w:r>
+          </w:p>
+          <w:p>
+            <w:pPr>
+              <w:spacing w:before="0" w:after="120"/>
+              <w:jc w:val="center"/>
+            </w:pPr>
+            <w:r>
+              <w:rPr>
+                <w:b/>
+                <w:i w:val="0"/>
+                <w:color w:val="FFFFFF"/>
+                <w:sz w:val="22"/>
+              </w:rPr>
+              <w:t>4</w:t>
+            </w:r>
+          </w:p>
+        </w:tc>
+        <w:tc>
+          <w:tcPr>
+            <w:tcW w:type="dxa" w:w="4819"/>
+            <w:shd w:val="clear" w:color="auto" w:fill="ECF5FD"/>
+            <w:tcBorders>
+              <w:top w:val="nil"/>
+              <w:left w:val="nil"/>
+              <w:bottom w:val="nil"/>
+              <w:right w:val="nil"/>
+              <w:insideH w:val="nil"/>
+              <w:insideV w:val="nil"/>
+            </w:tcBorders>
+          </w:tcPr>
+          <w:p>
+            <w:pPr>
+              <w:spacing w:before="100" w:after="40"/>
+              <w:ind w:left="170"/>
+            </w:pPr>
+            <w:r>
+              <w:rPr>
+                <w:b/>
+                <w:i w:val="0"/>
+                <w:color w:val="D45600"/>
+                <w:sz w:val="21"/>
+              </w:rPr>
+              <w:t>Overweeg Digizo.nu-toetsing of externe validatie</w:t>
+            </w:r>
+          </w:p>
+          <w:p>
+            <w:pPr>
+              <w:spacing w:before="0" w:after="20"/>
+              <w:ind w:left="283" w:hanging="227"/>
+            </w:pPr>
+            <w:r>
+              <w:rPr>
+                <w:b/>
+                <w:i w:val="0"/>
+                <w:color w:val="D45600"/>
+                <w:sz w:val="18"/>
+              </w:rPr>
+              <w:t xml:space="preserve">▸  </w:t>
+            </w:r>
+            <w:r>
+              <w:rPr>
+                <w:b w:val="0"/>
+                <w:i w:val="0"/>
+                <w:color w:val="3A3A3A"/>
+                <w:sz w:val="18"/>
+              </w:rPr>
+              <w:t>Een Digizo.nu-goedkeuring is het sterkste bewijs van effectiviteit — vraag een intake aan</w:t>
+            </w:r>
+          </w:p>
+          <w:p>
+            <w:pPr>
+              <w:spacing w:before="0" w:after="20"/>
+              <w:ind w:left="283" w:hanging="227"/>
+            </w:pPr>
+            <w:r>
+              <w:rPr>
+                <w:b/>
+                <w:i w:val="0"/>
+                <w:color w:val="D45600"/>
+                <w:sz w:val="18"/>
+              </w:rPr>
+              <w:t xml:space="preserve">▸  </w:t>
+            </w:r>
+            <w:r>
+              <w:rPr>
+                <w:b w:val="0"/>
+                <w:i w:val="0"/>
+                <w:color w:val="3A3A3A"/>
+                <w:sz w:val="18"/>
+              </w:rPr>
+              <w:t>Alternatieven: laat de effectiviteit bevestigen door een onafhankelijke externe partij (ZonMw, Nivel, universiteit)</w:t>
+            </w:r>
+          </w:p>
+          <w:p>
+            <w:pPr>
+              <w:spacing w:before="0" w:after="20"/>
+              <w:ind w:left="283" w:hanging="227"/>
+            </w:pPr>
+            <w:r>
+              <w:rPr>
+                <w:b/>
+                <w:i w:val="0"/>
+                <w:color w:val="D45600"/>
+                <w:sz w:val="18"/>
+              </w:rPr>
+              <w:t xml:space="preserve">▸  </w:t>
+            </w:r>
+            <w:r>
+              <w:rPr>
+                <w:b w:val="0"/>
+                <w:i w:val="0"/>
+                <w:color w:val="3A3A3A"/>
+                <w:sz w:val="18"/>
+              </w:rPr>
+              <w:t>Als de tool al bij meerdere poli's/afdelingen in gebruik is: documenteer dit als multi-site bewijs</w:t>
+            </w:r>
+          </w:p>
+          <w:p>
+            <w:pPr>
+              <w:spacing w:before="0" w:after="20"/>
+              <w:ind w:left="283" w:hanging="227"/>
+            </w:pPr>
+            <w:r>
+              <w:rPr>
+                <w:b/>
+                <w:i w:val="0"/>
+                <w:color w:val="D45600"/>
+                <w:sz w:val="18"/>
+              </w:rPr>
+              <w:t xml:space="preserve">▸  </w:t>
+            </w:r>
+            <w:r>
+              <w:rPr>
+                <w:b w:val="0"/>
+                <w:i w:val="0"/>
+                <w:color w:val="3A3A3A"/>
+                <w:sz w:val="18"/>
+              </w:rPr>
+              <w:t>Vraag uw brancheorganisatie (NVZ, FMS) of zij de tool kunnen valideren of erkennen</w:t>
+            </w:r>
+          </w:p>
+          <w:p>
+            <w:pPr>
+              <w:spacing w:after="80"/>
+            </w:pPr>
+          </w:p>
+        </w:tc>
+      </w:tr>
+    </w:tbl>
+    <w:p>
+      <w:pPr>
+        <w:spacing w:after="60"/>
+      </w:pPr>
+    </w:p>
+    <w:tbl>
+      <w:tblPr>
+        <w:tblW w:type="auto" w:w="0"/>
+        <w:jc w:val="left"/>
+        <w:tblLook w:firstColumn="1" w:firstRow="1" w:lastColumn="0" w:lastRow="0" w:noHBand="0" w:noVBand="1" w:val="04A0"/>
+      </w:tblPr>
+      <w:tblGrid>
+        <w:gridCol w:w="4819"/>
+        <w:gridCol w:w="4819"/>
+      </w:tblGrid>
+      <w:tr>
+        <w:tc>
+          <w:tcPr>
+            <w:tcW w:type="dxa" w:w="907"/>
+            <w:shd w:val="clear" w:color="auto" w:fill="5A2D91"/>
+            <w:tcBorders>
+              <w:top w:val="nil"/>
+              <w:left w:val="nil"/>
+              <w:bottom w:val="nil"/>
+              <w:right w:val="nil"/>
+              <w:insideH w:val="nil"/>
+              <w:insideV w:val="nil"/>
+            </w:tcBorders>
+          </w:tcPr>
+          <w:p>
+            <w:pPr>
+              <w:spacing w:before="120" w:after="40"/>
+              <w:jc w:val="center"/>
+            </w:pPr>
+            <w:r>
+              <w:rPr>
+                <w:b/>
+                <w:i w:val="0"/>
+                <w:color w:val="FFFFCC"/>
+                <w:sz w:val="12"/>
+              </w:rPr>
+              <w:t>STAP</w:t>
+            </w:r>
+          </w:p>
+          <w:p>
+            <w:pPr>
+              <w:spacing w:before="0" w:after="120"/>
+              <w:jc w:val="center"/>
+            </w:pPr>
+            <w:r>
+              <w:rPr>
+                <w:b/>
+                <w:i w:val="0"/>
+                <w:color w:val="FFFFFF"/>
+                <w:sz w:val="22"/>
+              </w:rPr>
+              <w:t>5</w:t>
+            </w:r>
+          </w:p>
+        </w:tc>
+        <w:tc>
+          <w:tcPr>
+            <w:tcW w:type="dxa" w:w="4819"/>
+            <w:shd w:val="clear" w:color="auto" w:fill="ECF5FD"/>
+            <w:tcBorders>
+              <w:top w:val="nil"/>
+              <w:left w:val="nil"/>
+              <w:bottom w:val="nil"/>
+              <w:right w:val="nil"/>
+              <w:insideH w:val="nil"/>
+              <w:insideV w:val="nil"/>
+            </w:tcBorders>
+          </w:tcPr>
+          <w:p>
+            <w:pPr>
+              <w:spacing w:before="100" w:after="40"/>
+              <w:ind w:left="170"/>
+            </w:pPr>
+            <w:r>
+              <w:rPr>
+                <w:b/>
+                <w:i w:val="0"/>
+                <w:color w:val="5A2D91"/>
+                <w:sz w:val="21"/>
+              </w:rPr>
+              <w:t>Bespreek uw specifieke situatie met uw zorgverzekeraar</w:t>
+            </w:r>
+          </w:p>
+          <w:p>
+            <w:pPr>
+              <w:spacing w:before="0" w:after="20"/>
+              <w:ind w:left="283" w:hanging="227"/>
+            </w:pPr>
+            <w:r>
+              <w:rPr>
+                <w:b/>
+                <w:i w:val="0"/>
+                <w:color w:val="5A2D91"/>
+                <w:sz w:val="18"/>
+              </w:rPr>
+              <w:t xml:space="preserve">▸  </w:t>
+            </w:r>
+            <w:r>
+              <w:rPr>
+                <w:b w:val="0"/>
+                <w:i w:val="0"/>
+                <w:color w:val="3A3A3A"/>
+                <w:sz w:val="18"/>
+              </w:rPr>
+              <w:t>Maak vóór 1 december 2026 een oriëntatiegesprek — leg uw specifieke tool en situatie voor</w:t>
+            </w:r>
+          </w:p>
+          <w:p>
+            <w:pPr>
+              <w:spacing w:before="0" w:after="20"/>
+              <w:ind w:left="283" w:hanging="227"/>
+            </w:pPr>
+            <w:r>
+              <w:rPr>
+                <w:b/>
+                <w:i w:val="0"/>
+                <w:color w:val="5A2D91"/>
+                <w:sz w:val="18"/>
+              </w:rPr>
+              <w:t xml:space="preserve">▸  </w:t>
+            </w:r>
+            <w:r>
+              <w:rPr>
+                <w:b w:val="0"/>
+                <w:i w:val="0"/>
+                <w:color w:val="3A3A3A"/>
+                <w:sz w:val="18"/>
+              </w:rPr>
+              <w:t>Vraag expliciet of een intern gebouwde tool in aanmerking komt en welke aanvullende documenten vereist zijn</w:t>
+            </w:r>
+          </w:p>
+          <w:p>
+            <w:pPr>
+              <w:spacing w:before="0" w:after="20"/>
+              <w:ind w:left="283" w:hanging="227"/>
+            </w:pPr>
+            <w:r>
+              <w:rPr>
+                <w:b/>
+                <w:i w:val="0"/>
+                <w:color w:val="5A2D91"/>
+                <w:sz w:val="18"/>
+              </w:rPr>
+              <w:t xml:space="preserve">▸  </w:t>
+            </w:r>
+            <w:r>
+              <w:rPr>
+                <w:b w:val="0"/>
+                <w:i w:val="0"/>
+                <w:color w:val="3A3A3A"/>
+                <w:sz w:val="18"/>
+              </w:rPr>
+              <w:t>Vraag naar het aanvraagformat en de standaardbedragen voor MP01 in uw regio</w:t>
+            </w:r>
+          </w:p>
+          <w:p>
+            <w:pPr>
+              <w:spacing w:before="0" w:after="20"/>
+              <w:ind w:left="283" w:hanging="227"/>
+            </w:pPr>
+            <w:r>
+              <w:rPr>
+                <w:b/>
+                <w:i w:val="0"/>
+                <w:color w:val="5A2D91"/>
+                <w:sz w:val="18"/>
+              </w:rPr>
+              <w:t xml:space="preserve">▸  </w:t>
+            </w:r>
+            <w:r>
+              <w:rPr>
+                <w:b w:val="0"/>
+                <w:i w:val="0"/>
+                <w:color w:val="3A3A3A"/>
+                <w:sz w:val="18"/>
+              </w:rPr>
+              <w:t>Leg alle afspraken schriftelijk vast — mondeling toezeggingen zijn onvoldoende</w:t>
+            </w:r>
+          </w:p>
+          <w:p>
+            <w:pPr>
+              <w:spacing w:after="80"/>
+            </w:pPr>
+          </w:p>
+        </w:tc>
+      </w:tr>
+    </w:tbl>
+    <w:p>
+      <w:pPr>
+        <w:spacing w:after="60"/>
+      </w:pPr>
+    </w:p>
+    <w:tbl>
+      <w:tblPr>
+        <w:tblW w:type="auto" w:w="0"/>
+        <w:jc w:val="left"/>
+        <w:tblLook w:firstColumn="1" w:firstRow="1" w:lastColumn="0" w:lastRow="0" w:noHBand="0" w:noVBand="1" w:val="04A0"/>
+      </w:tblPr>
+      <w:tblGrid>
+        <w:gridCol w:w="9638"/>
+      </w:tblGrid>
+      <w:tr>
+        <w:tc>
+          <w:tcPr>
+            <w:tcW w:type="dxa" w:w="9638"/>
+            <w:shd w:val="clear" w:color="auto" w:fill="856404"/>
+            <w:tcBorders>
+              <w:top w:val="nil"/>
+              <w:left w:val="nil"/>
+              <w:bottom w:val="nil"/>
+              <w:right w:val="nil"/>
+              <w:insideH w:val="nil"/>
+              <w:insideV w:val="nil"/>
+            </w:tcBorders>
+          </w:tcPr>
+          <w:p>
+            <w:pPr>
+              <w:spacing w:before="100" w:after="100"/>
+              <w:ind w:left="227"/>
+            </w:pPr>
+            <w:r>
+              <w:rPr>
+                <w:b/>
+                <w:color w:val="FFFFFF"/>
+                <w:sz w:val="22"/>
+              </w:rPr>
+              <w:t>⚠  Belangrijk: Additionaliteit — de tool mag nog niet volledig betaald zijn</w:t>
+            </w:r>
+          </w:p>
+        </w:tc>
+      </w:tr>
+      <w:tr>
+        <w:tc>
+          <w:tcPr>
+            <w:tcW w:type="dxa" w:w="9638"/>
+            <w:shd w:val="clear" w:color="auto" w:fill="FFF3CD"/>
+            <w:tcBorders>
+              <w:top w:val="nil"/>
+              <w:left w:val="nil"/>
+              <w:bottom w:val="nil"/>
+              <w:right w:val="nil"/>
+              <w:insideH w:val="nil"/>
+              <w:insideV w:val="nil"/>
+            </w:tcBorders>
+          </w:tcPr>
+          <w:p/>
+          <w:p>
+            <w:pPr>
+              <w:spacing w:before="20" w:after="40"/>
+              <w:ind w:left="283" w:hanging="227"/>
+            </w:pPr>
+            <w:r>
+              <w:rPr>
+                <w:b/>
+                <w:color w:val="856404"/>
+                <w:sz w:val="20"/>
+              </w:rPr>
+              <w:t xml:space="preserve">▸  </w:t>
+            </w:r>
+            <w:r>
+              <w:rPr>
+                <w:color w:val="3A3A3A"/>
+                <w:sz w:val="20"/>
+              </w:rPr>
+              <w:t>De doorbraakmiddelen zijn ALLEEN bestemd voor kosten die nog niet zijn gemaakt. Als u de tool al volledig heeft gebouwd en in gebruik heeft, kunt u de ontwikkelkosten NIET meer opvoeren — die zijn al betaald.</w:t>
+            </w:r>
+          </w:p>
+          <w:p>
+            <w:pPr>
+              <w:spacing w:before="20" w:after="40"/>
+              <w:ind w:left="283" w:hanging="227"/>
+            </w:pPr>
+            <w:r>
+              <w:rPr>
+                <w:b/>
+                <w:color w:val="856404"/>
+                <w:sz w:val="20"/>
+              </w:rPr>
+              <w:t xml:space="preserve">▸  </w:t>
+            </w:r>
+            <w:r>
+              <w:rPr>
+                <w:color w:val="3A3A3A"/>
+                <w:sz w:val="20"/>
+              </w:rPr>
+              <w:t>Wat wél mogelijk is: de implementatiekosten (uitrol, training, integratie), doorontwikkelkosten (nieuwe modules, uitbreiding naar andere afdelingen) en licentiekosten voor AI-API's in 2027-2029.</w:t>
+            </w:r>
+          </w:p>
+          <w:p>
+            <w:pPr>
+              <w:spacing w:before="20" w:after="40"/>
+              <w:ind w:left="283" w:hanging="227"/>
+            </w:pPr>
+            <w:r>
+              <w:rPr>
+                <w:b/>
+                <w:color w:val="856404"/>
+                <w:sz w:val="20"/>
+              </w:rPr>
+              <w:t xml:space="preserve">▸  </w:t>
+            </w:r>
+            <w:r>
+              <w:rPr>
+                <w:color w:val="3A3A3A"/>
+                <w:sz w:val="20"/>
+              </w:rPr>
+              <w:t>Breid de tool bewust uit naar nieuwe afdelingen of functionaliteiten na toekenning — dit creëert additionele kosten die wél in aanmerking komen.</w:t>
+            </w:r>
+          </w:p>
+          <w:p>
+            <w:pPr>
+              <w:spacing w:before="20" w:after="40"/>
+              <w:ind w:left="283" w:hanging="227"/>
+            </w:pPr>
+            <w:r>
+              <w:rPr>
+                <w:b/>
+                <w:color w:val="856404"/>
+                <w:sz w:val="20"/>
+              </w:rPr>
+              <w:t xml:space="preserve">▸  </w:t>
+            </w:r>
+            <w:r>
+              <w:rPr>
+                <w:color w:val="3A3A3A"/>
+                <w:sz w:val="20"/>
+              </w:rPr>
+              <w:t>Tip: Laat de 'fase 2 uitrol' (schaalvergroting naar andere poli's, afdelingen of locaties) als het te financieren onderdeel vallen binnen de implementatieperiode 2027-2029.</w:t>
             </w:r>
           </w:p>
           <w:p>

</xml_diff>

<commit_message>
Herschrijf praktijkcases naar ICM-medewerker perspectief
Sectie volledig herschreven voor specifieke situatie: medewerker
integraal capaciteitsmanagement die intern een AI-rastertool bouwt
voor tactische plan adviseurs om poli-roosters mee te maken.

Nieuw: tijdlijn aug-dec 2026, nulmeting stappenplan, wat wel/niet
gefinancierd kan worden, privacy-check voor AI-API gebruik en
concreet 5-staps actieplan.

Co-Authored-By: Claude Sonnet 4.6 <noreply@anthropic.com>
Claude-Session: https://claude.ai/code/session_012znAQmFZmmdfa2M9oCwLrZ
</commit_message>
<xml_diff>
--- a/Samenvatting_Modelplannen_Doorbraakmiddelen_2026_uitgebreid.docx
+++ b/Samenvatting_Modelplannen_Doorbraakmiddelen_2026_uitgebreid.docx
@@ -13507,7 +13507,7 @@
     </w:p>
     <w:p>
       <w:pPr>
-        <w:spacing w:before="80" w:after="120"/>
+        <w:spacing w:before="80" w:after="80"/>
       </w:pPr>
       <w:r>
         <w:rPr>
@@ -13515,12 +13515,12 @@
           <w:color w:val="004787"/>
           <w:sz w:val="30"/>
         </w:rPr>
-        <w:t>◆  Praktijkcase: Zelf AI-tools Bouwen voor de Zorgorganisatie</w:t>
+        <w:t>◆  Praktijkcase: ICM-medewerker Bouwt AI-Rastertool</w:t>
       </w:r>
     </w:p>
     <w:p>
       <w:pPr>
-        <w:spacing w:before="0" w:after="160"/>
+        <w:spacing w:before="0" w:after="120"/>
         <w:jc w:val="left"/>
       </w:pPr>
       <w:r>
@@ -13530,7 +13530,7 @@
           <w:color w:val="3A3A3A"/>
           <w:sz w:val="20"/>
         </w:rPr>
-        <w:t>Steeds meer ziekenhuizen en zorginstellingen bouwen zelf AI-toepassingen — met tools als Claude, Python of Power BI — om interne processen te verbeteren. Dit roept een praktische vraag op: valt een zelf gebouwde tool ook onder de doorbraakmiddelen modelplannen? En zo ja: hoe zorg je dan dat je wél in aanmerking komt? Hieronder drie concrete voorbeelden uit de ziekenhuispraktijk.</w:t>
+        <w:t>Deze sectie beschrijft een concrete situatie vanuit de ziekenhuispraktijk: een medewerker van de afdeling Integraal Capaciteitsmanagement (ICM) die zelf een AI-dashboard bouwt voor rasterplanning per polikliniek. De tool is nog in ontwikkeling maar is er op gericht om door een tactische plan adviseur te worden gebruikt voor het samenstellen van roosters voor alle poli's. Hieronder staat uitgewerkt hoe je deze situatie optimaal positioneert voor de doorbraakmiddelen — inclusief tijdlijn, wat je nú moet doen, wat gefinancierd kan worden en wat niet.</w:t>
       </w:r>
     </w:p>
     <w:p>
@@ -13543,21 +13543,7 @@
           <w:color w:val="004787"/>
           <w:sz w:val="24"/>
         </w:rPr>
-        <w:t>Case 1 — AI Rasterplanning voor de Polikliniek</w:t>
-      </w:r>
-    </w:p>
-    <w:p>
-      <w:pPr>
-        <w:spacing w:before="0" w:after="120"/>
-      </w:pPr>
-      <w:r>
-        <w:rPr>
-          <w:b w:val="0"/>
-          <w:i w:val="0"/>
-          <w:color w:val="3A3A3A"/>
-          <w:sz w:val="20"/>
-        </w:rPr>
-        <w:t>Een internist bouwt samen met de ICT-afdeling een rasterplanning-tool met AI voor de eigen polikliniek. De tool analyseert historische afspraakendata, beschikbaarheid van specialisten en behandelkamers, en genereert vervolgens automatisch een geoptimaliseerd weekrooster. Planners kunnen dit rooster handmatig aanpassen en de tool leert mee. De poli gaat de tool structureel gebruiken om het wekelijks raster efficiënter en sneller op te stellen.</w:t>
+        <w:t>De situatie: wie, wat en waar?</w:t>
       </w:r>
     </w:p>
     <w:tbl>
@@ -13623,7 +13609,7 @@
                 <w:color w:val="FFFFFF"/>
                 <w:sz w:val="18"/>
               </w:rPr>
-              <w:t>Uitwerking</w:t>
+              <w:t>Jouw situatie</w:t>
             </w:r>
           </w:p>
         </w:tc>
@@ -13653,7 +13639,7 @@
                 <w:color w:val="3A3A3A"/>
                 <w:sz w:val="19"/>
               </w:rPr>
-              <w:t>Modelplan</w:t>
+              <w:t>Functie</w:t>
             </w:r>
           </w:p>
         </w:tc>
@@ -13681,7 +13667,7 @@
                 <w:color w:val="3A3A3A"/>
                 <w:sz w:val="19"/>
               </w:rPr>
-              <w:t>MP01 – Capaciteitsplanning met AI (MSZ)</w:t>
+              <w:t>Medewerker Integraal Capaciteitsmanagement (ICM) — in dienst van het ziekenhuis</w:t>
             </w:r>
           </w:p>
         </w:tc>
@@ -13711,7 +13697,7 @@
                 <w:color w:val="3A3A3A"/>
                 <w:sz w:val="19"/>
               </w:rPr>
-              <w:t>Sector</w:t>
+              <w:t>Wat je bouwt</w:t>
             </w:r>
           </w:p>
         </w:tc>
@@ -13739,7 +13725,7 @@
                 <w:color w:val="3A3A3A"/>
                 <w:sz w:val="19"/>
               </w:rPr>
-              <w:t>Medisch Specialistische Zorg (polikliniek valt onder MSZ/Zvw)</w:t>
+              <w:t>AI-dashboard/applicatie voor rasterplanning per polikliniek</w:t>
             </w:r>
           </w:p>
         </w:tc>
@@ -13769,7 +13755,7 @@
                 <w:color w:val="3A3A3A"/>
                 <w:sz w:val="19"/>
               </w:rPr>
-              <w:t>Arbeidsbesparing</w:t>
+              <w:t>Hoe werkt de tool</w:t>
             </w:r>
           </w:p>
         </w:tc>
@@ -13797,7 +13783,7 @@
                 <w:color w:val="3A3A3A"/>
                 <w:sz w:val="19"/>
               </w:rPr>
-              <w:t>Planners besteden nu 4-8 uur/week aan roostering → tool reduceert dit naar &lt; 1 uur</w:t>
+              <w:t>Gebruiker laadt data in of vult parameters in → AI genereert 85% kant-en-klaar rooster → handmatige finetuning van resterende 15%</w:t>
             </w:r>
           </w:p>
         </w:tc>
@@ -13827,7 +13813,7 @@
                 <w:color w:val="3A3A3A"/>
                 <w:sz w:val="19"/>
               </w:rPr>
-              <w:t>Tool type</w:t>
+              <w:t>Wie gebruikt de tool</w:t>
             </w:r>
           </w:p>
         </w:tc>
@@ -13855,7 +13841,7 @@
                 <w:color w:val="3A3A3A"/>
                 <w:sz w:val="19"/>
               </w:rPr>
-              <w:t>Intern gebouwd (bijv. met Python/Claude/Power BI + koppeling aan HIS/EPD)</w:t>
+              <w:t>Tactische plan adviseur — maakt voor iedere poli een rooster</w:t>
             </w:r>
           </w:p>
         </w:tc>
@@ -13885,7 +13871,7 @@
                 <w:color w:val="3A3A3A"/>
                 <w:sz w:val="19"/>
               </w:rPr>
-              <w:t>Voordeel</w:t>
+              <w:t>Status nu</w:t>
             </w:r>
           </w:p>
         </w:tc>
@@ -13913,7 +13899,7 @@
                 <w:color w:val="3A3A3A"/>
                 <w:sz w:val="19"/>
               </w:rPr>
-              <w:t>Sneller rooster, minder fouten, betere spreiding patiëntenstromen</w:t>
+              <w:t>Nog in ontwikkeling — nog niet in productief gebruik</w:t>
             </w:r>
           </w:p>
         </w:tc>
@@ -13943,7 +13929,7 @@
                 <w:color w:val="3A3A3A"/>
                 <w:sz w:val="19"/>
               </w:rPr>
-              <w:t>Risico voor financiering</w:t>
+              <w:t>Doel</w:t>
             </w:r>
           </w:p>
         </w:tc>
@@ -13971,301 +13957,7 @@
                 <w:color w:val="3A3A3A"/>
                 <w:sz w:val="19"/>
               </w:rPr>
-              <w:t>Intern gebouwde tool heeft GEEN automatische Digizo.nu-goedkeuring</w:t>
-            </w:r>
-          </w:p>
-        </w:tc>
-      </w:tr>
-    </w:tbl>
-    <w:p>
-      <w:pPr>
-        <w:spacing w:after="80"/>
-      </w:pPr>
-    </w:p>
-    <w:tbl>
-      <w:tblPr>
-        <w:tblW w:type="auto" w:w="0"/>
-        <w:jc w:val="left"/>
-        <w:tblLook w:firstColumn="1" w:firstRow="1" w:lastColumn="0" w:lastRow="0" w:noHBand="0" w:noVBand="1" w:val="04A0"/>
-      </w:tblPr>
-      <w:tblGrid>
-        <w:gridCol w:w="9638"/>
-      </w:tblGrid>
-      <w:tr>
-        <w:tc>
-          <w:tcPr>
-            <w:tcW w:type="dxa" w:w="9638"/>
-            <w:shd w:val="clear" w:color="auto" w:fill="004787"/>
-            <w:tcBorders>
-              <w:top w:val="nil"/>
-              <w:left w:val="nil"/>
-              <w:bottom w:val="nil"/>
-              <w:right w:val="nil"/>
-              <w:insideH w:val="nil"/>
-              <w:insideV w:val="nil"/>
-            </w:tcBorders>
-          </w:tcPr>
-          <w:p>
-            <w:pPr>
-              <w:spacing w:before="100" w:after="100"/>
-              <w:ind w:left="227"/>
-            </w:pPr>
-            <w:r>
-              <w:rPr>
-                <w:b/>
-                <w:color w:val="FFFFFF"/>
-                <w:sz w:val="22"/>
-              </w:rPr>
-              <w:t>💡  Wat moet je doen om deze rasterplanning tool te laten kwalificeren?</w:t>
-            </w:r>
-          </w:p>
-        </w:tc>
-      </w:tr>
-      <w:tr>
-        <w:tc>
-          <w:tcPr>
-            <w:tcW w:type="dxa" w:w="9638"/>
-            <w:shd w:val="clear" w:color="auto" w:fill="ECF5FD"/>
-            <w:tcBorders>
-              <w:top w:val="nil"/>
-              <w:left w:val="nil"/>
-              <w:bottom w:val="nil"/>
-              <w:right w:val="nil"/>
-              <w:insideH w:val="nil"/>
-              <w:insideV w:val="nil"/>
-            </w:tcBorders>
-          </w:tcPr>
-          <w:p/>
-          <w:p>
-            <w:pPr>
-              <w:spacing w:before="20" w:after="40"/>
-              <w:ind w:left="283" w:hanging="227"/>
-            </w:pPr>
-            <w:r>
-              <w:rPr>
-                <w:b/>
-                <w:color w:val="004787"/>
-                <w:sz w:val="20"/>
-              </w:rPr>
-              <w:t xml:space="preserve">▸  </w:t>
-            </w:r>
-            <w:r>
-              <w:rPr>
-                <w:color w:val="3A3A3A"/>
-                <w:sz w:val="20"/>
-              </w:rPr>
-              <w:t>Documenteer de arbeidsbesparing met een nulmeting (uren per week vóór tool) en nameting (uren na tool).</w:t>
-            </w:r>
-          </w:p>
-          <w:p>
-            <w:pPr>
-              <w:spacing w:before="20" w:after="40"/>
-              <w:ind w:left="283" w:hanging="227"/>
-            </w:pPr>
-            <w:r>
-              <w:rPr>
-                <w:b/>
-                <w:color w:val="004787"/>
-                <w:sz w:val="20"/>
-              </w:rPr>
-              <w:t xml:space="preserve">▸  </w:t>
-            </w:r>
-            <w:r>
-              <w:rPr>
-                <w:color w:val="3A3A3A"/>
-                <w:sz w:val="20"/>
-              </w:rPr>
-              <w:t>Laat de tool toetsen op beveiliging en privacy (DPIA + verwerkersovereenkomst als externe data wordt verwerkt).</w:t>
-            </w:r>
-          </w:p>
-          <w:p>
-            <w:pPr>
-              <w:spacing w:before="20" w:after="40"/>
-              <w:ind w:left="283" w:hanging="227"/>
-            </w:pPr>
-            <w:r>
-              <w:rPr>
-                <w:b/>
-                <w:color w:val="004787"/>
-                <w:sz w:val="20"/>
-              </w:rPr>
-              <w:t xml:space="preserve">▸  </w:t>
-            </w:r>
-            <w:r>
-              <w:rPr>
-                <w:color w:val="3A3A3A"/>
-                <w:sz w:val="20"/>
-              </w:rPr>
-              <w:t>Beschrijf de werking en bewezen effectiviteit in een technisch rapport — dit telt als 'bewijs van effectiviteit'.</w:t>
-            </w:r>
-          </w:p>
-          <w:p>
-            <w:pPr>
-              <w:spacing w:before="20" w:after="40"/>
-              <w:ind w:left="283" w:hanging="227"/>
-            </w:pPr>
-            <w:r>
-              <w:rPr>
-                <w:b/>
-                <w:color w:val="004787"/>
-                <w:sz w:val="20"/>
-              </w:rPr>
-              <w:t xml:space="preserve">▸  </w:t>
-            </w:r>
-            <w:r>
-              <w:rPr>
-                <w:color w:val="3A3A3A"/>
-                <w:sz w:val="20"/>
-              </w:rPr>
-              <w:t>Overleg met uw dominante zorgverzekeraar of de tool voldoet aan hun aanvullende eisen voor MP01.</w:t>
-            </w:r>
-          </w:p>
-          <w:p>
-            <w:pPr>
-              <w:spacing w:before="20" w:after="40"/>
-              <w:ind w:left="283" w:hanging="227"/>
-            </w:pPr>
-            <w:r>
-              <w:rPr>
-                <w:b/>
-                <w:color w:val="004787"/>
-                <w:sz w:val="20"/>
-              </w:rPr>
-              <w:t xml:space="preserve">▸  </w:t>
-            </w:r>
-            <w:r>
-              <w:rPr>
-                <w:color w:val="3A3A3A"/>
-                <w:sz w:val="20"/>
-              </w:rPr>
-              <w:t>Als de tool ook door andere ziekenhuizen/poli's gebruikt gaat worden: overweeg Digizo.nu-toetsing aan te vragen.</w:t>
-            </w:r>
-          </w:p>
-          <w:p>
-            <w:pPr>
-              <w:spacing w:before="20" w:after="40"/>
-              <w:ind w:left="283" w:hanging="227"/>
-            </w:pPr>
-            <w:r>
-              <w:rPr>
-                <w:b/>
-                <w:color w:val="004787"/>
-                <w:sz w:val="20"/>
-              </w:rPr>
-              <w:t xml:space="preserve">▸  </w:t>
-            </w:r>
-            <w:r>
-              <w:rPr>
-                <w:color w:val="3A3A3A"/>
-                <w:sz w:val="20"/>
-              </w:rPr>
-              <w:t>Kosten die in aanmerking komen: ontwikkelkosten (intern of extern), licentiekosten voor AI-API, implementatiekosten.</w:t>
-            </w:r>
-          </w:p>
-          <w:p>
-            <w:pPr>
-              <w:spacing w:after="80"/>
-            </w:pPr>
-          </w:p>
-        </w:tc>
-      </w:tr>
-    </w:tbl>
-    <w:p>
-      <w:pPr>
-        <w:spacing w:after="80"/>
-      </w:pPr>
-    </w:p>
-    <w:p>
-      <w:pPr>
-        <w:spacing w:before="120" w:after="60"/>
-      </w:pPr>
-      <w:r>
-        <w:rPr>
-          <w:b/>
-          <w:color w:val="177FBA"/>
-          <w:sz w:val="24"/>
-        </w:rPr>
-        <w:t>Case 2 — AI Rasterplanning voor de Afdeling Radiologie</w:t>
-      </w:r>
-    </w:p>
-    <w:p>
-      <w:pPr>
-        <w:spacing w:before="0" w:after="120"/>
-      </w:pPr>
-      <w:r>
-        <w:rPr>
-          <w:b w:val="0"/>
-          <w:i w:val="0"/>
-          <w:color w:val="3A3A3A"/>
-          <w:sz w:val="20"/>
-        </w:rPr>
-        <w:t>De afdeling radiologie heeft een eigen AI-rasterplanning-tool ontwikkeld die specifiek rekening houdt met de typische kenmerken van radiologische planning: doorlooptijden per onderzoekstype (MRI, CT, echo, röntgen), bezetting van apparatuur en personeel, spoedonderzoeken versus electieve onderzoeken, en de beschikbaarheid van radiologen en radiodiagnostisch laboranten. De tool combineert deze parameters en genereert dagelijks een geoptimaliseerd rooster per modaliteit.</w:t>
-      </w:r>
-    </w:p>
-    <w:tbl>
-      <w:tblPr>
-        <w:tblW w:type="auto" w:w="0"/>
-        <w:jc w:val="left"/>
-        <w:tblLook w:firstColumn="1" w:firstRow="1" w:lastColumn="0" w:lastRow="0" w:noHBand="0" w:noVBand="1" w:val="04A0"/>
-      </w:tblPr>
-      <w:tblGrid>
-        <w:gridCol w:w="4819"/>
-        <w:gridCol w:w="4819"/>
-      </w:tblGrid>
-      <w:tr>
-        <w:tc>
-          <w:tcPr>
-            <w:tcW w:type="dxa" w:w="4819"/>
-            <w:shd w:val="clear" w:color="auto" w:fill="177FBA"/>
-            <w:tcBorders>
-              <w:top w:val="nil"/>
-              <w:left w:val="nil"/>
-              <w:bottom w:val="nil"/>
-              <w:right w:val="nil"/>
-              <w:insideH w:val="nil"/>
-              <w:insideV w:val="nil"/>
-            </w:tcBorders>
-          </w:tcPr>
-          <w:p>
-            <w:pPr>
-              <w:spacing w:before="60" w:after="60"/>
-              <w:ind w:left="113"/>
-            </w:pPr>
-            <w:r>
-              <w:rPr>
-                <w:b/>
-                <w:color w:val="FFFFFF"/>
-                <w:sz w:val="18"/>
-              </w:rPr>
-              <w:t>Aspect</w:t>
-            </w:r>
-          </w:p>
-        </w:tc>
-        <w:tc>
-          <w:tcPr>
-            <w:tcW w:type="dxa" w:w="4819"/>
-            <w:shd w:val="clear" w:color="auto" w:fill="177FBA"/>
-            <w:tcBorders>
-              <w:top w:val="nil"/>
-              <w:left w:val="nil"/>
-              <w:bottom w:val="nil"/>
-              <w:right w:val="nil"/>
-              <w:insideH w:val="nil"/>
-              <w:insideV w:val="nil"/>
-            </w:tcBorders>
-          </w:tcPr>
-          <w:p>
-            <w:pPr>
-              <w:spacing w:before="60" w:after="60"/>
-              <w:ind w:left="113"/>
-            </w:pPr>
-            <w:r>
-              <w:rPr>
-                <w:b/>
-                <w:color w:val="FFFFFF"/>
-                <w:sz w:val="18"/>
-              </w:rPr>
-              <w:t>Uitwerking</w:t>
+              <w:t>Structurele implementatie in het ziekenhuis voor alle poliklinieken</w:t>
             </w:r>
           </w:p>
         </w:tc>
@@ -14295,7 +13987,7 @@
                 <w:color w:val="3A3A3A"/>
                 <w:sz w:val="19"/>
               </w:rPr>
-              <w:t>Modelplan</w:t>
+              <w:t>Modelplan aansluiting</w:t>
             </w:r>
           </w:p>
         </w:tc>
@@ -14323,470 +14015,8 @@
                 <w:color w:val="3A3A3A"/>
                 <w:sz w:val="19"/>
               </w:rPr>
-              <w:t>MP01 – Capaciteitsplanning met AI (MSZ – radiologie valt onder MSZ/Zvw)</w:t>
-            </w:r>
-          </w:p>
-        </w:tc>
-      </w:tr>
-      <w:tr>
-        <w:tc>
-          <w:tcPr>
-            <w:tcW w:type="dxa" w:w="4819"/>
-            <w:shd w:val="clear" w:color="auto" w:fill="FFFFFF"/>
-            <w:tcBorders>
-              <w:top w:val="nil"/>
-              <w:left w:val="nil"/>
-              <w:bottom w:val="nil"/>
-              <w:right w:val="nil"/>
-              <w:insideH w:val="nil"/>
-              <w:insideV w:val="nil"/>
-            </w:tcBorders>
-          </w:tcPr>
-          <w:p>
-            <w:pPr>
-              <w:spacing w:before="60" w:after="60"/>
-              <w:ind w:left="113"/>
-            </w:pPr>
-            <w:r>
-              <w:rPr>
-                <w:b w:val="0"/>
-                <w:color w:val="3A3A3A"/>
-                <w:sz w:val="19"/>
-              </w:rPr>
-              <w:t>Sector</w:t>
-            </w:r>
-          </w:p>
-        </w:tc>
-        <w:tc>
-          <w:tcPr>
-            <w:tcW w:type="dxa" w:w="4819"/>
-            <w:shd w:val="clear" w:color="auto" w:fill="FFFFFF"/>
-            <w:tcBorders>
-              <w:top w:val="nil"/>
-              <w:left w:val="nil"/>
-              <w:bottom w:val="nil"/>
-              <w:right w:val="nil"/>
-              <w:insideH w:val="nil"/>
-              <w:insideV w:val="nil"/>
-            </w:tcBorders>
-          </w:tcPr>
-          <w:p>
-            <w:pPr>
-              <w:spacing w:before="60" w:after="60"/>
-              <w:ind w:left="113"/>
-            </w:pPr>
-            <w:r>
-              <w:rPr>
-                <w:b w:val="0"/>
-                <w:color w:val="3A3A3A"/>
-                <w:sz w:val="19"/>
-              </w:rPr>
-              <w:t>Radiologie is onderdeel van medisch specialistische zorg (ziekenhuisZvw)</w:t>
-            </w:r>
-          </w:p>
-        </w:tc>
-      </w:tr>
-      <w:tr>
-        <w:tc>
-          <w:tcPr>
-            <w:tcW w:type="dxa" w:w="4819"/>
-            <w:shd w:val="clear" w:color="auto" w:fill="F2F2F2"/>
-            <w:tcBorders>
-              <w:top w:val="nil"/>
-              <w:left w:val="nil"/>
-              <w:bottom w:val="nil"/>
-              <w:right w:val="nil"/>
-              <w:insideH w:val="nil"/>
-              <w:insideV w:val="nil"/>
-            </w:tcBorders>
-          </w:tcPr>
-          <w:p>
-            <w:pPr>
-              <w:spacing w:before="60" w:after="60"/>
-              <w:ind w:left="113"/>
-            </w:pPr>
-            <w:r>
-              <w:rPr>
-                <w:b w:val="0"/>
-                <w:color w:val="3A3A3A"/>
-                <w:sz w:val="19"/>
-              </w:rPr>
-              <w:t>Arbeidsbesparing</w:t>
-            </w:r>
-          </w:p>
-        </w:tc>
-        <w:tc>
-          <w:tcPr>
-            <w:tcW w:type="dxa" w:w="4819"/>
-            <w:shd w:val="clear" w:color="auto" w:fill="F2F2F2"/>
-            <w:tcBorders>
-              <w:top w:val="nil"/>
-              <w:left w:val="nil"/>
-              <w:bottom w:val="nil"/>
-              <w:right w:val="nil"/>
-              <w:insideH w:val="nil"/>
-              <w:insideV w:val="nil"/>
-            </w:tcBorders>
-          </w:tcPr>
-          <w:p>
-            <w:pPr>
-              <w:spacing w:before="60" w:after="60"/>
-              <w:ind w:left="113"/>
-            </w:pPr>
-            <w:r>
-              <w:rPr>
-                <w:b w:val="0"/>
-                <w:color w:val="3A3A3A"/>
-                <w:sz w:val="19"/>
-              </w:rPr>
-              <w:t>Roostercoördinator bespaart 6-10 uur/week; minder ad-hoc aanpassingen</w:t>
-            </w:r>
-          </w:p>
-        </w:tc>
-      </w:tr>
-      <w:tr>
-        <w:tc>
-          <w:tcPr>
-            <w:tcW w:type="dxa" w:w="4819"/>
-            <w:shd w:val="clear" w:color="auto" w:fill="FFFFFF"/>
-            <w:tcBorders>
-              <w:top w:val="nil"/>
-              <w:left w:val="nil"/>
-              <w:bottom w:val="nil"/>
-              <w:right w:val="nil"/>
-              <w:insideH w:val="nil"/>
-              <w:insideV w:val="nil"/>
-            </w:tcBorders>
-          </w:tcPr>
-          <w:p>
-            <w:pPr>
-              <w:spacing w:before="60" w:after="60"/>
-              <w:ind w:left="113"/>
-            </w:pPr>
-            <w:r>
-              <w:rPr>
-                <w:b w:val="0"/>
-                <w:color w:val="3A3A3A"/>
-                <w:sz w:val="19"/>
-              </w:rPr>
-              <w:t>Bijkomend voordeel</w:t>
-            </w:r>
-          </w:p>
-        </w:tc>
-        <w:tc>
-          <w:tcPr>
-            <w:tcW w:type="dxa" w:w="4819"/>
-            <w:shd w:val="clear" w:color="auto" w:fill="FFFFFF"/>
-            <w:tcBorders>
-              <w:top w:val="nil"/>
-              <w:left w:val="nil"/>
-              <w:bottom w:val="nil"/>
-              <w:right w:val="nil"/>
-              <w:insideH w:val="nil"/>
-              <w:insideV w:val="nil"/>
-            </w:tcBorders>
-          </w:tcPr>
-          <w:p>
-            <w:pPr>
-              <w:spacing w:before="60" w:after="60"/>
-              <w:ind w:left="113"/>
-            </w:pPr>
-            <w:r>
-              <w:rPr>
-                <w:b w:val="0"/>
-                <w:color w:val="3A3A3A"/>
-                <w:sz w:val="19"/>
-              </w:rPr>
-              <w:t>Apparatuurbenutting stijgt (minder leegstand MRI, CT); wachttijden dalen</w:t>
-            </w:r>
-          </w:p>
-        </w:tc>
-      </w:tr>
-      <w:tr>
-        <w:tc>
-          <w:tcPr>
-            <w:tcW w:type="dxa" w:w="4819"/>
-            <w:shd w:val="clear" w:color="auto" w:fill="F2F2F2"/>
-            <w:tcBorders>
-              <w:top w:val="nil"/>
-              <w:left w:val="nil"/>
-              <w:bottom w:val="nil"/>
-              <w:right w:val="nil"/>
-              <w:insideH w:val="nil"/>
-              <w:insideV w:val="nil"/>
-            </w:tcBorders>
-          </w:tcPr>
-          <w:p>
-            <w:pPr>
-              <w:spacing w:before="60" w:after="60"/>
-              <w:ind w:left="113"/>
-            </w:pPr>
-            <w:r>
-              <w:rPr>
-                <w:b w:val="0"/>
-                <w:color w:val="3A3A3A"/>
-                <w:sz w:val="19"/>
-              </w:rPr>
-              <w:t>Integratie</w:t>
-            </w:r>
-          </w:p>
-        </w:tc>
-        <w:tc>
-          <w:tcPr>
-            <w:tcW w:type="dxa" w:w="4819"/>
-            <w:shd w:val="clear" w:color="auto" w:fill="F2F2F2"/>
-            <w:tcBorders>
-              <w:top w:val="nil"/>
-              <w:left w:val="nil"/>
-              <w:bottom w:val="nil"/>
-              <w:right w:val="nil"/>
-              <w:insideH w:val="nil"/>
-              <w:insideV w:val="nil"/>
-            </w:tcBorders>
-          </w:tcPr>
-          <w:p>
-            <w:pPr>
-              <w:spacing w:before="60" w:after="60"/>
-              <w:ind w:left="113"/>
-            </w:pPr>
-            <w:r>
-              <w:rPr>
-                <w:b w:val="0"/>
-                <w:color w:val="3A3A3A"/>
-                <w:sz w:val="19"/>
-              </w:rPr>
-              <w:t>Koppeling met RIS (Radiology Information System) en HIS voor afsprakenstroom</w:t>
-            </w:r>
-          </w:p>
-        </w:tc>
-      </w:tr>
-      <w:tr>
-        <w:tc>
-          <w:tcPr>
-            <w:tcW w:type="dxa" w:w="4819"/>
-            <w:shd w:val="clear" w:color="auto" w:fill="FFFFFF"/>
-            <w:tcBorders>
-              <w:top w:val="nil"/>
-              <w:left w:val="nil"/>
-              <w:bottom w:val="nil"/>
-              <w:right w:val="nil"/>
-              <w:insideH w:val="nil"/>
-              <w:insideV w:val="nil"/>
-            </w:tcBorders>
-          </w:tcPr>
-          <w:p>
-            <w:pPr>
-              <w:spacing w:before="60" w:after="60"/>
-              <w:ind w:left="113"/>
-            </w:pPr>
-            <w:r>
-              <w:rPr>
-                <w:b w:val="0"/>
-                <w:color w:val="3A3A3A"/>
-                <w:sz w:val="19"/>
-              </w:rPr>
-              <w:t>Aandachtspunt</w:t>
-            </w:r>
-          </w:p>
-        </w:tc>
-        <w:tc>
-          <w:tcPr>
-            <w:tcW w:type="dxa" w:w="4819"/>
-            <w:shd w:val="clear" w:color="auto" w:fill="FFFFFF"/>
-            <w:tcBorders>
-              <w:top w:val="nil"/>
-              <w:left w:val="nil"/>
-              <w:bottom w:val="nil"/>
-              <w:right w:val="nil"/>
-              <w:insideH w:val="nil"/>
-              <w:insideV w:val="nil"/>
-            </w:tcBorders>
-          </w:tcPr>
-          <w:p>
-            <w:pPr>
-              <w:spacing w:before="60" w:after="60"/>
-              <w:ind w:left="113"/>
-            </w:pPr>
-            <w:r>
-              <w:rPr>
-                <w:b w:val="0"/>
-                <w:color w:val="3A3A3A"/>
-                <w:sz w:val="19"/>
-              </w:rPr>
-              <w:t>Radiologie-specifieke planning wijkt af van generieke planningssoftware — dit is een voordeel (bewijs van maatwerk)</w:t>
-            </w:r>
-          </w:p>
-        </w:tc>
-      </w:tr>
-    </w:tbl>
-    <w:p>
-      <w:pPr>
-        <w:spacing w:after="80"/>
-      </w:pPr>
-    </w:p>
-    <w:tbl>
-      <w:tblPr>
-        <w:tblW w:type="auto" w:w="0"/>
-        <w:jc w:val="left"/>
-        <w:tblLook w:firstColumn="1" w:firstRow="1" w:lastColumn="0" w:lastRow="0" w:noHBand="0" w:noVBand="1" w:val="04A0"/>
-      </w:tblPr>
-      <w:tblGrid>
-        <w:gridCol w:w="9638"/>
-      </w:tblGrid>
-      <w:tr>
-        <w:tc>
-          <w:tcPr>
-            <w:tcW w:type="dxa" w:w="9638"/>
-            <w:shd w:val="clear" w:color="auto" w:fill="177FBA"/>
-            <w:tcBorders>
-              <w:top w:val="nil"/>
-              <w:left w:val="nil"/>
-              <w:bottom w:val="nil"/>
-              <w:right w:val="nil"/>
-              <w:insideH w:val="nil"/>
-              <w:insideV w:val="nil"/>
-            </w:tcBorders>
-          </w:tcPr>
-          <w:p>
-            <w:pPr>
-              <w:spacing w:before="100" w:after="100"/>
-              <w:ind w:left="227"/>
-            </w:pPr>
-            <w:r>
-              <w:rPr>
-                <w:b/>
-                <w:color w:val="FFFFFF"/>
-                <w:sz w:val="22"/>
-              </w:rPr>
-              <w:t>ℹ  Hoe verschilt de radiologie-case van de poli-case?</w:t>
-            </w:r>
-          </w:p>
-        </w:tc>
-      </w:tr>
-      <w:tr>
-        <w:tc>
-          <w:tcPr>
-            <w:tcW w:type="dxa" w:w="9638"/>
-            <w:shd w:val="clear" w:color="auto" w:fill="CFE9F8"/>
-            <w:tcBorders>
-              <w:top w:val="nil"/>
-              <w:left w:val="nil"/>
-              <w:bottom w:val="nil"/>
-              <w:right w:val="nil"/>
-              <w:insideH w:val="nil"/>
-              <w:insideV w:val="nil"/>
-            </w:tcBorders>
-          </w:tcPr>
-          <w:p/>
-          <w:p>
-            <w:pPr>
-              <w:spacing w:before="20" w:after="40"/>
-              <w:ind w:left="283" w:hanging="227"/>
-            </w:pPr>
-            <w:r>
-              <w:rPr>
-                <w:b/>
-                <w:color w:val="177FBA"/>
-                <w:sz w:val="20"/>
-              </w:rPr>
-              <w:t xml:space="preserve">▸  </w:t>
-            </w:r>
-            <w:r>
-              <w:rPr>
-                <w:color w:val="3A3A3A"/>
-                <w:sz w:val="20"/>
-              </w:rPr>
-              <w:t>Radiologie heeft eigen systemen (RIS): zorg voor een werkende koppeling met de tool — dit vergroot de kans op goedkeuring.</w:t>
-            </w:r>
-          </w:p>
-          <w:p>
-            <w:pPr>
-              <w:spacing w:before="20" w:after="40"/>
-              <w:ind w:left="283" w:hanging="227"/>
-            </w:pPr>
-            <w:r>
-              <w:rPr>
-                <w:b/>
-                <w:color w:val="177FBA"/>
-                <w:sz w:val="20"/>
-              </w:rPr>
-              <w:t xml:space="preserve">▸  </w:t>
-            </w:r>
-            <w:r>
-              <w:rPr>
-                <w:color w:val="3A3A3A"/>
-                <w:sz w:val="20"/>
-              </w:rPr>
-              <w:t>De mix van urgente en electieve onderzoeken maakt de planning complexer: dit versterkt het argument voor AI-ondersteuning.</w:t>
-            </w:r>
-          </w:p>
-          <w:p>
-            <w:pPr>
-              <w:spacing w:before="20" w:after="40"/>
-              <w:ind w:left="283" w:hanging="227"/>
-            </w:pPr>
-            <w:r>
-              <w:rPr>
-                <w:b/>
-                <w:color w:val="177FBA"/>
-                <w:sz w:val="20"/>
-              </w:rPr>
-              <w:t xml:space="preserve">▸  </w:t>
-            </w:r>
-            <w:r>
-              <w:rPr>
-                <w:color w:val="3A3A3A"/>
-                <w:sz w:val="20"/>
-              </w:rPr>
-              <w:t>Betrek radiodiagnostisch laboranten (RTL) in de implementatie — zij zijn de primaire gebruikers, niet alleen planners.</w:t>
-            </w:r>
-          </w:p>
-          <w:p>
-            <w:pPr>
-              <w:spacing w:before="20" w:after="40"/>
-              <w:ind w:left="283" w:hanging="227"/>
-            </w:pPr>
-            <w:r>
-              <w:rPr>
-                <w:b/>
-                <w:color w:val="177FBA"/>
-                <w:sz w:val="20"/>
-              </w:rPr>
-              <w:t xml:space="preserve">▸  </w:t>
-            </w:r>
-            <w:r>
-              <w:rPr>
-                <w:color w:val="3A3A3A"/>
-                <w:sz w:val="20"/>
-              </w:rPr>
-              <w:t>Meten van apparaatbenutting (bijv. MRI-bezettingsgraad) is een goede aanvullende KPI naast uren arbeidsbesparing.</w:t>
-            </w:r>
-          </w:p>
-          <w:p>
-            <w:pPr>
-              <w:spacing w:before="20" w:after="40"/>
-              <w:ind w:left="283" w:hanging="227"/>
-            </w:pPr>
-            <w:r>
-              <w:rPr>
-                <w:b/>
-                <w:color w:val="177FBA"/>
-                <w:sz w:val="20"/>
-              </w:rPr>
-              <w:t xml:space="preserve">▸  </w:t>
-            </w:r>
-            <w:r>
-              <w:rPr>
-                <w:color w:val="3A3A3A"/>
-                <w:sz w:val="20"/>
-              </w:rPr>
-              <w:t>Als de tool ook voor andere afdelingen gebruikt gaat worden (bijv. OK-planning), kan dit als aparte mijlpaal worden opgevoerd.</w:t>
-            </w:r>
-          </w:p>
-          <w:p>
-            <w:pPr>
-              <w:spacing w:after="80"/>
-            </w:pPr>
+              <w:t>MP01 – Capaciteitsplanning met AI (MSZ/Zvw)</w:t>
+            </w:r>
           </w:p>
         </w:tc>
       </w:tr>
@@ -14798,7 +14028,7 @@
     </w:p>
     <w:p>
       <w:pPr>
-        <w:spacing w:before="120" w:after="60"/>
+        <w:spacing w:before="160" w:after="60"/>
       </w:pPr>
       <w:r>
         <w:rPr>
@@ -14806,7 +14036,7 @@
           <w:color w:val="1E7E34"/>
           <w:sz w:val="24"/>
         </w:rPr>
-        <w:t>Case 3 — AI Capaciteitsdashboard SEH met Scenario-Analyse</w:t>
+        <w:t>De kans: je zit in de perfecte tijdsfase</w:t>
       </w:r>
     </w:p>
     <w:p>
@@ -14820,7 +14050,20 @@
           <w:color w:val="3A3A3A"/>
           <w:sz w:val="20"/>
         </w:rPr>
-        <w:t>Voor de Spoedeisende Hulp (SEH) is een AI-dashboard ontwikkeld dat real-time inzicht geeft in de bezetting, doorlooptijden en wachtrijen. Het unieke van dit dashboard is de scenario-analyse functie: de gebruiker kan simuleren wat er met de SEH-capaciteit gebeurt als bepaalde zorgstromen worden afgebogen naar de huisartsenpost (HAP), een spoedpoli of een andere setting. Zo kan het management gefundeerde beslissingen nemen over doorverwijsprotocollen, triage en capaciteitsverdeling.</w:t>
+        <w:t>Doorbraakmiddelen zijn uitsluitend bedoeld voor bewezen, opschaalbare toepassingen. Op dit moment is jouw tool nog in ontwikkeling — dat betekent dat je nog niet direct kunt aanvragen. Maar de aanvraagperiode opent pas op 1 december 2026. Je hebt dus nog 3 tot 4 maanden om de tool af te ronden, een interne pilot te draaien en de tijdsbesparing te meten. Dat is precies genoeg tijd om het goed te doen — mits je nu direct begint.</w:t>
+      </w:r>
+    </w:p>
+    <w:p>
+      <w:pPr>
+        <w:spacing w:before="80" w:after="60"/>
+      </w:pPr>
+      <w:r>
+        <w:rPr>
+          <w:b/>
+          <w:color w:val="004787"/>
+          <w:sz w:val="24"/>
+        </w:rPr>
+        <w:t>Tijdlijn: van ontwikkeling naar doorbraakmiddelen-aanvraag</w:t>
       </w:r>
     </w:p>
     <w:tbl>
@@ -14830,13 +14073,252 @@
         <w:tblLook w:firstColumn="1" w:firstRow="1" w:lastColumn="0" w:lastRow="0" w:noHBand="0" w:noVBand="1" w:val="04A0"/>
       </w:tblPr>
       <w:tblGrid>
-        <w:gridCol w:w="4819"/>
-        <w:gridCol w:w="4819"/>
+        <w:gridCol w:w="3213"/>
+        <w:gridCol w:w="3213"/>
+        <w:gridCol w:w="3213"/>
       </w:tblGrid>
       <w:tr>
         <w:tc>
           <w:tcPr>
-            <w:tcW w:type="dxa" w:w="4819"/>
+            <w:tcW w:type="dxa" w:w="1587"/>
+            <w:shd w:val="clear" w:color="auto" w:fill="004787"/>
+            <w:tcBorders>
+              <w:top w:val="nil"/>
+              <w:left w:val="nil"/>
+              <w:bottom w:val="nil"/>
+              <w:right w:val="nil"/>
+              <w:insideH w:val="nil"/>
+              <w:insideV w:val="nil"/>
+            </w:tcBorders>
+          </w:tcPr>
+          <w:p>
+            <w:pPr>
+              <w:spacing w:before="140" w:after="140"/>
+              <w:jc w:val="center"/>
+            </w:pPr>
+            <w:r>
+              <w:rPr>
+                <w:b/>
+                <w:i w:val="0"/>
+                <w:color w:val="FFFFFF"/>
+                <w:sz w:val="16"/>
+              </w:rPr>
+              <w:t>Augustus 2026</w:t>
+            </w:r>
+          </w:p>
+        </w:tc>
+        <w:tc>
+          <w:tcPr>
+            <w:tcW w:type="dxa" w:w="227"/>
+            <w:shd w:val="clear" w:color="auto" w:fill="FFFFFF"/>
+            <w:tcBorders>
+              <w:top w:val="nil"/>
+              <w:left w:val="nil"/>
+              <w:bottom w:val="nil"/>
+              <w:right w:val="nil"/>
+              <w:insideH w:val="nil"/>
+              <w:insideV w:val="nil"/>
+            </w:tcBorders>
+          </w:tcPr>
+          <w:p>
+            <w:pPr>
+              <w:spacing w:before="120"/>
+              <w:jc w:val="center"/>
+            </w:pPr>
+            <w:r>
+              <w:rPr>
+                <w:b/>
+                <w:i w:val="0"/>
+                <w:color w:val="004787"/>
+                <w:sz w:val="20"/>
+              </w:rPr>
+              <w:t>►</w:t>
+            </w:r>
+          </w:p>
+        </w:tc>
+        <w:tc>
+          <w:tcPr>
+            <w:tcW w:type="dxa" w:w="3213"/>
+            <w:shd w:val="clear" w:color="auto" w:fill="F2F2F2"/>
+            <w:tcBorders>
+              <w:top w:val="nil"/>
+              <w:left w:val="nil"/>
+              <w:bottom w:val="nil"/>
+              <w:right w:val="nil"/>
+              <w:insideH w:val="nil"/>
+              <w:insideV w:val="nil"/>
+            </w:tcBorders>
+          </w:tcPr>
+          <w:p>
+            <w:pPr>
+              <w:spacing w:before="80" w:after="20"/>
+              <w:ind w:left="113"/>
+            </w:pPr>
+            <w:r>
+              <w:rPr>
+                <w:b/>
+                <w:i w:val="0"/>
+                <w:color w:val="004787"/>
+                <w:sz w:val="20"/>
+              </w:rPr>
+              <w:t>Tool afbouwen tot werkbare versie</w:t>
+            </w:r>
+          </w:p>
+          <w:p>
+            <w:pPr>
+              <w:spacing w:before="0" w:after="80"/>
+              <w:ind w:left="113"/>
+            </w:pPr>
+            <w:r>
+              <w:rPr>
+                <w:color w:val="3A3A3A"/>
+                <w:sz w:val="19"/>
+              </w:rPr>
+              <w:t>Zorg dat de tool stabiel genoeg is voor echte gebruikers. Het hoeft nog niet perfect — een 80% werkende versie is voldoende voor een interne pilot.</w:t>
+            </w:r>
+          </w:p>
+        </w:tc>
+      </w:tr>
+    </w:tbl>
+    <w:p>
+      <w:pPr>
+        <w:spacing w:after="40"/>
+      </w:pPr>
+    </w:p>
+    <w:tbl>
+      <w:tblPr>
+        <w:tblW w:type="auto" w:w="0"/>
+        <w:jc w:val="left"/>
+        <w:tblLook w:firstColumn="1" w:firstRow="1" w:lastColumn="0" w:lastRow="0" w:noHBand="0" w:noVBand="1" w:val="04A0"/>
+      </w:tblPr>
+      <w:tblGrid>
+        <w:gridCol w:w="3213"/>
+        <w:gridCol w:w="3213"/>
+        <w:gridCol w:w="3213"/>
+      </w:tblGrid>
+      <w:tr>
+        <w:tc>
+          <w:tcPr>
+            <w:tcW w:type="dxa" w:w="1587"/>
+            <w:shd w:val="clear" w:color="auto" w:fill="177FBA"/>
+            <w:tcBorders>
+              <w:top w:val="nil"/>
+              <w:left w:val="nil"/>
+              <w:bottom w:val="nil"/>
+              <w:right w:val="nil"/>
+              <w:insideH w:val="nil"/>
+              <w:insideV w:val="nil"/>
+            </w:tcBorders>
+          </w:tcPr>
+          <w:p>
+            <w:pPr>
+              <w:spacing w:before="140" w:after="140"/>
+              <w:jc w:val="center"/>
+            </w:pPr>
+            <w:r>
+              <w:rPr>
+                <w:b/>
+                <w:i w:val="0"/>
+                <w:color w:val="FFFFFF"/>
+                <w:sz w:val="16"/>
+              </w:rPr>
+              <w:t>Augustus 2026</w:t>
+            </w:r>
+          </w:p>
+        </w:tc>
+        <w:tc>
+          <w:tcPr>
+            <w:tcW w:type="dxa" w:w="227"/>
+            <w:shd w:val="clear" w:color="auto" w:fill="FFFFFF"/>
+            <w:tcBorders>
+              <w:top w:val="nil"/>
+              <w:left w:val="nil"/>
+              <w:bottom w:val="nil"/>
+              <w:right w:val="nil"/>
+              <w:insideH w:val="nil"/>
+              <w:insideV w:val="nil"/>
+            </w:tcBorders>
+          </w:tcPr>
+          <w:p>
+            <w:pPr>
+              <w:spacing w:before="120"/>
+              <w:jc w:val="center"/>
+            </w:pPr>
+            <w:r>
+              <w:rPr>
+                <w:b/>
+                <w:i w:val="0"/>
+                <w:color w:val="177FBA"/>
+                <w:sz w:val="20"/>
+              </w:rPr>
+              <w:t>►</w:t>
+            </w:r>
+          </w:p>
+        </w:tc>
+        <w:tc>
+          <w:tcPr>
+            <w:tcW w:type="dxa" w:w="3213"/>
+            <w:shd w:val="clear" w:color="auto" w:fill="F2F2F2"/>
+            <w:tcBorders>
+              <w:top w:val="nil"/>
+              <w:left w:val="nil"/>
+              <w:bottom w:val="nil"/>
+              <w:right w:val="nil"/>
+              <w:insideH w:val="nil"/>
+              <w:insideV w:val="nil"/>
+            </w:tcBorders>
+          </w:tcPr>
+          <w:p>
+            <w:pPr>
+              <w:spacing w:before="80" w:after="20"/>
+              <w:ind w:left="113"/>
+            </w:pPr>
+            <w:r>
+              <w:rPr>
+                <w:b/>
+                <w:i w:val="0"/>
+                <w:color w:val="004787"/>
+                <w:sz w:val="20"/>
+              </w:rPr>
+              <w:t>Nulmeting uitvoeren (NU)</w:t>
+            </w:r>
+          </w:p>
+          <w:p>
+            <w:pPr>
+              <w:spacing w:before="0" w:after="80"/>
+              <w:ind w:left="113"/>
+            </w:pPr>
+            <w:r>
+              <w:rPr>
+                <w:color w:val="3A3A3A"/>
+                <w:sz w:val="19"/>
+              </w:rPr>
+              <w:t>Meet hoeveel uur een tactische plan adviseur nu kwijt is aan het opstellen van een rooster voor één poli. Dit is de baseline die je later vergelijkt met de situatie mét tool.</w:t>
+            </w:r>
+          </w:p>
+        </w:tc>
+      </w:tr>
+    </w:tbl>
+    <w:p>
+      <w:pPr>
+        <w:spacing w:after="40"/>
+      </w:pPr>
+    </w:p>
+    <w:tbl>
+      <w:tblPr>
+        <w:tblW w:type="auto" w:w="0"/>
+        <w:jc w:val="left"/>
+        <w:tblLook w:firstColumn="1" w:firstRow="1" w:lastColumn="0" w:lastRow="0" w:noHBand="0" w:noVBand="1" w:val="04A0"/>
+      </w:tblPr>
+      <w:tblGrid>
+        <w:gridCol w:w="3213"/>
+        <w:gridCol w:w="3213"/>
+        <w:gridCol w:w="3213"/>
+      </w:tblGrid>
+      <w:tr>
+        <w:tc>
+          <w:tcPr>
+            <w:tcW w:type="dxa" w:w="1587"/>
             <w:shd w:val="clear" w:color="auto" w:fill="1E7E34"/>
             <w:tcBorders>
               <w:top w:val="nil"/>
@@ -14849,22 +14331,470 @@
           </w:tcPr>
           <w:p>
             <w:pPr>
-              <w:spacing w:before="60" w:after="60"/>
-              <w:ind w:left="113"/>
+              <w:spacing w:before="140" w:after="140"/>
+              <w:jc w:val="center"/>
             </w:pPr>
             <w:r>
               <w:rPr>
                 <w:b/>
+                <w:i w:val="0"/>
                 <w:color w:val="FFFFFF"/>
-                <w:sz w:val="18"/>
-              </w:rPr>
-              <w:t>Functionaliteit</w:t>
+                <w:sz w:val="16"/>
+              </w:rPr>
+              <w:t>Sept – okt 2026</w:t>
             </w:r>
           </w:p>
         </w:tc>
         <w:tc>
           <w:tcPr>
-            <w:tcW w:type="dxa" w:w="4819"/>
+            <w:tcW w:type="dxa" w:w="227"/>
+            <w:shd w:val="clear" w:color="auto" w:fill="FFFFFF"/>
+            <w:tcBorders>
+              <w:top w:val="nil"/>
+              <w:left w:val="nil"/>
+              <w:bottom w:val="nil"/>
+              <w:right w:val="nil"/>
+              <w:insideH w:val="nil"/>
+              <w:insideV w:val="nil"/>
+            </w:tcBorders>
+          </w:tcPr>
+          <w:p>
+            <w:pPr>
+              <w:spacing w:before="120"/>
+              <w:jc w:val="center"/>
+            </w:pPr>
+            <w:r>
+              <w:rPr>
+                <w:b/>
+                <w:i w:val="0"/>
+                <w:color w:val="1E7E34"/>
+                <w:sz w:val="20"/>
+              </w:rPr>
+              <w:t>►</w:t>
+            </w:r>
+          </w:p>
+        </w:tc>
+        <w:tc>
+          <w:tcPr>
+            <w:tcW w:type="dxa" w:w="3213"/>
+            <w:shd w:val="clear" w:color="auto" w:fill="F2F2F2"/>
+            <w:tcBorders>
+              <w:top w:val="nil"/>
+              <w:left w:val="nil"/>
+              <w:bottom w:val="nil"/>
+              <w:right w:val="nil"/>
+              <w:insideH w:val="nil"/>
+              <w:insideV w:val="nil"/>
+            </w:tcBorders>
+          </w:tcPr>
+          <w:p>
+            <w:pPr>
+              <w:spacing w:before="80" w:after="20"/>
+              <w:ind w:left="113"/>
+            </w:pPr>
+            <w:r>
+              <w:rPr>
+                <w:b/>
+                <w:i w:val="0"/>
+                <w:color w:val="004787"/>
+                <w:sz w:val="20"/>
+              </w:rPr>
+              <w:t>Interne pilot: 1-2 poliklinieken</w:t>
+            </w:r>
+          </w:p>
+          <w:p>
+            <w:pPr>
+              <w:spacing w:before="0" w:after="80"/>
+              <w:ind w:left="113"/>
+            </w:pPr>
+            <w:r>
+              <w:rPr>
+                <w:color w:val="3A3A3A"/>
+                <w:sz w:val="19"/>
+              </w:rPr>
+              <w:t>Laat de tool echt gebruiken door de tactische plan adviseur voor roostering van 1 of 2 poli's. Meet wekelijks de tijdsbesteding. Noteer ook wat het percentage 'direct bruikbaar' is.</w:t>
+            </w:r>
+          </w:p>
+        </w:tc>
+      </w:tr>
+    </w:tbl>
+    <w:p>
+      <w:pPr>
+        <w:spacing w:after="40"/>
+      </w:pPr>
+    </w:p>
+    <w:tbl>
+      <w:tblPr>
+        <w:tblW w:type="auto" w:w="0"/>
+        <w:jc w:val="left"/>
+        <w:tblLook w:firstColumn="1" w:firstRow="1" w:lastColumn="0" w:lastRow="0" w:noHBand="0" w:noVBand="1" w:val="04A0"/>
+      </w:tblPr>
+      <w:tblGrid>
+        <w:gridCol w:w="3213"/>
+        <w:gridCol w:w="3213"/>
+        <w:gridCol w:w="3213"/>
+      </w:tblGrid>
+      <w:tr>
+        <w:tc>
+          <w:tcPr>
+            <w:tcW w:type="dxa" w:w="1587"/>
+            <w:shd w:val="clear" w:color="auto" w:fill="D45600"/>
+            <w:tcBorders>
+              <w:top w:val="nil"/>
+              <w:left w:val="nil"/>
+              <w:bottom w:val="nil"/>
+              <w:right w:val="nil"/>
+              <w:insideH w:val="nil"/>
+              <w:insideV w:val="nil"/>
+            </w:tcBorders>
+          </w:tcPr>
+          <w:p>
+            <w:pPr>
+              <w:spacing w:before="140" w:after="140"/>
+              <w:jc w:val="center"/>
+            </w:pPr>
+            <w:r>
+              <w:rPr>
+                <w:b/>
+                <w:i w:val="0"/>
+                <w:color w:val="FFFFFF"/>
+                <w:sz w:val="16"/>
+              </w:rPr>
+              <w:t>Oktober – nov 2026</w:t>
+            </w:r>
+          </w:p>
+        </w:tc>
+        <w:tc>
+          <w:tcPr>
+            <w:tcW w:type="dxa" w:w="227"/>
+            <w:shd w:val="clear" w:color="auto" w:fill="FFFFFF"/>
+            <w:tcBorders>
+              <w:top w:val="nil"/>
+              <w:left w:val="nil"/>
+              <w:bottom w:val="nil"/>
+              <w:right w:val="nil"/>
+              <w:insideH w:val="nil"/>
+              <w:insideV w:val="nil"/>
+            </w:tcBorders>
+          </w:tcPr>
+          <w:p>
+            <w:pPr>
+              <w:spacing w:before="120"/>
+              <w:jc w:val="center"/>
+            </w:pPr>
+            <w:r>
+              <w:rPr>
+                <w:b/>
+                <w:i w:val="0"/>
+                <w:color w:val="D45600"/>
+                <w:sz w:val="20"/>
+              </w:rPr>
+              <w:t>►</w:t>
+            </w:r>
+          </w:p>
+        </w:tc>
+        <w:tc>
+          <w:tcPr>
+            <w:tcW w:type="dxa" w:w="3213"/>
+            <w:shd w:val="clear" w:color="auto" w:fill="F2F2F2"/>
+            <w:tcBorders>
+              <w:top w:val="nil"/>
+              <w:left w:val="nil"/>
+              <w:bottom w:val="nil"/>
+              <w:right w:val="nil"/>
+              <w:insideH w:val="nil"/>
+              <w:insideV w:val="nil"/>
+            </w:tcBorders>
+          </w:tcPr>
+          <w:p>
+            <w:pPr>
+              <w:spacing w:before="80" w:after="20"/>
+              <w:ind w:left="113"/>
+            </w:pPr>
+            <w:r>
+              <w:rPr>
+                <w:b/>
+                <w:i w:val="0"/>
+                <w:color w:val="004787"/>
+                <w:sz w:val="20"/>
+              </w:rPr>
+              <w:t>Meten + documenteren</w:t>
+            </w:r>
+          </w:p>
+          <w:p>
+            <w:pPr>
+              <w:spacing w:before="0" w:after="80"/>
+              <w:ind w:left="113"/>
+            </w:pPr>
+            <w:r>
+              <w:rPr>
+                <w:color w:val="3A3A3A"/>
+                <w:sz w:val="19"/>
+              </w:rPr>
+              <w:t>Vergelijk nulmeting met pilotresultaten. Schrijf een korte interne evaluatie: wat werkt, hoeveel uur besparing, hoeveel % automatisch correct. Dit is jouw bewijs van effectiviteit.</w:t>
+            </w:r>
+          </w:p>
+        </w:tc>
+      </w:tr>
+    </w:tbl>
+    <w:p>
+      <w:pPr>
+        <w:spacing w:after="40"/>
+      </w:pPr>
+    </w:p>
+    <w:tbl>
+      <w:tblPr>
+        <w:tblW w:type="auto" w:w="0"/>
+        <w:jc w:val="left"/>
+        <w:tblLook w:firstColumn="1" w:firstRow="1" w:lastColumn="0" w:lastRow="0" w:noHBand="0" w:noVBand="1" w:val="04A0"/>
+      </w:tblPr>
+      <w:tblGrid>
+        <w:gridCol w:w="3213"/>
+        <w:gridCol w:w="3213"/>
+        <w:gridCol w:w="3213"/>
+      </w:tblGrid>
+      <w:tr>
+        <w:tc>
+          <w:tcPr>
+            <w:tcW w:type="dxa" w:w="1587"/>
+            <w:shd w:val="clear" w:color="auto" w:fill="5A2D91"/>
+            <w:tcBorders>
+              <w:top w:val="nil"/>
+              <w:left w:val="nil"/>
+              <w:bottom w:val="nil"/>
+              <w:right w:val="nil"/>
+              <w:insideH w:val="nil"/>
+              <w:insideV w:val="nil"/>
+            </w:tcBorders>
+          </w:tcPr>
+          <w:p>
+            <w:pPr>
+              <w:spacing w:before="140" w:after="140"/>
+              <w:jc w:val="center"/>
+            </w:pPr>
+            <w:r>
+              <w:rPr>
+                <w:b/>
+                <w:i w:val="0"/>
+                <w:color w:val="FFFFFF"/>
+                <w:sz w:val="16"/>
+              </w:rPr>
+              <w:t>November 2026</w:t>
+            </w:r>
+          </w:p>
+        </w:tc>
+        <w:tc>
+          <w:tcPr>
+            <w:tcW w:type="dxa" w:w="227"/>
+            <w:shd w:val="clear" w:color="auto" w:fill="FFFFFF"/>
+            <w:tcBorders>
+              <w:top w:val="nil"/>
+              <w:left w:val="nil"/>
+              <w:bottom w:val="nil"/>
+              <w:right w:val="nil"/>
+              <w:insideH w:val="nil"/>
+              <w:insideV w:val="nil"/>
+            </w:tcBorders>
+          </w:tcPr>
+          <w:p>
+            <w:pPr>
+              <w:spacing w:before="120"/>
+              <w:jc w:val="center"/>
+            </w:pPr>
+            <w:r>
+              <w:rPr>
+                <w:b/>
+                <w:i w:val="0"/>
+                <w:color w:val="5A2D91"/>
+                <w:sz w:val="20"/>
+              </w:rPr>
+              <w:t>►</w:t>
+            </w:r>
+          </w:p>
+        </w:tc>
+        <w:tc>
+          <w:tcPr>
+            <w:tcW w:type="dxa" w:w="3213"/>
+            <w:shd w:val="clear" w:color="auto" w:fill="F2F2F2"/>
+            <w:tcBorders>
+              <w:top w:val="nil"/>
+              <w:left w:val="nil"/>
+              <w:bottom w:val="nil"/>
+              <w:right w:val="nil"/>
+              <w:insideH w:val="nil"/>
+              <w:insideV w:val="nil"/>
+            </w:tcBorders>
+          </w:tcPr>
+          <w:p>
+            <w:pPr>
+              <w:spacing w:before="80" w:after="20"/>
+              <w:ind w:left="113"/>
+            </w:pPr>
+            <w:r>
+              <w:rPr>
+                <w:b/>
+                <w:i w:val="0"/>
+                <w:color w:val="004787"/>
+                <w:sz w:val="20"/>
+              </w:rPr>
+              <w:t>Oriëntatiegesprek zorgverzekeraar</w:t>
+            </w:r>
+          </w:p>
+          <w:p>
+            <w:pPr>
+              <w:spacing w:before="0" w:after="80"/>
+              <w:ind w:left="113"/>
+            </w:pPr>
+            <w:r>
+              <w:rPr>
+                <w:color w:val="3A3A3A"/>
+                <w:sz w:val="19"/>
+              </w:rPr>
+              <w:t>Neem contact op met de dominante zorgverzekeraar van jullie ziekenhuis. Leg de tool voor, vraag het aanvraagformat op en bespreek wat zij aanvullend verwachten.</w:t>
+            </w:r>
+          </w:p>
+        </w:tc>
+      </w:tr>
+    </w:tbl>
+    <w:p>
+      <w:pPr>
+        <w:spacing w:after="40"/>
+      </w:pPr>
+    </w:p>
+    <w:tbl>
+      <w:tblPr>
+        <w:tblW w:type="auto" w:w="0"/>
+        <w:jc w:val="left"/>
+        <w:tblLook w:firstColumn="1" w:firstRow="1" w:lastColumn="0" w:lastRow="0" w:noHBand="0" w:noVBand="1" w:val="04A0"/>
+      </w:tblPr>
+      <w:tblGrid>
+        <w:gridCol w:w="3213"/>
+        <w:gridCol w:w="3213"/>
+        <w:gridCol w:w="3213"/>
+      </w:tblGrid>
+      <w:tr>
+        <w:tc>
+          <w:tcPr>
+            <w:tcW w:type="dxa" w:w="1587"/>
+            <w:shd w:val="clear" w:color="auto" w:fill="C0392B"/>
+            <w:tcBorders>
+              <w:top w:val="nil"/>
+              <w:left w:val="nil"/>
+              <w:bottom w:val="nil"/>
+              <w:right w:val="nil"/>
+              <w:insideH w:val="nil"/>
+              <w:insideV w:val="nil"/>
+            </w:tcBorders>
+          </w:tcPr>
+          <w:p>
+            <w:pPr>
+              <w:spacing w:before="140" w:after="140"/>
+              <w:jc w:val="center"/>
+            </w:pPr>
+            <w:r>
+              <w:rPr>
+                <w:b/>
+                <w:i w:val="0"/>
+                <w:color w:val="FFFFFF"/>
+                <w:sz w:val="16"/>
+              </w:rPr>
+              <w:t>1 dec '26 – 15 jan '27</w:t>
+            </w:r>
+          </w:p>
+        </w:tc>
+        <w:tc>
+          <w:tcPr>
+            <w:tcW w:type="dxa" w:w="227"/>
+            <w:shd w:val="clear" w:color="auto" w:fill="FFFFFF"/>
+            <w:tcBorders>
+              <w:top w:val="nil"/>
+              <w:left w:val="nil"/>
+              <w:bottom w:val="nil"/>
+              <w:right w:val="nil"/>
+              <w:insideH w:val="nil"/>
+              <w:insideV w:val="nil"/>
+            </w:tcBorders>
+          </w:tcPr>
+          <w:p>
+            <w:pPr>
+              <w:spacing w:before="120"/>
+              <w:jc w:val="center"/>
+            </w:pPr>
+            <w:r>
+              <w:rPr>
+                <w:b/>
+                <w:i w:val="0"/>
+                <w:color w:val="C0392B"/>
+                <w:sz w:val="20"/>
+              </w:rPr>
+              <w:t>►</w:t>
+            </w:r>
+          </w:p>
+        </w:tc>
+        <w:tc>
+          <w:tcPr>
+            <w:tcW w:type="dxa" w:w="3213"/>
+            <w:shd w:val="clear" w:color="auto" w:fill="F2F2F2"/>
+            <w:tcBorders>
+              <w:top w:val="nil"/>
+              <w:left w:val="nil"/>
+              <w:bottom w:val="nil"/>
+              <w:right w:val="nil"/>
+              <w:insideH w:val="nil"/>
+              <w:insideV w:val="nil"/>
+            </w:tcBorders>
+          </w:tcPr>
+          <w:p>
+            <w:pPr>
+              <w:spacing w:before="80" w:after="20"/>
+              <w:ind w:left="113"/>
+            </w:pPr>
+            <w:r>
+              <w:rPr>
+                <w:b/>
+                <w:i w:val="0"/>
+                <w:color w:val="004787"/>
+                <w:sz w:val="20"/>
+              </w:rPr>
+              <w:t>AANVRAGEN via zorgverzekeraar</w:t>
+            </w:r>
+          </w:p>
+          <w:p>
+            <w:pPr>
+              <w:spacing w:before="0" w:after="80"/>
+              <w:ind w:left="113"/>
+            </w:pPr>
+            <w:r>
+              <w:rPr>
+                <w:color w:val="3A3A3A"/>
+                <w:sz w:val="19"/>
+              </w:rPr>
+              <w:t>Het ziekenhuis (RvB/directie ondertekent) dient de aanvraag in. Jij als ICM-medewerker levert alle inhoudelijke onderbouwing. De pilot-resultaten zijn het bewijs van effectiviteit.</w:t>
+            </w:r>
+          </w:p>
+        </w:tc>
+      </w:tr>
+    </w:tbl>
+    <w:p>
+      <w:pPr>
+        <w:spacing w:after="40"/>
+      </w:pPr>
+    </w:p>
+    <w:tbl>
+      <w:tblPr>
+        <w:tblW w:type="auto" w:w="0"/>
+        <w:jc w:val="left"/>
+        <w:tblLook w:firstColumn="1" w:firstRow="1" w:lastColumn="0" w:lastRow="0" w:noHBand="0" w:noVBand="1" w:val="04A0"/>
+      </w:tblPr>
+      <w:tblGrid>
+        <w:gridCol w:w="3213"/>
+        <w:gridCol w:w="3213"/>
+        <w:gridCol w:w="3213"/>
+      </w:tblGrid>
+      <w:tr>
+        <w:tc>
+          <w:tcPr>
+            <w:tcW w:type="dxa" w:w="1587"/>
             <w:shd w:val="clear" w:color="auto" w:fill="1E7E34"/>
             <w:tcBorders>
               <w:top w:val="nil"/>
@@ -14877,24 +14807,52 @@
           </w:tcPr>
           <w:p>
             <w:pPr>
-              <w:spacing w:before="60" w:after="60"/>
-              <w:ind w:left="113"/>
+              <w:spacing w:before="140" w:after="140"/>
+              <w:jc w:val="center"/>
             </w:pPr>
             <w:r>
               <w:rPr>
                 <w:b/>
+                <w:i w:val="0"/>
                 <w:color w:val="FFFFFF"/>
-                <w:sz w:val="18"/>
-              </w:rPr>
-              <w:t>Omschrijving</w:t>
+                <w:sz w:val="16"/>
+              </w:rPr>
+              <w:t>2027 – 2029</w:t>
             </w:r>
           </w:p>
         </w:tc>
-      </w:tr>
-      <w:tr>
         <w:tc>
           <w:tcPr>
-            <w:tcW w:type="dxa" w:w="4819"/>
+            <w:tcW w:type="dxa" w:w="227"/>
+            <w:shd w:val="clear" w:color="auto" w:fill="FFFFFF"/>
+            <w:tcBorders>
+              <w:top w:val="nil"/>
+              <w:left w:val="nil"/>
+              <w:bottom w:val="nil"/>
+              <w:right w:val="nil"/>
+              <w:insideH w:val="nil"/>
+              <w:insideV w:val="nil"/>
+            </w:tcBorders>
+          </w:tcPr>
+          <w:p>
+            <w:pPr>
+              <w:spacing w:before="120"/>
+              <w:jc w:val="center"/>
+            </w:pPr>
+            <w:r>
+              <w:rPr>
+                <w:b/>
+                <w:i w:val="0"/>
+                <w:color w:val="1E7E34"/>
+                <w:sz w:val="20"/>
+              </w:rPr>
+              <w:t>►</w:t>
+            </w:r>
+          </w:p>
+        </w:tc>
+        <w:tc>
+          <w:tcPr>
+            <w:tcW w:type="dxa" w:w="3213"/>
             <w:shd w:val="clear" w:color="auto" w:fill="F2F2F2"/>
             <w:tcBorders>
               <w:top w:val="nil"/>
@@ -14907,22 +14865,174 @@
           </w:tcPr>
           <w:p>
             <w:pPr>
+              <w:spacing w:before="80" w:after="20"/>
+              <w:ind w:left="113"/>
+            </w:pPr>
+            <w:r>
+              <w:rPr>
+                <w:b/>
+                <w:i w:val="0"/>
+                <w:color w:val="004787"/>
+                <w:sz w:val="20"/>
+              </w:rPr>
+              <w:t>Uitrol naar alle poliklinieken</w:t>
+            </w:r>
+          </w:p>
+          <w:p>
+            <w:pPr>
+              <w:spacing w:before="0" w:after="80"/>
+              <w:ind w:left="113"/>
+            </w:pPr>
+            <w:r>
+              <w:rPr>
+                <w:color w:val="3A3A3A"/>
+                <w:sz w:val="19"/>
+              </w:rPr>
+              <w:t>Met de doorbraakmiddelen wordt de uitrol naar alle poli's gefinancierd: training adviseurs, koppelingen, API-kosten, meting en rapportage.</w:t>
+            </w:r>
+          </w:p>
+        </w:tc>
+      </w:tr>
+    </w:tbl>
+    <w:p>
+      <w:pPr>
+        <w:spacing w:after="40"/>
+      </w:pPr>
+    </w:p>
+    <w:p>
+      <w:r>
+        <w:br w:type="page"/>
+      </w:r>
+    </w:p>
+    <w:p>
+      <w:pPr>
+        <w:spacing w:before="80" w:after="60"/>
+      </w:pPr>
+      <w:r>
+        <w:rPr>
+          <w:b/>
+          <w:color w:val="004787"/>
+          <w:sz w:val="24"/>
+        </w:rPr>
+        <w:t>Hoe stel je een goede nulmeting op? (doe dit nú)</w:t>
+      </w:r>
+    </w:p>
+    <w:p>
+      <w:pPr>
+        <w:spacing w:before="0" w:after="100"/>
+        <w:jc w:val="left"/>
+      </w:pPr>
+      <w:r>
+        <w:rPr>
+          <w:b w:val="0"/>
+          <w:i w:val="0"/>
+          <w:color w:val="3A3A3A"/>
+          <w:sz w:val="20"/>
+        </w:rPr>
+        <w:t>De nulmeting is de fundering van je aanvraag. Zonder een betrouwbare nulmeting heb je geen bewijs van arbeidsbesparing — en zonder dat bewijs wordt de aanvraag afgewezen. De meting hoeft niet wetenschappelijk perfect te zijn, maar moet wel methodisch onderbouwd zijn.</w:t>
+      </w:r>
+    </w:p>
+    <w:tbl>
+      <w:tblPr>
+        <w:tblW w:type="auto" w:w="0"/>
+        <w:jc w:val="left"/>
+        <w:tblLook w:firstColumn="1" w:firstRow="1" w:lastColumn="0" w:lastRow="0" w:noHBand="0" w:noVBand="1" w:val="04A0"/>
+      </w:tblPr>
+      <w:tblGrid>
+        <w:gridCol w:w="3213"/>
+        <w:gridCol w:w="3213"/>
+        <w:gridCol w:w="3213"/>
+      </w:tblGrid>
+      <w:tr>
+        <w:tc>
+          <w:tcPr>
+            <w:tcW w:type="dxa" w:w="3213"/>
+            <w:shd w:val="clear" w:color="auto" w:fill="004787"/>
+            <w:tcBorders>
+              <w:top w:val="nil"/>
+              <w:left w:val="nil"/>
+              <w:bottom w:val="nil"/>
+              <w:right w:val="nil"/>
+              <w:insideH w:val="nil"/>
+              <w:insideV w:val="nil"/>
+            </w:tcBorders>
+          </w:tcPr>
+          <w:p>
+            <w:pPr>
               <w:spacing w:before="60" w:after="60"/>
               <w:ind w:left="113"/>
             </w:pPr>
             <w:r>
               <w:rPr>
-                <w:b w:val="0"/>
-                <w:color w:val="3A3A3A"/>
-                <w:sz w:val="19"/>
-              </w:rPr>
-              <w:t>Real-time bezettingsdashboard</w:t>
+                <w:b/>
+                <w:color w:val="FFFFFF"/>
+                <w:sz w:val="18"/>
+              </w:rPr>
+              <w:t>Wat meten</w:t>
             </w:r>
           </w:p>
         </w:tc>
         <w:tc>
           <w:tcPr>
-            <w:tcW w:type="dxa" w:w="4819"/>
+            <w:tcW w:type="dxa" w:w="3213"/>
+            <w:shd w:val="clear" w:color="auto" w:fill="004787"/>
+            <w:tcBorders>
+              <w:top w:val="nil"/>
+              <w:left w:val="nil"/>
+              <w:bottom w:val="nil"/>
+              <w:right w:val="nil"/>
+              <w:insideH w:val="nil"/>
+              <w:insideV w:val="nil"/>
+            </w:tcBorders>
+          </w:tcPr>
+          <w:p>
+            <w:pPr>
+              <w:spacing w:before="60" w:after="60"/>
+              <w:ind w:left="113"/>
+            </w:pPr>
+            <w:r>
+              <w:rPr>
+                <w:b/>
+                <w:color w:val="FFFFFF"/>
+                <w:sz w:val="18"/>
+              </w:rPr>
+              <w:t>Hoe meten</w:t>
+            </w:r>
+          </w:p>
+        </w:tc>
+        <w:tc>
+          <w:tcPr>
+            <w:tcW w:type="dxa" w:w="3213"/>
+            <w:shd w:val="clear" w:color="auto" w:fill="004787"/>
+            <w:tcBorders>
+              <w:top w:val="nil"/>
+              <w:left w:val="nil"/>
+              <w:bottom w:val="nil"/>
+              <w:right w:val="nil"/>
+              <w:insideH w:val="nil"/>
+              <w:insideV w:val="nil"/>
+            </w:tcBorders>
+          </w:tcPr>
+          <w:p>
+            <w:pPr>
+              <w:spacing w:before="60" w:after="60"/>
+              <w:ind w:left="113"/>
+            </w:pPr>
+            <w:r>
+              <w:rPr>
+                <w:b/>
+                <w:color w:val="FFFFFF"/>
+                <w:sz w:val="18"/>
+              </w:rPr>
+              <w:t>Waarmee vastleggen</w:t>
+            </w:r>
+          </w:p>
+        </w:tc>
+      </w:tr>
+      <w:tr>
+        <w:tc>
+          <w:tcPr>
+            <w:tcW w:type="dxa" w:w="3213"/>
             <w:shd w:val="clear" w:color="auto" w:fill="F2F2F2"/>
             <w:tcBorders>
               <w:top w:val="nil"/>
@@ -14944,7 +15054,63 @@
                 <w:color w:val="3A3A3A"/>
                 <w:sz w:val="19"/>
               </w:rPr>
-              <w:t>Actuele bezetting SEH-bedden, wachtende patiënten, doorlooptijd triage t/m ontslag</w:t>
+              <w:t>Uren per rooster per poli</w:t>
+            </w:r>
+          </w:p>
+        </w:tc>
+        <w:tc>
+          <w:tcPr>
+            <w:tcW w:type="dxa" w:w="3213"/>
+            <w:shd w:val="clear" w:color="auto" w:fill="F2F2F2"/>
+            <w:tcBorders>
+              <w:top w:val="nil"/>
+              <w:left w:val="nil"/>
+              <w:bottom w:val="nil"/>
+              <w:right w:val="nil"/>
+              <w:insideH w:val="nil"/>
+              <w:insideV w:val="nil"/>
+            </w:tcBorders>
+          </w:tcPr>
+          <w:p>
+            <w:pPr>
+              <w:spacing w:before="60" w:after="60"/>
+              <w:ind w:left="113"/>
+            </w:pPr>
+            <w:r>
+              <w:rPr>
+                <w:b w:val="0"/>
+                <w:color w:val="3A3A3A"/>
+                <w:sz w:val="19"/>
+              </w:rPr>
+              <w:t>Vraag de tactische plan adviseur bij te houden hoeveel uur per roosterronde</w:t>
+            </w:r>
+          </w:p>
+        </w:tc>
+        <w:tc>
+          <w:tcPr>
+            <w:tcW w:type="dxa" w:w="3213"/>
+            <w:shd w:val="clear" w:color="auto" w:fill="F2F2F2"/>
+            <w:tcBorders>
+              <w:top w:val="nil"/>
+              <w:left w:val="nil"/>
+              <w:bottom w:val="nil"/>
+              <w:right w:val="nil"/>
+              <w:insideH w:val="nil"/>
+              <w:insideV w:val="nil"/>
+            </w:tcBorders>
+          </w:tcPr>
+          <w:p>
+            <w:pPr>
+              <w:spacing w:before="60" w:after="60"/>
+              <w:ind w:left="113"/>
+            </w:pPr>
+            <w:r>
+              <w:rPr>
+                <w:b w:val="0"/>
+                <w:color w:val="3A3A3A"/>
+                <w:sz w:val="19"/>
+              </w:rPr>
+              <w:t>Tijdregistratie Excel, urenformulier of bestaand tijdschrijfsysteem</w:t>
             </w:r>
           </w:p>
         </w:tc>
@@ -14952,7 +15118,7 @@
       <w:tr>
         <w:tc>
           <w:tcPr>
-            <w:tcW w:type="dxa" w:w="4819"/>
+            <w:tcW w:type="dxa" w:w="3213"/>
             <w:shd w:val="clear" w:color="auto" w:fill="FFFFFF"/>
             <w:tcBorders>
               <w:top w:val="nil"/>
@@ -14974,13 +15140,13 @@
                 <w:color w:val="3A3A3A"/>
                 <w:sz w:val="19"/>
               </w:rPr>
-              <w:t>Historische trend-analyse</w:t>
+              <w:t>Aantal iteraties per rooster</w:t>
             </w:r>
           </w:p>
         </w:tc>
         <w:tc>
           <w:tcPr>
-            <w:tcW w:type="dxa" w:w="4819"/>
+            <w:tcW w:type="dxa" w:w="3213"/>
             <w:shd w:val="clear" w:color="auto" w:fill="FFFFFF"/>
             <w:tcBorders>
               <w:top w:val="nil"/>
@@ -15002,7 +15168,35 @@
                 <w:color w:val="3A3A3A"/>
                 <w:sz w:val="19"/>
               </w:rPr>
-              <w:t>Piektijden per dag/week/maand, seizoenspatronen, type aanmeldingen</w:t>
+              <w:t>Hoe vaak wordt een concept-rooster aangepast voor het definitief is?</w:t>
+            </w:r>
+          </w:p>
+        </w:tc>
+        <w:tc>
+          <w:tcPr>
+            <w:tcW w:type="dxa" w:w="3213"/>
+            <w:shd w:val="clear" w:color="auto" w:fill="FFFFFF"/>
+            <w:tcBorders>
+              <w:top w:val="nil"/>
+              <w:left w:val="nil"/>
+              <w:bottom w:val="nil"/>
+              <w:right w:val="nil"/>
+              <w:insideH w:val="nil"/>
+              <w:insideV w:val="nil"/>
+            </w:tcBorders>
+          </w:tcPr>
+          <w:p>
+            <w:pPr>
+              <w:spacing w:before="60" w:after="60"/>
+              <w:ind w:left="113"/>
+            </w:pPr>
+            <w:r>
+              <w:rPr>
+                <w:b w:val="0"/>
+                <w:color w:val="3A3A3A"/>
+                <w:sz w:val="19"/>
+              </w:rPr>
+              <w:t>Noteer per poli het gemiddeld aantal revisies</w:t>
             </w:r>
           </w:p>
         </w:tc>
@@ -15010,7 +15204,7 @@
       <w:tr>
         <w:tc>
           <w:tcPr>
-            <w:tcW w:type="dxa" w:w="4819"/>
+            <w:tcW w:type="dxa" w:w="3213"/>
             <w:shd w:val="clear" w:color="auto" w:fill="F2F2F2"/>
             <w:tcBorders>
               <w:top w:val="nil"/>
@@ -15032,13 +15226,13 @@
                 <w:color w:val="3A3A3A"/>
                 <w:sz w:val="19"/>
               </w:rPr>
-              <w:t>Scenario-analyse: zorgafbuiging</w:t>
+              <w:t>% direct bruikbaar (baseline)</w:t>
             </w:r>
           </w:p>
         </w:tc>
         <w:tc>
           <w:tcPr>
-            <w:tcW w:type="dxa" w:w="4819"/>
+            <w:tcW w:type="dxa" w:w="3213"/>
             <w:shd w:val="clear" w:color="auto" w:fill="F2F2F2"/>
             <w:tcBorders>
               <w:top w:val="nil"/>
@@ -15060,7 +15254,35 @@
                 <w:color w:val="3A3A3A"/>
                 <w:sz w:val="19"/>
               </w:rPr>
-              <w:t>Simuleer: 'Als we X% HAP-waardig aanbod afbuigen → hoeveel capaciteit vrij?'</w:t>
+              <w:t>Hoeveel van het handmatig gemaakte rooster klopt direct? (om later 85% AI te vergelijken)</w:t>
+            </w:r>
+          </w:p>
+        </w:tc>
+        <w:tc>
+          <w:tcPr>
+            <w:tcW w:type="dxa" w:w="3213"/>
+            <w:shd w:val="clear" w:color="auto" w:fill="F2F2F2"/>
+            <w:tcBorders>
+              <w:top w:val="nil"/>
+              <w:left w:val="nil"/>
+              <w:bottom w:val="nil"/>
+              <w:right w:val="nil"/>
+              <w:insideH w:val="nil"/>
+              <w:insideV w:val="nil"/>
+            </w:tcBorders>
+          </w:tcPr>
+          <w:p>
+            <w:pPr>
+              <w:spacing w:before="60" w:after="60"/>
+              <w:ind w:left="113"/>
+            </w:pPr>
+            <w:r>
+              <w:rPr>
+                <w:b w:val="0"/>
+                <w:color w:val="3A3A3A"/>
+                <w:sz w:val="19"/>
+              </w:rPr>
+              <w:t>Schatting door de adviseur zelf op een schaal van 0-100%</w:t>
             </w:r>
           </w:p>
         </w:tc>
@@ -15068,7 +15290,7 @@
       <w:tr>
         <w:tc>
           <w:tcPr>
-            <w:tcW w:type="dxa" w:w="4819"/>
+            <w:tcW w:type="dxa" w:w="3213"/>
             <w:shd w:val="clear" w:color="auto" w:fill="FFFFFF"/>
             <w:tcBorders>
               <w:top w:val="nil"/>
@@ -15090,13 +15312,13 @@
                 <w:color w:val="3A3A3A"/>
                 <w:sz w:val="19"/>
               </w:rPr>
-              <w:t>Scenario-analyse: personeelsbezetting</w:t>
+              <w:t>Aantal poli's dat nu handmatig geroosterd wordt</w:t>
             </w:r>
           </w:p>
         </w:tc>
         <w:tc>
           <w:tcPr>
-            <w:tcW w:type="dxa" w:w="4819"/>
+            <w:tcW w:type="dxa" w:w="3213"/>
             <w:shd w:val="clear" w:color="auto" w:fill="FFFFFF"/>
             <w:tcBorders>
               <w:top w:val="nil"/>
@@ -15118,7 +15340,35 @@
                 <w:color w:val="3A3A3A"/>
                 <w:sz w:val="19"/>
               </w:rPr>
-              <w:t>Simuleer: 'Als we 1 arts minder hebben op zondagnacht → wat is impact op wachttijden?'</w:t>
+              <w:t>Inventariseer voor hoeveel poli's nu roosters gemaakt worden</w:t>
+            </w:r>
+          </w:p>
+        </w:tc>
+        <w:tc>
+          <w:tcPr>
+            <w:tcW w:type="dxa" w:w="3213"/>
+            <w:shd w:val="clear" w:color="auto" w:fill="FFFFFF"/>
+            <w:tcBorders>
+              <w:top w:val="nil"/>
+              <w:left w:val="nil"/>
+              <w:bottom w:val="nil"/>
+              <w:right w:val="nil"/>
+              <w:insideH w:val="nil"/>
+              <w:insideV w:val="nil"/>
+            </w:tcBorders>
+          </w:tcPr>
+          <w:p>
+            <w:pPr>
+              <w:spacing w:before="60" w:after="60"/>
+              <w:ind w:left="113"/>
+            </w:pPr>
+            <w:r>
+              <w:rPr>
+                <w:b w:val="0"/>
+                <w:color w:val="3A3A3A"/>
+                <w:sz w:val="19"/>
+              </w:rPr>
+              <w:t>Lijst van poliklinieken + verantwoordelijke adviseur</w:t>
             </w:r>
           </w:p>
         </w:tc>
@@ -15126,7 +15376,7 @@
       <w:tr>
         <w:tc>
           <w:tcPr>
-            <w:tcW w:type="dxa" w:w="4819"/>
+            <w:tcW w:type="dxa" w:w="3213"/>
             <w:shd w:val="clear" w:color="auto" w:fill="F2F2F2"/>
             <w:tcBorders>
               <w:top w:val="nil"/>
@@ -15148,13 +15398,13 @@
                 <w:color w:val="3A3A3A"/>
                 <w:sz w:val="19"/>
               </w:rPr>
-              <w:t>Integratie</w:t>
+              <w:t>Doorlooptijd van aanvraag tot definitief rooster</w:t>
             </w:r>
           </w:p>
         </w:tc>
         <w:tc>
           <w:tcPr>
-            <w:tcW w:type="dxa" w:w="4819"/>
+            <w:tcW w:type="dxa" w:w="3213"/>
             <w:shd w:val="clear" w:color="auto" w:fill="F2F2F2"/>
             <w:tcBorders>
               <w:top w:val="nil"/>
@@ -15176,16 +15426,14 @@
                 <w:color w:val="3A3A3A"/>
                 <w:sz w:val="19"/>
               </w:rPr>
-              <w:t>Koppeling met ZIS/EPD (bijv. HiX, Epic, EPIC) voor live datafeed</w:t>
+              <w:t>Hoeveel werkdagen zitten er tussen de opdracht en het definitieve rooster?</w:t>
             </w:r>
           </w:p>
         </w:tc>
-      </w:tr>
-      <w:tr>
         <w:tc>
           <w:tcPr>
-            <w:tcW w:type="dxa" w:w="4819"/>
-            <w:shd w:val="clear" w:color="auto" w:fill="FFFFFF"/>
+            <w:tcW w:type="dxa" w:w="3213"/>
+            <w:shd w:val="clear" w:color="auto" w:fill="F2F2F2"/>
             <w:tcBorders>
               <w:top w:val="nil"/>
               <w:left w:val="nil"/>
@@ -15206,35 +15454,7 @@
                 <w:color w:val="3A3A3A"/>
                 <w:sz w:val="19"/>
               </w:rPr>
-              <w:t>Modelplan aansluiting</w:t>
-            </w:r>
-          </w:p>
-        </w:tc>
-        <w:tc>
-          <w:tcPr>
-            <w:tcW w:type="dxa" w:w="4819"/>
-            <w:shd w:val="clear" w:color="auto" w:fill="FFFFFF"/>
-            <w:tcBorders>
-              <w:top w:val="nil"/>
-              <w:left w:val="nil"/>
-              <w:bottom w:val="nil"/>
-              <w:right w:val="nil"/>
-              <w:insideH w:val="nil"/>
-              <w:insideV w:val="nil"/>
-            </w:tcBorders>
-          </w:tcPr>
-          <w:p>
-            <w:pPr>
-              <w:spacing w:before="60" w:after="60"/>
-              <w:ind w:left="113"/>
-            </w:pPr>
-            <w:r>
-              <w:rPr>
-                <w:b w:val="0"/>
-                <w:color w:val="3A3A3A"/>
-                <w:sz w:val="19"/>
-              </w:rPr>
-              <w:t>MP01 – Capaciteitsplanning met AI (SEH valt onder MSZ/Zvw)</w:t>
+              <w:t>Datum van opdracht vs. datum akkoord rooster</w:t>
             </w:r>
           </w:p>
         </w:tc>
@@ -15279,7 +15499,7 @@
                 <w:color w:val="FFFFFF"/>
                 <w:sz w:val="22"/>
               </w:rPr>
-              <w:t>💡  Waarom is het scenario-analysedeel zo waardevol voor de aanvraag?</w:t>
+              <w:t>💡  Praktisch: zo start je de nulmeting morgen</w:t>
             </w:r>
           </w:p>
         </w:tc>
@@ -15317,7 +15537,7 @@
                 <w:color w:val="3A3A3A"/>
                 <w:sz w:val="20"/>
               </w:rPr>
-              <w:t>Scenario-analyse toont aan dat de tool niet alleen rapporteert maar ook voorspelt en adviseert — dit is 'AI' in de echte zin.</w:t>
+              <w:t>Maak een simpel Excel-formulier met kolommen: datum, poli-naam, uren besteed, aantal revisies, opmerkingen.</w:t>
             </w:r>
           </w:p>
           <w:p>
@@ -15338,7 +15558,7 @@
                 <w:color w:val="3A3A3A"/>
                 <w:sz w:val="20"/>
               </w:rPr>
-              <w:t>Het afbuigen van zorg (bijv. naar HAP) heeft directe impact op de SEH-werkdruk: dit is aantoonbare arbeidsbesparing via capaciteitsoptimalisatie.</w:t>
+              <w:t>Vraag de tactische plan adviseur(s) dit formulier 4 weken bij te houden vóórdat de tool in gebruik gaat.</w:t>
             </w:r>
           </w:p>
           <w:p>
@@ -15359,7 +15579,7 @@
                 <w:color w:val="3A3A3A"/>
                 <w:sz w:val="20"/>
               </w:rPr>
-              <w:t>U kunt met dit dashboard precies onderbouwen hoeveel uren/FTE bespaard worden per scenario — ideaal voor de nulmeting en mijlpaalonderbouwing.</w:t>
+              <w:t>Vier weken is genoeg voor een betrouwbare baseline — langere meting is beter maar niet altijd haalbaar.</w:t>
             </w:r>
           </w:p>
           <w:p>
@@ -15380,7 +15600,7 @@
                 <w:color w:val="3A3A3A"/>
                 <w:sz w:val="20"/>
               </w:rPr>
-              <w:t>Het dashboard kan ook worden ingezet voor ketensamenwerking (SEH + HAP + huisarts) — dit raakt aan regionaal capaciteitsbeheer.</w:t>
+              <w:t>Bewaar de nulmeting als officieel document met datum en naam van de invuller — dit is je bewijsstuk.</w:t>
             </w:r>
           </w:p>
           <w:p>
@@ -15401,7 +15621,7 @@
                 <w:color w:val="3A3A3A"/>
                 <w:sz w:val="20"/>
               </w:rPr>
-              <w:t>Let op: als het dashboard data van meerdere instellingen verwerkt, gelden extra privacy-vereisten (NTA 8028, data-overeenkomst).</w:t>
+              <w:t>Herhaal dezelfde meting na 6 weken gebruik van de tool voor de nameting (mijlpaalbewijs).</w:t>
             </w:r>
           </w:p>
           <w:p>
@@ -15419,15 +15639,7 @@
     </w:p>
     <w:p>
       <w:pPr>
-        <w:spacing w:before="120" w:after="120"/>
-        <w:pBdr>
-          <w:bottom w:val="single" w:sz="6" w:space="1" w:color="004787"/>
-        </w:pBdr>
-      </w:pPr>
-    </w:p>
-    <w:p>
-      <w:pPr>
-        <w:spacing w:before="120" w:after="80"/>
+        <w:spacing w:before="160" w:after="60"/>
       </w:pPr>
       <w:r>
         <w:rPr>
@@ -15435,7 +15647,22 @@
           <w:color w:val="004787"/>
           <w:sz w:val="24"/>
         </w:rPr>
-        <w:t>Overzicht: Wat mag wel en niet met zelf gebouwde AI-tools?</w:t>
+        <w:t>Wat kan het ziekenhuis financieren via de doorbraakmiddelen?</w:t>
+      </w:r>
+    </w:p>
+    <w:p>
+      <w:pPr>
+        <w:spacing w:before="0" w:after="100"/>
+        <w:jc w:val="left"/>
+      </w:pPr>
+      <w:r>
+        <w:rPr>
+          <w:b w:val="0"/>
+          <w:i w:val="0"/>
+          <w:color w:val="3A3A3A"/>
+          <w:sz w:val="20"/>
+        </w:rPr>
+        <w:t>Omdat jij de tool nu al bouwt (in eigen tijd, als onderdeel van je functie), zijn de pure bouwkosten waarschijnlijk niet meer additioneel. Dat is geen probleem: de doorbraakmiddelen zijn bedoeld voor de opschaling — en die staat nog volledig open.</w:t>
       </w:r>
     </w:p>
     <w:tbl>
@@ -15473,7 +15700,7 @@
                 <w:color w:val="FFFFFF"/>
                 <w:sz w:val="21"/>
               </w:rPr>
-              <w:t>✓  Zelf gebouwde tool MAG kwalificeren als:</w:t>
+              <w:t>✓  Wat WEL gefinancierd kan worden</w:t>
             </w:r>
           </w:p>
         </w:tc>
@@ -15501,7 +15728,7 @@
                 <w:color w:val="FFFFFF"/>
                 <w:sz w:val="21"/>
               </w:rPr>
-              <w:t>✗  Zelf gebouwde tool kwalificeert NIET als:</w:t>
+              <w:t>✗  Wat NIET gefinancierd kan worden</w:t>
             </w:r>
           </w:p>
         </w:tc>
@@ -15539,7 +15766,7 @@
                 <w:color w:val="3A3A3A"/>
                 <w:sz w:val="20"/>
               </w:rPr>
-              <w:t>De tool aantoonbaar arbeidsbesparend werkt (meting, nulmeting, data)</w:t>
+              <w:t>Uitrol van de tool naar álle poliklinieken in het ziekenhuis (nu misschien 1-2, doel is alle poli's)</w:t>
             </w:r>
           </w:p>
           <w:p>
@@ -15560,7 +15787,7 @@
                 <w:color w:val="3A3A3A"/>
                 <w:sz w:val="20"/>
               </w:rPr>
-              <w:t>De tool valt binnen een van de 5 vastgestelde modelplannen</w:t>
+              <w:t>Training van alle tactische plan adviseurs die de tool gaan gebruiken</w:t>
             </w:r>
           </w:p>
           <w:p>
@@ -15581,7 +15808,7 @@
                 <w:color w:val="3A3A3A"/>
                 <w:sz w:val="20"/>
               </w:rPr>
-              <w:t>De zorg die de tool ondersteunt valt onder de Zvw</w:t>
+              <w:t>Koppeling van de tool aan HIS, planningssystemen of datawarehouses</w:t>
             </w:r>
           </w:p>
           <w:p>
@@ -15602,7 +15829,7 @@
                 <w:color w:val="3A3A3A"/>
                 <w:sz w:val="20"/>
               </w:rPr>
-              <w:t>Er een DPIA en verwerkersovereenkomst aanwezig is</w:t>
+              <w:t>Licentiekosten voor de AI-API (bijv. Azure OpenAI, Claude API) voor 2027, 2028 en 2029</w:t>
             </w:r>
           </w:p>
           <w:p>
@@ -15623,7 +15850,7 @@
                 <w:color w:val="3A3A3A"/>
                 <w:sz w:val="20"/>
               </w:rPr>
-              <w:t>De tool voldoet aan NEN 7510 / NEN 7512 voor informatiebeveiliging</w:t>
+              <w:t>Kosten voor privacy-compliance: DPIA, verwerkersovereenkomst, security audit</w:t>
             </w:r>
           </w:p>
           <w:p>
@@ -15644,7 +15871,7 @@
                 <w:color w:val="3A3A3A"/>
                 <w:sz w:val="20"/>
               </w:rPr>
-              <w:t>Patiëntdata uitsluitend op Europese servers wordt verwerkt (AVG)</w:t>
+              <w:t>Eventuele externe validatie of Digizo.nu-toetsing van de tool</w:t>
             </w:r>
           </w:p>
           <w:p>
@@ -15665,7 +15892,7 @@
                 <w:color w:val="3A3A3A"/>
                 <w:sz w:val="20"/>
               </w:rPr>
-              <w:t>De tool is geïntegreerd met het bestaande EPD/HIS/RIS</w:t>
+              <w:t>Interne projecturen voor begeleiding van de implementatie (mits aantoonbaar additioneel)</w:t>
             </w:r>
           </w:p>
           <w:p>
@@ -15686,7 +15913,7 @@
                 <w:color w:val="3A3A3A"/>
                 <w:sz w:val="20"/>
               </w:rPr>
-              <w:t>Er intern draagvlak is (OR, medewerkers, management)</w:t>
+              <w:t>Meting en rapportage: uren voor KPI-monitoring en mijlpaalverantwoording</w:t>
             </w:r>
           </w:p>
           <w:p>
@@ -15707,28 +15934,7 @@
                 <w:color w:val="3A3A3A"/>
                 <w:sz w:val="20"/>
               </w:rPr>
-              <w:t>Ontwikkelkosten aantoonbaar zijn (intern uren of extern factuur)</w:t>
-            </w:r>
-          </w:p>
-          <w:p>
-            <w:pPr>
-              <w:spacing w:before="20" w:after="40"/>
-              <w:ind w:left="227" w:hanging="227"/>
-            </w:pPr>
-            <w:r>
-              <w:rPr>
-                <w:b/>
-                <w:color w:val="1E7E34"/>
-                <w:sz w:val="20"/>
-              </w:rPr>
-              <w:t xml:space="preserve">✓  </w:t>
-            </w:r>
-            <w:r>
-              <w:rPr>
-                <w:color w:val="3A3A3A"/>
-                <w:sz w:val="20"/>
-              </w:rPr>
-              <w:t>De tool structureel wordt ingezet, niet eenmalig</w:t>
+              <w:t>Uitbreiding naar nieuwe functionaliteiten (bijv. scenario-analyse of radiologie-module)</w:t>
             </w:r>
           </w:p>
         </w:tc>
@@ -15764,7 +15970,7 @@
                 <w:color w:val="3A3A3A"/>
                 <w:sz w:val="20"/>
               </w:rPr>
-              <w:t>Er geen bewijs van effectiviteit is (alleen 'het werkt goed' is niet genoeg)</w:t>
+              <w:t>Ontwikkelkosten die al zijn gemaakt vóór de toekenning (additionaliteitsvereiste)</w:t>
             </w:r>
           </w:p>
           <w:p>
@@ -15785,7 +15991,7 @@
                 <w:color w:val="3A3A3A"/>
                 <w:sz w:val="20"/>
               </w:rPr>
-              <w:t>De tool nog in pilot-fase zit op moment van aanvraag</w:t>
+              <w:t>Reguliere salariskosten van jou als ICM-medewerker die de tool bouwt</w:t>
             </w:r>
           </w:p>
           <w:p>
@@ -15806,7 +16012,7 @@
                 <w:color w:val="3A3A3A"/>
                 <w:sz w:val="20"/>
               </w:rPr>
-              <w:t>De tool Wlz- of WMO-gefinancierde zorg ondersteunt</w:t>
+              <w:t>Hardware (laptops, servers) die al aanwezig zijn of via regulier budget gaan</w:t>
             </w:r>
           </w:p>
           <w:p>
@@ -15827,7 +16033,7 @@
                 <w:color w:val="3A3A3A"/>
                 <w:sz w:val="20"/>
               </w:rPr>
-              <w:t>Er geen privacy-documentatie aanwezig is (DPIA ontbreekt)</w:t>
+              <w:t>Roostering van Wlz-gefinancierde zorg (verpleeghuizen, volledig pakket thuis)</w:t>
             </w:r>
           </w:p>
           <w:p>
@@ -15848,7 +16054,7 @@
                 <w:color w:val="3A3A3A"/>
                 <w:sz w:val="20"/>
               </w:rPr>
-              <w:t>Patiëntdata via buitenlandse (bijv. VS) AI-servers wordt verwerkt zonder EU-addendum</w:t>
+              <w:t>WMO-activiteiten of gemeentelijk gefinancierde zorg</w:t>
             </w:r>
           </w:p>
           <w:p>
@@ -15869,7 +16075,7 @@
                 <w:color w:val="3A3A3A"/>
                 <w:sz w:val="20"/>
               </w:rPr>
-              <w:t>De tool al gefinancierd wordt via andere budgetten of subsidies</w:t>
+              <w:t>Kosten die al gedekt worden via andere zorginkoop of subsidies</w:t>
             </w:r>
           </w:p>
           <w:p>
@@ -15890,7 +16096,7 @@
                 <w:color w:val="3A3A3A"/>
                 <w:sz w:val="20"/>
               </w:rPr>
-              <w:t>Ontwikkelkosten al zijn gemaakt vóór toekenning (additionaliteit!)</w:t>
+              <w:t>Tools die nog niet zijn getest en nog geen bewijs van effectiviteit hebben</w:t>
             </w:r>
           </w:p>
           <w:p>
@@ -15911,49 +16117,7 @@
                 <w:color w:val="3A3A3A"/>
                 <w:sz w:val="20"/>
               </w:rPr>
-              <w:t>De tool niet aansluit bij een van de 5 modelplannen</w:t>
-            </w:r>
-          </w:p>
-          <w:p>
-            <w:pPr>
-              <w:spacing w:before="20" w:after="40"/>
-              <w:ind w:left="227" w:hanging="227"/>
-            </w:pPr>
-            <w:r>
-              <w:rPr>
-                <w:b/>
-                <w:color w:val="C0392B"/>
-                <w:sz w:val="20"/>
-              </w:rPr>
-              <w:t xml:space="preserve">✗  </w:t>
-            </w:r>
-            <w:r>
-              <w:rPr>
-                <w:color w:val="3A3A3A"/>
-                <w:sz w:val="20"/>
-              </w:rPr>
-              <w:t>Er geen koppeling is met bestaande zorgregistratiesystemen</w:t>
-            </w:r>
-          </w:p>
-          <w:p>
-            <w:pPr>
-              <w:spacing w:before="20" w:after="40"/>
-              <w:ind w:left="227" w:hanging="227"/>
-            </w:pPr>
-            <w:r>
-              <w:rPr>
-                <w:b/>
-                <w:color w:val="C0392B"/>
-                <w:sz w:val="20"/>
-              </w:rPr>
-              <w:t xml:space="preserve">✗  </w:t>
-            </w:r>
-            <w:r>
-              <w:rPr>
-                <w:color w:val="3A3A3A"/>
-                <w:sz w:val="20"/>
-              </w:rPr>
-              <w:t>De tool door slechts één persoon wordt gebruikt (geen organisatiebrede inzet)</w:t>
+              <w:t>Aanpassingen die puur administratief zijn zonder aantoonbare arbeidsbesparingskoppeling</w:t>
             </w:r>
           </w:p>
         </w:tc>
@@ -16006,7 +16170,757 @@
     </w:p>
     <w:p>
       <w:pPr>
-        <w:spacing w:before="120" w:after="80"/>
+        <w:spacing w:before="120" w:after="60"/>
+      </w:pPr>
+      <w:r>
+        <w:rPr>
+          <w:b/>
+          <w:color w:val="5A2D91"/>
+          <w:sz w:val="24"/>
+        </w:rPr>
+        <w:t>Waarom de tactische plan adviseur als gebruiker sterk is voor de aanvraag</w:t>
+      </w:r>
+    </w:p>
+    <w:p>
+      <w:pPr>
+        <w:spacing w:before="0" w:after="60"/>
+        <w:ind w:left="340" w:hanging="227"/>
+      </w:pPr>
+      <w:r>
+        <w:rPr>
+          <w:b/>
+          <w:color w:val="5A2D91"/>
+          <w:sz w:val="20"/>
+        </w:rPr>
+        <w:t xml:space="preserve">▸  </w:t>
+      </w:r>
+      <w:r>
+        <w:rPr>
+          <w:color w:val="3A3A3A"/>
+          <w:sz w:val="20"/>
+        </w:rPr>
+        <w:t>Een gespecialiseerde planningsrol als primaire gebruiker toont aan dat het om professioneel en structureel gebruik gaat — niet een eenmalige test.</w:t>
+      </w:r>
+    </w:p>
+    <w:p>
+      <w:pPr>
+        <w:spacing w:before="0" w:after="60"/>
+        <w:ind w:left="340" w:hanging="227"/>
+      </w:pPr>
+      <w:r>
+        <w:rPr>
+          <w:b/>
+          <w:color w:val="5A2D91"/>
+          <w:sz w:val="20"/>
+        </w:rPr>
+        <w:t xml:space="preserve">▸  </w:t>
+      </w:r>
+      <w:r>
+        <w:rPr>
+          <w:color w:val="3A3A3A"/>
+          <w:sz w:val="20"/>
+        </w:rPr>
+        <w:t>De 15% handmatige fine-tuning door de adviseur is een sterke punt: AI-beslissingstools in de zorg vereisen menselijke verificatie — dit zit ingebouwd in jouw tool.</w:t>
+      </w:r>
+    </w:p>
+    <w:p>
+      <w:pPr>
+        <w:spacing w:before="0" w:after="60"/>
+        <w:ind w:left="340" w:hanging="227"/>
+      </w:pPr>
+      <w:r>
+        <w:rPr>
+          <w:b/>
+          <w:color w:val="5A2D91"/>
+          <w:sz w:val="20"/>
+        </w:rPr>
+        <w:t xml:space="preserve">▸  </w:t>
+      </w:r>
+      <w:r>
+        <w:rPr>
+          <w:color w:val="3A3A3A"/>
+          <w:sz w:val="20"/>
+        </w:rPr>
+        <w:t>De adviseur kent de context van elke poli: door de tool te combineren met die expertise is de output beter dan puur algoritmisch.</w:t>
+      </w:r>
+    </w:p>
+    <w:p>
+      <w:pPr>
+        <w:spacing w:before="0" w:after="60"/>
+        <w:ind w:left="340" w:hanging="227"/>
+      </w:pPr>
+      <w:r>
+        <w:rPr>
+          <w:b/>
+          <w:color w:val="5A2D91"/>
+          <w:sz w:val="20"/>
+        </w:rPr>
+        <w:t xml:space="preserve">▸  </w:t>
+      </w:r>
+      <w:r>
+        <w:rPr>
+          <w:color w:val="3A3A3A"/>
+          <w:sz w:val="20"/>
+        </w:rPr>
+        <w:t>Meerdere poli's via één adviseur zorgt voor uniforme implementatie en vergelijkbare meetresultaten — dat maakt de KPI-rapportage eenvoudiger.</w:t>
+      </w:r>
+    </w:p>
+    <w:p>
+      <w:pPr>
+        <w:spacing w:before="0" w:after="60"/>
+        <w:ind w:left="340" w:hanging="227"/>
+      </w:pPr>
+      <w:r>
+        <w:rPr>
+          <w:b/>
+          <w:color w:val="5A2D91"/>
+          <w:sz w:val="20"/>
+        </w:rPr>
+        <w:t xml:space="preserve">▸  </w:t>
+      </w:r>
+      <w:r>
+        <w:rPr>
+          <w:color w:val="3A3A3A"/>
+          <w:sz w:val="20"/>
+        </w:rPr>
+        <w:t>Voor de aanvraag: beschrijf expliciet de rol van de tactische plan adviseur, hoe zij de tool gebruiken en hoe de output gecontroleerd en geaccordeerd wordt.</w:t>
+      </w:r>
+    </w:p>
+    <w:p>
+      <w:pPr>
+        <w:spacing w:before="160" w:after="60"/>
+      </w:pPr>
+      <w:r>
+        <w:rPr>
+          <w:b/>
+          <w:color w:val="C0392B"/>
+          <w:sz w:val="24"/>
+        </w:rPr>
+        <w:t>Privacy: welke data gaat er in de tool en wat betekent dat?</w:t>
+      </w:r>
+    </w:p>
+    <w:tbl>
+      <w:tblPr>
+        <w:tblW w:type="auto" w:w="0"/>
+        <w:jc w:val="left"/>
+        <w:tblLook w:firstColumn="1" w:firstRow="1" w:lastColumn="0" w:lastRow="0" w:noHBand="0" w:noVBand="1" w:val="04A0"/>
+      </w:tblPr>
+      <w:tblGrid>
+        <w:gridCol w:w="3213"/>
+        <w:gridCol w:w="3213"/>
+        <w:gridCol w:w="3213"/>
+      </w:tblGrid>
+      <w:tr>
+        <w:tc>
+          <w:tcPr>
+            <w:tcW w:type="dxa" w:w="3213"/>
+            <w:shd w:val="clear" w:color="auto" w:fill="C0392B"/>
+            <w:tcBorders>
+              <w:top w:val="nil"/>
+              <w:left w:val="nil"/>
+              <w:bottom w:val="nil"/>
+              <w:right w:val="nil"/>
+              <w:insideH w:val="nil"/>
+              <w:insideV w:val="nil"/>
+            </w:tcBorders>
+          </w:tcPr>
+          <w:p>
+            <w:pPr>
+              <w:spacing w:before="60" w:after="60"/>
+              <w:ind w:left="113"/>
+            </w:pPr>
+            <w:r>
+              <w:rPr>
+                <w:b/>
+                <w:color w:val="FFFFFF"/>
+                <w:sz w:val="18"/>
+              </w:rPr>
+              <w:t>Type data in de tool</w:t>
+            </w:r>
+          </w:p>
+        </w:tc>
+        <w:tc>
+          <w:tcPr>
+            <w:tcW w:type="dxa" w:w="3213"/>
+            <w:shd w:val="clear" w:color="auto" w:fill="C0392B"/>
+            <w:tcBorders>
+              <w:top w:val="nil"/>
+              <w:left w:val="nil"/>
+              <w:bottom w:val="nil"/>
+              <w:right w:val="nil"/>
+              <w:insideH w:val="nil"/>
+              <w:insideV w:val="nil"/>
+            </w:tcBorders>
+          </w:tcPr>
+          <w:p>
+            <w:pPr>
+              <w:spacing w:before="60" w:after="60"/>
+              <w:ind w:left="113"/>
+            </w:pPr>
+            <w:r>
+              <w:rPr>
+                <w:b/>
+                <w:color w:val="FFFFFF"/>
+                <w:sz w:val="18"/>
+              </w:rPr>
+              <w:t>Gevoeligheid</w:t>
+            </w:r>
+          </w:p>
+        </w:tc>
+        <w:tc>
+          <w:tcPr>
+            <w:tcW w:type="dxa" w:w="3213"/>
+            <w:shd w:val="clear" w:color="auto" w:fill="C0392B"/>
+            <w:tcBorders>
+              <w:top w:val="nil"/>
+              <w:left w:val="nil"/>
+              <w:bottom w:val="nil"/>
+              <w:right w:val="nil"/>
+              <w:insideH w:val="nil"/>
+              <w:insideV w:val="nil"/>
+            </w:tcBorders>
+          </w:tcPr>
+          <w:p>
+            <w:pPr>
+              <w:spacing w:before="60" w:after="60"/>
+              <w:ind w:left="113"/>
+            </w:pPr>
+            <w:r>
+              <w:rPr>
+                <w:b/>
+                <w:color w:val="FFFFFF"/>
+                <w:sz w:val="18"/>
+              </w:rPr>
+              <w:t>Wat is vereist</w:t>
+            </w:r>
+          </w:p>
+        </w:tc>
+      </w:tr>
+      <w:tr>
+        <w:tc>
+          <w:tcPr>
+            <w:tcW w:type="dxa" w:w="3213"/>
+            <w:shd w:val="clear" w:color="auto" w:fill="F2F2F2"/>
+            <w:tcBorders>
+              <w:top w:val="nil"/>
+              <w:left w:val="nil"/>
+              <w:bottom w:val="nil"/>
+              <w:right w:val="nil"/>
+              <w:insideH w:val="nil"/>
+              <w:insideV w:val="nil"/>
+            </w:tcBorders>
+          </w:tcPr>
+          <w:p>
+            <w:pPr>
+              <w:spacing w:before="60" w:after="60"/>
+              <w:ind w:left="113"/>
+            </w:pPr>
+            <w:r>
+              <w:rPr>
+                <w:b w:val="0"/>
+                <w:color w:val="3A3A3A"/>
+                <w:sz w:val="19"/>
+              </w:rPr>
+              <w:t>Anonieme planningsparameters (capaciteit, normen, beschikbaarheidspercentages)</w:t>
+            </w:r>
+          </w:p>
+        </w:tc>
+        <w:tc>
+          <w:tcPr>
+            <w:tcW w:type="dxa" w:w="3213"/>
+            <w:shd w:val="clear" w:color="auto" w:fill="F2F2F2"/>
+            <w:tcBorders>
+              <w:top w:val="nil"/>
+              <w:left w:val="nil"/>
+              <w:bottom w:val="nil"/>
+              <w:right w:val="nil"/>
+              <w:insideH w:val="nil"/>
+              <w:insideV w:val="nil"/>
+            </w:tcBorders>
+          </w:tcPr>
+          <w:p>
+            <w:pPr>
+              <w:spacing w:before="60" w:after="60"/>
+              <w:ind w:left="113"/>
+            </w:pPr>
+            <w:r>
+              <w:rPr>
+                <w:b w:val="0"/>
+                <w:color w:val="3A3A3A"/>
+                <w:sz w:val="19"/>
+              </w:rPr>
+              <w:t>Laag</w:t>
+            </w:r>
+          </w:p>
+        </w:tc>
+        <w:tc>
+          <w:tcPr>
+            <w:tcW w:type="dxa" w:w="3213"/>
+            <w:shd w:val="clear" w:color="auto" w:fill="F2F2F2"/>
+            <w:tcBorders>
+              <w:top w:val="nil"/>
+              <w:left w:val="nil"/>
+              <w:bottom w:val="nil"/>
+              <w:right w:val="nil"/>
+              <w:insideH w:val="nil"/>
+              <w:insideV w:val="nil"/>
+            </w:tcBorders>
+          </w:tcPr>
+          <w:p>
+            <w:pPr>
+              <w:spacing w:before="60" w:after="60"/>
+              <w:ind w:left="113"/>
+            </w:pPr>
+            <w:r>
+              <w:rPr>
+                <w:b w:val="0"/>
+                <w:color w:val="3A3A3A"/>
+                <w:sz w:val="19"/>
+              </w:rPr>
+              <w:t>Geen bijzondere maatregelen — wel gedocumenteerd houden</w:t>
+            </w:r>
+          </w:p>
+        </w:tc>
+      </w:tr>
+      <w:tr>
+        <w:tc>
+          <w:tcPr>
+            <w:tcW w:type="dxa" w:w="3213"/>
+            <w:shd w:val="clear" w:color="auto" w:fill="FFFFFF"/>
+            <w:tcBorders>
+              <w:top w:val="nil"/>
+              <w:left w:val="nil"/>
+              <w:bottom w:val="nil"/>
+              <w:right w:val="nil"/>
+              <w:insideH w:val="nil"/>
+              <w:insideV w:val="nil"/>
+            </w:tcBorders>
+          </w:tcPr>
+          <w:p>
+            <w:pPr>
+              <w:spacing w:before="60" w:after="60"/>
+              <w:ind w:left="113"/>
+            </w:pPr>
+            <w:r>
+              <w:rPr>
+                <w:b w:val="0"/>
+                <w:color w:val="3A3A3A"/>
+                <w:sz w:val="19"/>
+              </w:rPr>
+              <w:t>Naam + beschikbaarheid medewerkers (artsen, verpleegkundigen)</w:t>
+            </w:r>
+          </w:p>
+        </w:tc>
+        <w:tc>
+          <w:tcPr>
+            <w:tcW w:type="dxa" w:w="3213"/>
+            <w:shd w:val="clear" w:color="auto" w:fill="FFFFFF"/>
+            <w:tcBorders>
+              <w:top w:val="nil"/>
+              <w:left w:val="nil"/>
+              <w:bottom w:val="nil"/>
+              <w:right w:val="nil"/>
+              <w:insideH w:val="nil"/>
+              <w:insideV w:val="nil"/>
+            </w:tcBorders>
+          </w:tcPr>
+          <w:p>
+            <w:pPr>
+              <w:spacing w:before="60" w:after="60"/>
+              <w:ind w:left="113"/>
+            </w:pPr>
+            <w:r>
+              <w:rPr>
+                <w:b w:val="0"/>
+                <w:color w:val="3A3A3A"/>
+                <w:sz w:val="19"/>
+              </w:rPr>
+              <w:t>Middel – personeelsdata</w:t>
+            </w:r>
+          </w:p>
+        </w:tc>
+        <w:tc>
+          <w:tcPr>
+            <w:tcW w:type="dxa" w:w="3213"/>
+            <w:shd w:val="clear" w:color="auto" w:fill="FFFFFF"/>
+            <w:tcBorders>
+              <w:top w:val="nil"/>
+              <w:left w:val="nil"/>
+              <w:bottom w:val="nil"/>
+              <w:right w:val="nil"/>
+              <w:insideH w:val="nil"/>
+              <w:insideV w:val="nil"/>
+            </w:tcBorders>
+          </w:tcPr>
+          <w:p>
+            <w:pPr>
+              <w:spacing w:before="60" w:after="60"/>
+              <w:ind w:left="113"/>
+            </w:pPr>
+            <w:r>
+              <w:rPr>
+                <w:b w:val="0"/>
+                <w:color w:val="3A3A3A"/>
+                <w:sz w:val="19"/>
+              </w:rPr>
+              <w:t>AVG van toepassing: verwerkersovereenkomst met AI-aanbieder, OR informeren</w:t>
+            </w:r>
+          </w:p>
+        </w:tc>
+      </w:tr>
+      <w:tr>
+        <w:tc>
+          <w:tcPr>
+            <w:tcW w:type="dxa" w:w="3213"/>
+            <w:shd w:val="clear" w:color="auto" w:fill="F2F2F2"/>
+            <w:tcBorders>
+              <w:top w:val="nil"/>
+              <w:left w:val="nil"/>
+              <w:bottom w:val="nil"/>
+              <w:right w:val="nil"/>
+              <w:insideH w:val="nil"/>
+              <w:insideV w:val="nil"/>
+            </w:tcBorders>
+          </w:tcPr>
+          <w:p>
+            <w:pPr>
+              <w:spacing w:before="60" w:after="60"/>
+              <w:ind w:left="113"/>
+            </w:pPr>
+            <w:r>
+              <w:rPr>
+                <w:b w:val="0"/>
+                <w:color w:val="3A3A3A"/>
+                <w:sz w:val="19"/>
+              </w:rPr>
+              <w:t>Patiëntenstromen / aantallen per poli (geanonimiseerd)</w:t>
+            </w:r>
+          </w:p>
+        </w:tc>
+        <w:tc>
+          <w:tcPr>
+            <w:tcW w:type="dxa" w:w="3213"/>
+            <w:shd w:val="clear" w:color="auto" w:fill="F2F2F2"/>
+            <w:tcBorders>
+              <w:top w:val="nil"/>
+              <w:left w:val="nil"/>
+              <w:bottom w:val="nil"/>
+              <w:right w:val="nil"/>
+              <w:insideH w:val="nil"/>
+              <w:insideV w:val="nil"/>
+            </w:tcBorders>
+          </w:tcPr>
+          <w:p>
+            <w:pPr>
+              <w:spacing w:before="60" w:after="60"/>
+              <w:ind w:left="113"/>
+            </w:pPr>
+            <w:r>
+              <w:rPr>
+                <w:b w:val="0"/>
+                <w:color w:val="3A3A3A"/>
+                <w:sz w:val="19"/>
+              </w:rPr>
+              <w:t>Middel</w:t>
+            </w:r>
+          </w:p>
+        </w:tc>
+        <w:tc>
+          <w:tcPr>
+            <w:tcW w:type="dxa" w:w="3213"/>
+            <w:shd w:val="clear" w:color="auto" w:fill="F2F2F2"/>
+            <w:tcBorders>
+              <w:top w:val="nil"/>
+              <w:left w:val="nil"/>
+              <w:bottom w:val="nil"/>
+              <w:right w:val="nil"/>
+              <w:insideH w:val="nil"/>
+              <w:insideV w:val="nil"/>
+            </w:tcBorders>
+          </w:tcPr>
+          <w:p>
+            <w:pPr>
+              <w:spacing w:before="60" w:after="60"/>
+              <w:ind w:left="113"/>
+            </w:pPr>
+            <w:r>
+              <w:rPr>
+                <w:b w:val="0"/>
+                <w:color w:val="3A3A3A"/>
+                <w:sz w:val="19"/>
+              </w:rPr>
+              <w:t>Geanonimiseerde data mag — controleer of re-identificatie mogelijk is</w:t>
+            </w:r>
+          </w:p>
+        </w:tc>
+      </w:tr>
+      <w:tr>
+        <w:tc>
+          <w:tcPr>
+            <w:tcW w:type="dxa" w:w="3213"/>
+            <w:shd w:val="clear" w:color="auto" w:fill="FFFFFF"/>
+            <w:tcBorders>
+              <w:top w:val="nil"/>
+              <w:left w:val="nil"/>
+              <w:bottom w:val="nil"/>
+              <w:right w:val="nil"/>
+              <w:insideH w:val="nil"/>
+              <w:insideV w:val="nil"/>
+            </w:tcBorders>
+          </w:tcPr>
+          <w:p>
+            <w:pPr>
+              <w:spacing w:before="60" w:after="60"/>
+              <w:ind w:left="113"/>
+            </w:pPr>
+            <w:r>
+              <w:rPr>
+                <w:b w:val="0"/>
+                <w:color w:val="3A3A3A"/>
+                <w:sz w:val="19"/>
+              </w:rPr>
+              <w:t>Directe patiëntgegevens (naam, BSN, diagnose)</w:t>
+            </w:r>
+          </w:p>
+        </w:tc>
+        <w:tc>
+          <w:tcPr>
+            <w:tcW w:type="dxa" w:w="3213"/>
+            <w:shd w:val="clear" w:color="auto" w:fill="FFFFFF"/>
+            <w:tcBorders>
+              <w:top w:val="nil"/>
+              <w:left w:val="nil"/>
+              <w:bottom w:val="nil"/>
+              <w:right w:val="nil"/>
+              <w:insideH w:val="nil"/>
+              <w:insideV w:val="nil"/>
+            </w:tcBorders>
+          </w:tcPr>
+          <w:p>
+            <w:pPr>
+              <w:spacing w:before="60" w:after="60"/>
+              <w:ind w:left="113"/>
+            </w:pPr>
+            <w:r>
+              <w:rPr>
+                <w:b w:val="0"/>
+                <w:color w:val="3A3A3A"/>
+                <w:sz w:val="19"/>
+              </w:rPr>
+              <w:t>Hoog – STRIKT VERBODEN</w:t>
+            </w:r>
+          </w:p>
+        </w:tc>
+        <w:tc>
+          <w:tcPr>
+            <w:tcW w:type="dxa" w:w="3213"/>
+            <w:shd w:val="clear" w:color="auto" w:fill="FFFFFF"/>
+            <w:tcBorders>
+              <w:top w:val="nil"/>
+              <w:left w:val="nil"/>
+              <w:bottom w:val="nil"/>
+              <w:right w:val="nil"/>
+              <w:insideH w:val="nil"/>
+              <w:insideV w:val="nil"/>
+            </w:tcBorders>
+          </w:tcPr>
+          <w:p>
+            <w:pPr>
+              <w:spacing w:before="60" w:after="60"/>
+              <w:ind w:left="113"/>
+            </w:pPr>
+            <w:r>
+              <w:rPr>
+                <w:b w:val="0"/>
+                <w:color w:val="3A3A3A"/>
+                <w:sz w:val="19"/>
+              </w:rPr>
+              <w:t>Mag NOOIT via externe AI-API worden verwerkt — gebruik uitsluitend geaggregeerde/geanonimiseerde data</w:t>
+            </w:r>
+          </w:p>
+        </w:tc>
+      </w:tr>
+    </w:tbl>
+    <w:p>
+      <w:pPr>
+        <w:spacing w:after="80"/>
+      </w:pPr>
+    </w:p>
+    <w:tbl>
+      <w:tblPr>
+        <w:tblW w:type="auto" w:w="0"/>
+        <w:jc w:val="left"/>
+        <w:tblLook w:firstColumn="1" w:firstRow="1" w:lastColumn="0" w:lastRow="0" w:noHBand="0" w:noVBand="1" w:val="04A0"/>
+      </w:tblPr>
+      <w:tblGrid>
+        <w:gridCol w:w="9638"/>
+      </w:tblGrid>
+      <w:tr>
+        <w:tc>
+          <w:tcPr>
+            <w:tcW w:type="dxa" w:w="9638"/>
+            <w:shd w:val="clear" w:color="auto" w:fill="C0392B"/>
+            <w:tcBorders>
+              <w:top w:val="nil"/>
+              <w:left w:val="nil"/>
+              <w:bottom w:val="nil"/>
+              <w:right w:val="nil"/>
+              <w:insideH w:val="nil"/>
+              <w:insideV w:val="nil"/>
+            </w:tcBorders>
+          </w:tcPr>
+          <w:p>
+            <w:pPr>
+              <w:spacing w:before="100" w:after="100"/>
+              <w:ind w:left="227"/>
+            </w:pPr>
+            <w:r>
+              <w:rPr>
+                <w:b/>
+                <w:color w:val="FFFFFF"/>
+                <w:sz w:val="22"/>
+              </w:rPr>
+              <w:t>⚠  Kritische check: via welke AI-verbinding werkt jouw tool?</w:t>
+            </w:r>
+          </w:p>
+        </w:tc>
+      </w:tr>
+      <w:tr>
+        <w:tc>
+          <w:tcPr>
+            <w:tcW w:type="dxa" w:w="9638"/>
+            <w:shd w:val="clear" w:color="auto" w:fill="F8D7DA"/>
+            <w:tcBorders>
+              <w:top w:val="nil"/>
+              <w:left w:val="nil"/>
+              <w:bottom w:val="nil"/>
+              <w:right w:val="nil"/>
+              <w:insideH w:val="nil"/>
+              <w:insideV w:val="nil"/>
+            </w:tcBorders>
+          </w:tcPr>
+          <w:p/>
+          <w:p>
+            <w:pPr>
+              <w:spacing w:before="20" w:after="40"/>
+              <w:ind w:left="283" w:hanging="227"/>
+            </w:pPr>
+            <w:r>
+              <w:rPr>
+                <w:b/>
+                <w:color w:val="C0392B"/>
+                <w:sz w:val="20"/>
+              </w:rPr>
+              <w:t xml:space="preserve">▸  </w:t>
+            </w:r>
+            <w:r>
+              <w:rPr>
+                <w:color w:val="3A3A3A"/>
+                <w:sz w:val="20"/>
+              </w:rPr>
+              <w:t>Als je Claude API gebruikt via Anthropic direct: controleer of Anthropic een verwerkersovereenkomst (DPA) aanbiedt voor personeelsdata — dit is nodig als je namen/beschikbaarheid meestuurt.</w:t>
+            </w:r>
+          </w:p>
+          <w:p>
+            <w:pPr>
+              <w:spacing w:before="20" w:after="40"/>
+              <w:ind w:left="283" w:hanging="227"/>
+            </w:pPr>
+            <w:r>
+              <w:rPr>
+                <w:b/>
+                <w:color w:val="C0392B"/>
+                <w:sz w:val="20"/>
+              </w:rPr>
+              <w:t xml:space="preserve">▸  </w:t>
+            </w:r>
+            <w:r>
+              <w:rPr>
+                <w:color w:val="3A3A3A"/>
+                <w:sz w:val="20"/>
+              </w:rPr>
+              <w:t>Als je Claude via Microsoft Azure gebruikt (Azure AI): je hebt automatisch een EU-DPA en de data blijft in de EU — dit is de veiligste en meest compliance-vriendelijke optie.</w:t>
+            </w:r>
+          </w:p>
+          <w:p>
+            <w:pPr>
+              <w:spacing w:before="20" w:after="40"/>
+              <w:ind w:left="283" w:hanging="227"/>
+            </w:pPr>
+            <w:r>
+              <w:rPr>
+                <w:b/>
+                <w:color w:val="C0392B"/>
+                <w:sz w:val="20"/>
+              </w:rPr>
+              <w:t xml:space="preserve">▸  </w:t>
+            </w:r>
+            <w:r>
+              <w:rPr>
+                <w:color w:val="3A3A3A"/>
+                <w:sz w:val="20"/>
+              </w:rPr>
+              <w:t>Als je uitsluitend met anonieme of geaggregeerde data werkt (geen namen, geen patiëntgegevens): is het risico laag en zijn de vereisten beperkt.</w:t>
+            </w:r>
+          </w:p>
+          <w:p>
+            <w:pPr>
+              <w:spacing w:before="20" w:after="40"/>
+              <w:ind w:left="283" w:hanging="227"/>
+            </w:pPr>
+            <w:r>
+              <w:rPr>
+                <w:b/>
+                <w:color w:val="C0392B"/>
+                <w:sz w:val="20"/>
+              </w:rPr>
+              <w:t xml:space="preserve">▸  </w:t>
+            </w:r>
+            <w:r>
+              <w:rPr>
+                <w:color w:val="3A3A3A"/>
+                <w:sz w:val="20"/>
+              </w:rPr>
+              <w:t>Bespreek de privacy-aanpak met de Functionaris Gegevensbescherming (FG) van jullie ziekenhuis vóór je de aanvraag indient — zij moeten dit aftekenen.</w:t>
+            </w:r>
+          </w:p>
+          <w:p>
+            <w:pPr>
+              <w:spacing w:before="20" w:after="40"/>
+              <w:ind w:left="283" w:hanging="227"/>
+            </w:pPr>
+            <w:r>
+              <w:rPr>
+                <w:b/>
+                <w:color w:val="C0392B"/>
+                <w:sz w:val="20"/>
+              </w:rPr>
+              <w:t xml:space="preserve">▸  </w:t>
+            </w:r>
+            <w:r>
+              <w:rPr>
+                <w:color w:val="3A3A3A"/>
+                <w:sz w:val="20"/>
+              </w:rPr>
+              <w:t>Voer een DPIA (Data Protection Impact Assessment) uit zodra de tool live gaat — dit is verplicht bij AI-systemen die persoonsgegevens verwerken.</w:t>
+            </w:r>
+          </w:p>
+          <w:p>
+            <w:pPr>
+              <w:spacing w:after="80"/>
+            </w:pPr>
+          </w:p>
+        </w:tc>
+      </w:tr>
+    </w:tbl>
+    <w:p>
+      <w:pPr>
+        <w:spacing w:after="80"/>
+      </w:pPr>
+    </w:p>
+    <w:p>
+      <w:pPr>
+        <w:spacing w:before="160" w:after="60"/>
       </w:pPr>
       <w:r>
         <w:rPr>
@@ -16014,7 +16928,7 @@
           <w:color w:val="004787"/>
           <w:sz w:val="24"/>
         </w:rPr>
-        <w:t>Stappenplan: Zelf gebouwde AI-tool laten kwalificeren voor doorbraakmiddelen</w:t>
+        <w:t>Wat moet je nú doen — concreet actieplan</w:t>
       </w:r>
     </w:p>
     <w:tbl>
@@ -16097,7 +17011,7 @@
                 <w:color w:val="004787"/>
                 <w:sz w:val="21"/>
               </w:rPr>
-              <w:t>Koppel uw tool expliciet aan één van de 5 modelplannen</w:t>
+              <w:t>Start vandaag de nulmeting</w:t>
             </w:r>
           </w:p>
           <w:p>
@@ -16121,7 +17035,7 @@
                 <w:color w:val="3A3A3A"/>
                 <w:sz w:val="18"/>
               </w:rPr>
-              <w:t>Analyseer welk modelplan het beste aansluit (voor capaciteitsplanning: MP01)</w:t>
+              <w:t>Maak een simpel registratieformulier voor de tactische plan adviseur(s)</w:t>
             </w:r>
           </w:p>
           <w:p>
@@ -16145,7 +17059,7 @@
                 <w:color w:val="3A3A3A"/>
                 <w:sz w:val="18"/>
               </w:rPr>
-              <w:t>Beschrijf in uw aanvraag expliciet hoe uw tool voldoet aan de criteria van dat modelplan</w:t>
+              <w:t>Meet hoeveel uur per rooster, per poli, inclusief het aantal revisies</w:t>
             </w:r>
           </w:p>
           <w:p>
@@ -16169,7 +17083,7 @@
                 <w:color w:val="3A3A3A"/>
                 <w:sz w:val="18"/>
               </w:rPr>
-              <w:t>Als uw tool meerdere modelplannen raakt: kies het meest passende plan als primair anker</w:t>
+              <w:t>Houd minimaal 4 weken bij — dit wordt jouw officiële baseline</w:t>
             </w:r>
           </w:p>
           <w:p>
@@ -16265,7 +17179,7 @@
                 <w:color w:val="177FBA"/>
                 <w:sz w:val="21"/>
               </w:rPr>
-              <w:t>Voer een nulmeting uit vóórdat u de tool breed uitrolt</w:t>
+              <w:t>Kies 1-2 pilot-poliklinieken voor september</w:t>
             </w:r>
           </w:p>
           <w:p>
@@ -16289,7 +17203,7 @@
                 <w:color w:val="3A3A3A"/>
                 <w:sz w:val="18"/>
               </w:rPr>
-              <w:t>Meet hoeveel uur per week uw medewerkers nu besteden aan de taak die de tool gaat overnemen</w:t>
+              <w:t>Kies poli's met een bereidwillige tactische plan adviseur die wil meewerken</w:t>
             </w:r>
           </w:p>
           <w:p>
@@ -16313,7 +17227,7 @@
                 <w:color w:val="3A3A3A"/>
                 <w:sz w:val="18"/>
               </w:rPr>
-              <w:t>Sla deze meting op met datum, methode en steekproefgrootte — dit is uw baseline</w:t>
+              <w:t>Bij voorkeur poli's met een regelmatige roostering (wekelijks of tweewekelijks)</w:t>
             </w:r>
           </w:p>
           <w:p>
@@ -16337,7 +17251,7 @@
                 <w:color w:val="3A3A3A"/>
                 <w:sz w:val="18"/>
               </w:rPr>
-              <w:t>Herhaal de meting na 6 en 12 maanden voor de mijlpaalbewijs</w:t>
+              <w:t>Vermijd poli's met extreem complexe planning als eerste pilot</w:t>
             </w:r>
           </w:p>
           <w:p>
@@ -16433,7 +17347,7 @@
                 <w:color w:val="1E7E34"/>
                 <w:sz w:val="21"/>
               </w:rPr>
-              <w:t>Regel privacy en beveiliging (DPIA + verwerkersovereenkomst)</w:t>
+              <w:t>Bespreek het intern met management (ICM/directie)</w:t>
             </w:r>
           </w:p>
           <w:p>
@@ -16457,7 +17371,7 @@
                 <w:color w:val="3A3A3A"/>
                 <w:sz w:val="18"/>
               </w:rPr>
-              <w:t>Als uw tool patiëntdata verwerkt: voer een DPIA uit (verplicht bij AI en bijzondere persoonsgegevens)</w:t>
+              <w:t>Leg de doorbraakmiddelen kans voor aan je leidinggevende of ICM-hoofd</w:t>
             </w:r>
           </w:p>
           <w:p>
@@ -16481,7 +17395,7 @@
                 <w:color w:val="3A3A3A"/>
                 <w:sz w:val="18"/>
               </w:rPr>
-              <w:t>Sluit een verwerkersovereenkomst met alle externe partijen (bijv. AI API-aanbieder zoals Anthropic/Azure/AWS)</w:t>
+              <w:t>Het ziekenhuis moet de aanvraag ondertekenen — management moet dit kennen</w:t>
             </w:r>
           </w:p>
           <w:p>
@@ -16505,31 +17419,7 @@
                 <w:color w:val="3A3A3A"/>
                 <w:sz w:val="18"/>
               </w:rPr>
-              <w:t>Zorg dat patiëntdata op Europese servers blijft — controleer de servicevoorwaarden van uw AI-provider</w:t>
-            </w:r>
-          </w:p>
-          <w:p>
-            <w:pPr>
-              <w:spacing w:before="0" w:after="20"/>
-              <w:ind w:left="283" w:hanging="227"/>
-            </w:pPr>
-            <w:r>
-              <w:rPr>
-                <w:b/>
-                <w:i w:val="0"/>
-                <w:color w:val="1E7E34"/>
-                <w:sz w:val="18"/>
-              </w:rPr>
-              <w:t xml:space="preserve">▸  </w:t>
-            </w:r>
-            <w:r>
-              <w:rPr>
-                <w:b w:val="0"/>
-                <w:i w:val="0"/>
-                <w:color w:val="3A3A3A"/>
-                <w:sz w:val="18"/>
-              </w:rPr>
-              <w:t>Controleer of uw tool voldoet aan NEN 7510 (informatiebeveiliging in de zorg)</w:t>
+              <w:t>Vraag of er al een contactpersoon is bij de dominante zorgverzekeraar</w:t>
             </w:r>
           </w:p>
           <w:p>
@@ -16625,7 +17515,7 @@
                 <w:color w:val="D45600"/>
                 <w:sz w:val="21"/>
               </w:rPr>
-              <w:t>Overweeg Digizo.nu-toetsing of externe validatie</w:t>
+              <w:t>Regel de privacy-basis nu al</w:t>
             </w:r>
           </w:p>
           <w:p>
@@ -16649,7 +17539,7 @@
                 <w:color w:val="3A3A3A"/>
                 <w:sz w:val="18"/>
               </w:rPr>
-              <w:t>Een Digizo.nu-goedkeuring is het sterkste bewijs van effectiviteit — vraag een intake aan</w:t>
+              <w:t>Bespreek de tool met de Functionaris Gegevensbescherming (FG) van het ziekenhuis</w:t>
             </w:r>
           </w:p>
           <w:p>
@@ -16673,7 +17563,7 @@
                 <w:color w:val="3A3A3A"/>
                 <w:sz w:val="18"/>
               </w:rPr>
-              <w:t>Alternatieven: laat de effectiviteit bevestigen door een onafhankelijke externe partij (ZonMw, Nivel, universiteit)</w:t>
+              <w:t>Inventariseer welke data precies door de AI-API wordt verwerkt</w:t>
             </w:r>
           </w:p>
           <w:p>
@@ -16697,31 +17587,7 @@
                 <w:color w:val="3A3A3A"/>
                 <w:sz w:val="18"/>
               </w:rPr>
-              <w:t>Als de tool al bij meerdere poli's/afdelingen in gebruik is: documenteer dit als multi-site bewijs</w:t>
-            </w:r>
-          </w:p>
-          <w:p>
-            <w:pPr>
-              <w:spacing w:before="0" w:after="20"/>
-              <w:ind w:left="283" w:hanging="227"/>
-            </w:pPr>
-            <w:r>
-              <w:rPr>
-                <w:b/>
-                <w:i w:val="0"/>
-                <w:color w:val="D45600"/>
-                <w:sz w:val="18"/>
-              </w:rPr>
-              <w:t xml:space="preserve">▸  </w:t>
-            </w:r>
-            <w:r>
-              <w:rPr>
-                <w:b w:val="0"/>
-                <w:i w:val="0"/>
-                <w:color w:val="3A3A3A"/>
-                <w:sz w:val="18"/>
-              </w:rPr>
-              <w:t>Vraag uw brancheorganisatie (NVZ, FMS) of zij de tool kunnen valideren of erkennen</w:t>
+              <w:t>Controleer of de AI-aanbieder een verwerkersovereenkomst aanbiedt</w:t>
             </w:r>
           </w:p>
           <w:p>
@@ -16817,7 +17683,7 @@
                 <w:color w:val="5A2D91"/>
                 <w:sz w:val="21"/>
               </w:rPr>
-              <w:t>Bespreek uw specifieke situatie met uw zorgverzekeraar</w:t>
+              <w:t>Oriëntatiegesprek zorgverzekeraar plannen (november)</w:t>
             </w:r>
           </w:p>
           <w:p>
@@ -16841,7 +17707,7 @@
                 <w:color w:val="3A3A3A"/>
                 <w:sz w:val="18"/>
               </w:rPr>
-              <w:t>Maak vóór 1 december 2026 een oriëntatiegesprek — leg uw specifieke tool en situatie voor</w:t>
+              <w:t>Identificeer de dominante zorgverzekeraar van jullie ziekenhuis</w:t>
             </w:r>
           </w:p>
           <w:p>
@@ -16865,7 +17731,7 @@
                 <w:color w:val="3A3A3A"/>
                 <w:sz w:val="18"/>
               </w:rPr>
-              <w:t>Vraag expliciet of een intern gebouwde tool in aanmerking komt en welke aanvullende documenten vereist zijn</w:t>
+              <w:t>Plan een oriëntatiegesprek voor november 2026 — geef aan dat het om MP01 gaat</w:t>
             </w:r>
           </w:p>
           <w:p>
@@ -16889,31 +17755,7 @@
                 <w:color w:val="3A3A3A"/>
                 <w:sz w:val="18"/>
               </w:rPr>
-              <w:t>Vraag naar het aanvraagformat en de standaardbedragen voor MP01 in uw regio</w:t>
-            </w:r>
-          </w:p>
-          <w:p>
-            <w:pPr>
-              <w:spacing w:before="0" w:after="20"/>
-              <w:ind w:left="283" w:hanging="227"/>
-            </w:pPr>
-            <w:r>
-              <w:rPr>
-                <w:b/>
-                <w:i w:val="0"/>
-                <w:color w:val="5A2D91"/>
-                <w:sz w:val="18"/>
-              </w:rPr>
-              <w:t xml:space="preserve">▸  </w:t>
-            </w:r>
-            <w:r>
-              <w:rPr>
-                <w:b w:val="0"/>
-                <w:i w:val="0"/>
-                <w:color w:val="3A3A3A"/>
-                <w:sz w:val="18"/>
-              </w:rPr>
-              <w:t>Leg alle afspraken schriftelijk vast — mondeling toezeggingen zijn onvoldoende</w:t>
+              <w:t>Vraag om het aanvraagformat en de standaardbedragen voor capaciteitsplanning</w:t>
             </w:r>
           </w:p>
           <w:p>
@@ -16942,7 +17784,7 @@
         <w:tc>
           <w:tcPr>
             <w:tcW w:type="dxa" w:w="9638"/>
-            <w:shd w:val="clear" w:color="auto" w:fill="856404"/>
+            <w:shd w:val="clear" w:color="auto" w:fill="1E7E34"/>
             <w:tcBorders>
               <w:top w:val="nil"/>
               <w:left w:val="nil"/>
@@ -16963,7 +17805,7 @@
                 <w:color w:val="FFFFFF"/>
                 <w:sz w:val="22"/>
               </w:rPr>
-              <w:t>⚠  Belangrijk: Additionaliteit — de tool mag nog niet volledig betaald zijn</w:t>
+              <w:t>✓  Samenvatting: jouw kracht en jouw actie</w:t>
             </w:r>
           </w:p>
         </w:tc>
@@ -16972,7 +17814,7 @@
         <w:tc>
           <w:tcPr>
             <w:tcW w:type="dxa" w:w="9638"/>
-            <w:shd w:val="clear" w:color="auto" w:fill="FFF3CD"/>
+            <w:shd w:val="clear" w:color="auto" w:fill="D4EDDA"/>
             <w:tcBorders>
               <w:top w:val="nil"/>
               <w:left w:val="nil"/>
@@ -16991,7 +17833,7 @@
             <w:r>
               <w:rPr>
                 <w:b/>
-                <w:color w:val="856404"/>
+                <w:color w:val="1E7E34"/>
                 <w:sz w:val="20"/>
               </w:rPr>
               <w:t xml:space="preserve">▸  </w:t>
@@ -17001,7 +17843,7 @@
                 <w:color w:val="3A3A3A"/>
                 <w:sz w:val="20"/>
               </w:rPr>
-              <w:t>De doorbraakmiddelen zijn ALLEEN bestemd voor kosten die nog niet zijn gemaakt. Als u de tool al volledig heeft gebouwd en in gebruik heeft, kunt u de ontwikkelkosten NIET meer opvoeren — die zijn al betaald.</w:t>
+              <w:t>Jouw kracht: je bouwt precies de juiste tool (MP01), op precies het juiste moment (vóór de aanvraagperiode), vanuit de juiste functie (ICM heeft de inhoudelijke kennis én de organisatorische positie).</w:t>
             </w:r>
           </w:p>
           <w:p>
@@ -17012,7 +17854,7 @@
             <w:r>
               <w:rPr>
                 <w:b/>
-                <w:color w:val="856404"/>
+                <w:color w:val="1E7E34"/>
                 <w:sz w:val="20"/>
               </w:rPr>
               <w:t xml:space="preserve">▸  </w:t>
@@ -17022,7 +17864,7 @@
                 <w:color w:val="3A3A3A"/>
                 <w:sz w:val="20"/>
               </w:rPr>
-              <w:t>Wat wél mogelijk is: de implementatiekosten (uitrol, training, integratie), doorontwikkelkosten (nieuwe modules, uitbreiding naar andere afdelingen) en licentiekosten voor AI-API's in 2027-2029.</w:t>
+              <w:t>Jouw actie: start de nulmeting nú, draai in sept-okt een pilot met 1-2 poli's, meet de tijdsbesparing en gebruik die resultaten als bewijs van effectiviteit in de december-aanvraag.</w:t>
             </w:r>
           </w:p>
           <w:p>
@@ -17033,7 +17875,7 @@
             <w:r>
               <w:rPr>
                 <w:b/>
-                <w:color w:val="856404"/>
+                <w:color w:val="1E7E34"/>
                 <w:sz w:val="20"/>
               </w:rPr>
               <w:t xml:space="preserve">▸  </w:t>
@@ -17043,7 +17885,7 @@
                 <w:color w:val="3A3A3A"/>
                 <w:sz w:val="20"/>
               </w:rPr>
-              <w:t>Breid de tool bewust uit naar nieuwe afdelingen of functionaliteiten na toekenning — dit creëert additionele kosten die wél in aanmerking komen.</w:t>
+              <w:t>Het ziekenhuis dient de aanvraag in — jij levert de inhoud. Zorg dat management dit kent en ondersteunt.</w:t>
             </w:r>
           </w:p>
           <w:p>
@@ -17054,7 +17896,7 @@
             <w:r>
               <w:rPr>
                 <w:b/>
-                <w:color w:val="856404"/>
+                <w:color w:val="1E7E34"/>
                 <w:sz w:val="20"/>
               </w:rPr>
               <w:t xml:space="preserve">▸  </w:t>
@@ -17064,7 +17906,7 @@
                 <w:color w:val="3A3A3A"/>
                 <w:sz w:val="20"/>
               </w:rPr>
-              <w:t>Tip: Laat de 'fase 2 uitrol' (schaalvergroting naar andere poli's, afdelingen of locaties) als het te financieren onderdeel vallen binnen de implementatieperiode 2027-2029.</w:t>
+              <w:t>De doorbraakmiddelen financieren dan de uitrol naar álle poliklinieken in 2027-2029, inclusief training, koppelingen, API-kosten en rapportage.</w:t>
             </w:r>
           </w:p>
           <w:p>

</xml_diff>